<commit_message>
Django Phase 2: Models & ORM (8 topics, 3-YOE depth)
Migrations, lazy querysets, N+1 with select/prefetch_related, F/Q/aggregation,
relationships, model inheritance, transactions, custom managers

Co-Authored-By: Claude Fable 5 <noreply@anthropic.com>
Claude-Session: https://claude.ai/code/session_01Vm8nqoCZNTvUn3BNmW1Tgz
</commit_message>
<xml_diff>
--- a/Django_Interview_Theory.docx
+++ b/Django_Interview_Theory.docx
@@ -1693,6 +1693,2512 @@
           <w:szCs w:val="18"/>
         </w:rPr>
         <w:t xml:space="preserve">Django templates render display-only HTML with variables, tags and filters, plus inheritance through blocks for shared layouts. Auto-escaping is on by default, which prevents XSS unless someone marks content |safe. In API work I rarely touch them, but admin and transactional emails still run on templates.</w:t>
+      </w:r>
+    </w:p>
+    <w:p>
+      <w:pPr>
+        <w:spacing w:before="200" w:after="60" w:line="230" w:lineRule="auto"/>
+      </w:pPr>
+      <w:r>
+        <w:rPr>
+          <w:b/>
+          <w:color w:val="1F4E79"/>
+          <w:sz w:val="26"/>
+          <w:szCs w:val="26"/>
+        </w:rPr>
+        <w:t xml:space="preserve">Django Phase 2 - Models and ORM</w:t>
+      </w:r>
+    </w:p>
+    <w:p>
+      <w:pPr>
+        <w:spacing w:before="140" w:after="40" w:line="230" w:lineRule="auto"/>
+      </w:pPr>
+      <w:r>
+        <w:rPr>
+          <w:b/>
+          <w:sz w:val="21"/>
+          <w:szCs w:val="21"/>
+        </w:rPr>
+        <w:t xml:space="preserve">D2.1  Models and Migrations</w:t>
+      </w:r>
+    </w:p>
+    <w:p>
+      <w:pPr>
+        <w:spacing w:before="0" w:after="40" w:line="230" w:lineRule="auto"/>
+      </w:pPr>
+      <w:r>
+        <w:rPr>
+          <w:b/>
+          <w:sz w:val="18"/>
+          <w:szCs w:val="18"/>
+        </w:rPr>
+        <w:t xml:space="preserve">What it is:  </w:t>
+      </w:r>
+      <w:r>
+        <w:rPr>
+          <w:sz w:val="18"/>
+          <w:szCs w:val="18"/>
+        </w:rPr>
+        <w:t xml:space="preserve">A model is a Python class mapped to one database table; migrations are versioned files that evolve the schema to match the models.</w:t>
+      </w:r>
+    </w:p>
+    <w:p>
+      <w:pPr>
+        <w:ind w:left="260" w:hanging="200"/>
+        <w:spacing w:before="0" w:after="25" w:line="230" w:lineRule="auto"/>
+      </w:pPr>
+      <w:r>
+        <w:rPr>
+          <w:sz w:val="18"/>
+          <w:szCs w:val="18"/>
+        </w:rPr>
+        <w:t xml:space="preserve">•   </w:t>
+      </w:r>
+      <w:r>
+        <w:rPr>
+          <w:sz w:val="18"/>
+          <w:szCs w:val="18"/>
+        </w:rPr>
+        <w:t xml:space="preserve">Each attribute is a field (CharField, DecimalField, ForeignKey...) mapping to a column; Django adds an auto id primary key unless we define one.</w:t>
+      </w:r>
+    </w:p>
+    <w:p>
+      <w:pPr>
+        <w:ind w:left="260" w:hanging="200"/>
+        <w:spacing w:before="0" w:after="25" w:line="230" w:lineRule="auto"/>
+      </w:pPr>
+      <w:r>
+        <w:rPr>
+          <w:sz w:val="18"/>
+          <w:szCs w:val="18"/>
+        </w:rPr>
+        <w:t xml:space="preserve">•   </w:t>
+      </w:r>
+      <w:r>
+        <w:rPr>
+          <w:sz w:val="18"/>
+          <w:szCs w:val="18"/>
+        </w:rPr>
+        <w:t xml:space="preserve">Flow: edit models -&gt; makemigrations (writes a migration file from the diff) -&gt; migrate (applies pending ones, recorded in the django_migrations table).</w:t>
+      </w:r>
+    </w:p>
+    <w:p>
+      <w:pPr>
+        <w:ind w:left="260" w:hanging="200"/>
+        <w:spacing w:before="0" w:after="25" w:line="230" w:lineRule="auto"/>
+      </w:pPr>
+      <w:r>
+        <w:rPr>
+          <w:sz w:val="18"/>
+          <w:szCs w:val="18"/>
+        </w:rPr>
+        <w:t xml:space="preserve">•   </w:t>
+      </w:r>
+      <w:r>
+        <w:rPr>
+          <w:sz w:val="18"/>
+          <w:szCs w:val="18"/>
+        </w:rPr>
+        <w:t xml:space="preserve">Migrations are code: committed to git, reviewed, run identically on every environment - that is the whole point.</w:t>
+      </w:r>
+    </w:p>
+    <w:p>
+      <w:pPr>
+        <w:ind w:left="260" w:hanging="200"/>
+        <w:spacing w:before="0" w:after="25" w:line="230" w:lineRule="auto"/>
+      </w:pPr>
+      <w:r>
+        <w:rPr>
+          <w:sz w:val="18"/>
+          <w:szCs w:val="18"/>
+        </w:rPr>
+        <w:t xml:space="preserve">•   </w:t>
+      </w:r>
+      <w:r>
+        <w:rPr>
+          <w:sz w:val="18"/>
+          <w:szCs w:val="18"/>
+        </w:rPr>
+        <w:t xml:space="preserve">sqlmigrate shows the SQL a migration will run; --fake marks one applied without running (for syncing weird states).</w:t>
+      </w:r>
+    </w:p>
+    <w:p>
+      <w:pPr>
+        <w:ind w:left="260" w:hanging="200"/>
+        <w:spacing w:before="0" w:after="25" w:line="230" w:lineRule="auto"/>
+      </w:pPr>
+      <w:r>
+        <w:rPr>
+          <w:sz w:val="18"/>
+          <w:szCs w:val="18"/>
+        </w:rPr>
+        <w:t xml:space="preserve">•   </w:t>
+      </w:r>
+      <w:r>
+        <w:rPr>
+          <w:sz w:val="18"/>
+          <w:szCs w:val="18"/>
+        </w:rPr>
+        <w:t xml:space="preserve">Data migrations (RunPython) transform existing rows during schema changes - e.g. filling a new column.</w:t>
+      </w:r>
+    </w:p>
+    <w:p>
+      <w:pPr>
+        <w:ind w:left="260" w:hanging="200"/>
+        <w:spacing w:before="0" w:after="25" w:line="230" w:lineRule="auto"/>
+      </w:pPr>
+      <w:r>
+        <w:rPr>
+          <w:sz w:val="18"/>
+          <w:szCs w:val="18"/>
+        </w:rPr>
+        <w:t xml:space="preserve">•   </w:t>
+      </w:r>
+      <w:r>
+        <w:rPr>
+          <w:sz w:val="18"/>
+          <w:szCs w:val="18"/>
+        </w:rPr>
+        <w:t xml:space="preserve">Production care: adding NOT NULL without default needs a two-step migration; huge-table ALTERs can lock - plan them.</w:t>
+      </w:r>
+    </w:p>
+    <w:p>
+      <w:pPr>
+        <w:ind w:left="260" w:hanging="200"/>
+        <w:spacing w:before="0" w:after="25" w:line="230" w:lineRule="auto"/>
+      </w:pPr>
+      <w:r>
+        <w:rPr>
+          <w:sz w:val="18"/>
+          <w:szCs w:val="18"/>
+        </w:rPr>
+        <w:t xml:space="preserve">•   </w:t>
+      </w:r>
+      <w:r>
+        <w:rPr>
+          <w:sz w:val="18"/>
+          <w:szCs w:val="18"/>
+        </w:rPr>
+        <w:t xml:space="preserve">Meta options worth knowing: db_table, ordering, indexes, constraints, unique_together.</w:t>
+      </w:r>
+    </w:p>
+    <w:p>
+      <w:pPr>
+        <w:ind w:left="260" w:hanging="0"/>
+        <w:spacing w:before="0" w:after="15" w:line="230" w:lineRule="auto"/>
+        <w:shd w:val="clear" w:color="auto" w:fill="F2F2F2"/>
+      </w:pPr>
+      <w:r>
+        <w:rPr>
+          <w:b/>
+          <w:sz w:val="17"/>
+          <w:szCs w:val="17"/>
+        </w:rPr>
+        <w:t xml:space="preserve">Example:  </w:t>
+      </w:r>
+      <w:r>
+        <w:rPr>
+          <w:rFonts w:ascii="Consolas" w:hAnsi="Consolas" w:cs="Consolas"/>
+          <w:color w:val="3B3B3B"/>
+          <w:sz w:val="17"/>
+          <w:szCs w:val="17"/>
+        </w:rPr>
+        <w:t xml:space="preserve">class Order(models.Model):</w:t>
+      </w:r>
+    </w:p>
+    <w:p>
+      <w:pPr>
+        <w:ind w:left="260" w:hanging="0"/>
+        <w:spacing w:before="0" w:after="15" w:line="230" w:lineRule="auto"/>
+        <w:shd w:val="clear" w:color="auto" w:fill="F2F2F2"/>
+      </w:pPr>
+      <w:r>
+        <w:rPr>
+          <w:rFonts w:ascii="Consolas" w:hAnsi="Consolas" w:cs="Consolas"/>
+          <w:color w:val="3B3B3B"/>
+          <w:sz w:val="17"/>
+          <w:szCs w:val="17"/>
+        </w:rPr>
+        <w:t xml:space="preserve">    customer = models.ForeignKey("Customer",</w:t>
+      </w:r>
+    </w:p>
+    <w:p>
+      <w:pPr>
+        <w:ind w:left="260" w:hanging="0"/>
+        <w:spacing w:before="0" w:after="15" w:line="230" w:lineRule="auto"/>
+        <w:shd w:val="clear" w:color="auto" w:fill="F2F2F2"/>
+      </w:pPr>
+      <w:r>
+        <w:rPr>
+          <w:rFonts w:ascii="Consolas" w:hAnsi="Consolas" w:cs="Consolas"/>
+          <w:color w:val="3B3B3B"/>
+          <w:sz w:val="17"/>
+          <w:szCs w:val="17"/>
+        </w:rPr>
+        <w:t xml:space="preserve">        on_delete=models.CASCADE)</w:t>
+      </w:r>
+    </w:p>
+    <w:p>
+      <w:pPr>
+        <w:ind w:left="260" w:hanging="0"/>
+        <w:spacing w:before="0" w:after="15" w:line="230" w:lineRule="auto"/>
+        <w:shd w:val="clear" w:color="auto" w:fill="F2F2F2"/>
+      </w:pPr>
+      <w:r>
+        <w:rPr>
+          <w:rFonts w:ascii="Consolas" w:hAnsi="Consolas" w:cs="Consolas"/>
+          <w:color w:val="3B3B3B"/>
+          <w:sz w:val="17"/>
+          <w:szCs w:val="17"/>
+        </w:rPr>
+        <w:t xml:space="preserve">    amount = models.DecimalField(max_digits=10,</w:t>
+      </w:r>
+    </w:p>
+    <w:p>
+      <w:pPr>
+        <w:ind w:left="260" w:hanging="0"/>
+        <w:spacing w:before="0" w:after="15" w:line="230" w:lineRule="auto"/>
+        <w:shd w:val="clear" w:color="auto" w:fill="F2F2F2"/>
+      </w:pPr>
+      <w:r>
+        <w:rPr>
+          <w:rFonts w:ascii="Consolas" w:hAnsi="Consolas" w:cs="Consolas"/>
+          <w:color w:val="3B3B3B"/>
+          <w:sz w:val="17"/>
+          <w:szCs w:val="17"/>
+        </w:rPr>
+        <w:t xml:space="preserve">        decimal_places=2)</w:t>
+      </w:r>
+    </w:p>
+    <w:p>
+      <w:pPr>
+        <w:ind w:left="260" w:hanging="0"/>
+        <w:spacing w:before="0" w:after="15" w:line="230" w:lineRule="auto"/>
+        <w:shd w:val="clear" w:color="auto" w:fill="F2F2F2"/>
+      </w:pPr>
+      <w:r>
+        <w:rPr>
+          <w:rFonts w:ascii="Consolas" w:hAnsi="Consolas" w:cs="Consolas"/>
+          <w:color w:val="3B3B3B"/>
+          <w:sz w:val="17"/>
+          <w:szCs w:val="17"/>
+        </w:rPr>
+        <w:t xml:space="preserve">    class Meta:</w:t>
+      </w:r>
+    </w:p>
+    <w:p>
+      <w:pPr>
+        <w:ind w:left="260" w:hanging="0"/>
+        <w:spacing w:before="0" w:after="15" w:line="230" w:lineRule="auto"/>
+        <w:shd w:val="clear" w:color="auto" w:fill="F2F2F2"/>
+      </w:pPr>
+      <w:r>
+        <w:rPr>
+          <w:rFonts w:ascii="Consolas" w:hAnsi="Consolas" w:cs="Consolas"/>
+          <w:color w:val="3B3B3B"/>
+          <w:sz w:val="17"/>
+          <w:szCs w:val="17"/>
+        </w:rPr>
+        <w:t xml:space="preserve">        indexes = [models.Index(fields=["customer"])]</w:t>
+      </w:r>
+    </w:p>
+    <w:p>
+      <w:pPr>
+        <w:ind w:left="260" w:hanging="0"/>
+        <w:spacing w:before="0" w:after="15" w:line="230" w:lineRule="auto"/>
+        <w:shd w:val="clear" w:color="auto" w:fill="F2F2F2"/>
+      </w:pPr>
+      <w:r>
+        <w:rPr>
+          <w:rFonts w:ascii="Consolas" w:hAnsi="Consolas" w:cs="Consolas"/>
+          <w:color w:val="3B3B3B"/>
+          <w:sz w:val="17"/>
+          <w:szCs w:val="17"/>
+        </w:rPr>
+        <w:t xml:space="preserve"># python manage.py makemigrations &amp;&amp; migrate</w:t>
+      </w:r>
+    </w:p>
+    <w:p>
+      <w:pPr>
+        <w:ind w:left="120" w:hanging="0"/>
+        <w:spacing w:before="50" w:after="110" w:line="230" w:lineRule="auto"/>
+        <w:pBdr>
+          <w:left w:val="single" w:sz="12" w:space="4" w:color="2E5E1F"/>
+        </w:pBdr>
+      </w:pPr>
+      <w:r>
+        <w:rPr>
+          <w:b/>
+          <w:color w:val="2E5E1F"/>
+          <w:sz w:val="18"/>
+          <w:szCs w:val="18"/>
+        </w:rPr>
+        <w:t xml:space="preserve">Interview answer:  </w:t>
+      </w:r>
+      <w:r>
+        <w:rPr>
+          <w:i/>
+          <w:sz w:val="18"/>
+          <w:szCs w:val="18"/>
+        </w:rPr>
+        <w:t xml:space="preserve">Models map classes to tables; makemigrations diffs the models into versioned migration files and migrate applies them, tracked in django_migrations. They live in git so every environment evolves identically. At 3 years I also know data migrations with RunPython, sqlmigrate to preview SQL, and that NOT NULL additions and big-table ALTERs need care in production.</w:t>
+      </w:r>
+    </w:p>
+    <w:p>
+      <w:pPr>
+        <w:spacing w:before="140" w:after="40" w:line="230" w:lineRule="auto"/>
+      </w:pPr>
+      <w:r>
+        <w:rPr>
+          <w:b/>
+          <w:sz w:val="21"/>
+          <w:szCs w:val="21"/>
+        </w:rPr>
+        <w:t xml:space="preserve">D2.2  QuerySet - Lazy Evaluation and Caching</w:t>
+      </w:r>
+    </w:p>
+    <w:p>
+      <w:pPr>
+        <w:spacing w:before="0" w:after="40" w:line="230" w:lineRule="auto"/>
+      </w:pPr>
+      <w:r>
+        <w:rPr>
+          <w:b/>
+          <w:sz w:val="18"/>
+          <w:szCs w:val="18"/>
+        </w:rPr>
+        <w:t xml:space="preserve">What it is:  </w:t>
+      </w:r>
+      <w:r>
+        <w:rPr>
+          <w:sz w:val="18"/>
+          <w:szCs w:val="18"/>
+        </w:rPr>
+        <w:t xml:space="preserve">A QuerySet is a lazy description of a query - no SQL runs until the data is actually needed, and results are then cached on that QuerySet.</w:t>
+      </w:r>
+    </w:p>
+    <w:p>
+      <w:pPr>
+        <w:ind w:left="260" w:hanging="200"/>
+        <w:spacing w:before="0" w:after="25" w:line="230" w:lineRule="auto"/>
+      </w:pPr>
+      <w:r>
+        <w:rPr>
+          <w:sz w:val="18"/>
+          <w:szCs w:val="18"/>
+        </w:rPr>
+        <w:t xml:space="preserve">•   </w:t>
+      </w:r>
+      <w:r>
+        <w:rPr>
+          <w:sz w:val="18"/>
+          <w:szCs w:val="18"/>
+        </w:rPr>
+        <w:t xml:space="preserve">qs = Order.objects.filter(status="paid") runs NOTHING. Chaining more filters still runs nothing - each returns a new QuerySet.</w:t>
+      </w:r>
+    </w:p>
+    <w:p>
+      <w:pPr>
+        <w:ind w:left="260" w:hanging="200"/>
+        <w:spacing w:before="0" w:after="25" w:line="230" w:lineRule="auto"/>
+      </w:pPr>
+      <w:r>
+        <w:rPr>
+          <w:sz w:val="18"/>
+          <w:szCs w:val="18"/>
+        </w:rPr>
+        <w:t xml:space="preserve">•   </w:t>
+      </w:r>
+      <w:r>
+        <w:rPr>
+          <w:sz w:val="18"/>
+          <w:szCs w:val="18"/>
+        </w:rPr>
+        <w:t xml:space="preserve">Evaluation triggers: iterating (for), list(), len(), bool()/if, slicing with a step, repr, serialization.</w:t>
+      </w:r>
+    </w:p>
+    <w:p>
+      <w:pPr>
+        <w:ind w:left="260" w:hanging="200"/>
+        <w:spacing w:before="0" w:after="25" w:line="230" w:lineRule="auto"/>
+      </w:pPr>
+      <w:r>
+        <w:rPr>
+          <w:sz w:val="18"/>
+          <w:szCs w:val="18"/>
+        </w:rPr>
+        <w:t xml:space="preserve">•   </w:t>
+      </w:r>
+      <w:r>
+        <w:rPr>
+          <w:sz w:val="18"/>
+          <w:szCs w:val="18"/>
+        </w:rPr>
+        <w:t xml:space="preserve">After first evaluation the results cache inside the QuerySet - looping it twice hits the DB once.</w:t>
+      </w:r>
+    </w:p>
+    <w:p>
+      <w:pPr>
+        <w:ind w:left="260" w:hanging="200"/>
+        <w:spacing w:before="0" w:after="25" w:line="230" w:lineRule="auto"/>
+      </w:pPr>
+      <w:r>
+        <w:rPr>
+          <w:sz w:val="18"/>
+          <w:szCs w:val="18"/>
+        </w:rPr>
+        <w:t xml:space="preserve">•   </w:t>
+      </w:r>
+      <w:r>
+        <w:rPr>
+          <w:sz w:val="18"/>
+          <w:szCs w:val="18"/>
+        </w:rPr>
+        <w:t xml:space="preserve">Trap: two separate expressions (qs.count() then list(qs)... or building qs twice) are separate queries - assign once and reuse.</w:t>
+      </w:r>
+    </w:p>
+    <w:p>
+      <w:pPr>
+        <w:ind w:left="260" w:hanging="200"/>
+        <w:spacing w:before="0" w:after="25" w:line="230" w:lineRule="auto"/>
+      </w:pPr>
+      <w:r>
+        <w:rPr>
+          <w:sz w:val="18"/>
+          <w:szCs w:val="18"/>
+        </w:rPr>
+        <w:t xml:space="preserve">•   </w:t>
+      </w:r>
+      <w:r>
+        <w:rPr>
+          <w:sz w:val="18"/>
+          <w:szCs w:val="18"/>
+        </w:rPr>
+        <w:t xml:space="preserve">exists() and count() are cheaper than len(list(qs)) when we only need a check or a number.</w:t>
+      </w:r>
+    </w:p>
+    <w:p>
+      <w:pPr>
+        <w:ind w:left="260" w:hanging="200"/>
+        <w:spacing w:before="0" w:after="25" w:line="230" w:lineRule="auto"/>
+      </w:pPr>
+      <w:r>
+        <w:rPr>
+          <w:sz w:val="18"/>
+          <w:szCs w:val="18"/>
+        </w:rPr>
+        <w:t xml:space="preserve">•   </w:t>
+      </w:r>
+      <w:r>
+        <w:rPr>
+          <w:sz w:val="18"/>
+          <w:szCs w:val="18"/>
+        </w:rPr>
+        <w:t xml:space="preserve">values()/values_list() fetch dicts/tuples instead of model objects - lighter for reports; only() and defer() control columns.</w:t>
+      </w:r>
+    </w:p>
+    <w:p>
+      <w:pPr>
+        <w:ind w:left="260" w:hanging="200"/>
+        <w:spacing w:before="0" w:after="25" w:line="230" w:lineRule="auto"/>
+      </w:pPr>
+      <w:r>
+        <w:rPr>
+          <w:sz w:val="18"/>
+          <w:szCs w:val="18"/>
+        </w:rPr>
+        <w:t xml:space="preserve">•   </w:t>
+      </w:r>
+      <w:r>
+        <w:rPr>
+          <w:sz w:val="18"/>
+          <w:szCs w:val="18"/>
+        </w:rPr>
+        <w:t xml:space="preserve">iterator() streams rows without caching - for processing millions of rows without eating RAM.</w:t>
+      </w:r>
+    </w:p>
+    <w:p>
+      <w:pPr>
+        <w:ind w:left="260" w:hanging="0"/>
+        <w:spacing w:before="0" w:after="15" w:line="230" w:lineRule="auto"/>
+        <w:shd w:val="clear" w:color="auto" w:fill="F2F2F2"/>
+      </w:pPr>
+      <w:r>
+        <w:rPr>
+          <w:b/>
+          <w:sz w:val="17"/>
+          <w:szCs w:val="17"/>
+        </w:rPr>
+        <w:t xml:space="preserve">Example:  </w:t>
+      </w:r>
+      <w:r>
+        <w:rPr>
+          <w:rFonts w:ascii="Consolas" w:hAnsi="Consolas" w:cs="Consolas"/>
+          <w:color w:val="3B3B3B"/>
+          <w:sz w:val="17"/>
+          <w:szCs w:val="17"/>
+        </w:rPr>
+        <w:t xml:space="preserve">qs = Order.objects.filter(status="paid")  # no SQL yet</w:t>
+      </w:r>
+    </w:p>
+    <w:p>
+      <w:pPr>
+        <w:ind w:left="260" w:hanging="0"/>
+        <w:spacing w:before="0" w:after="15" w:line="230" w:lineRule="auto"/>
+        <w:shd w:val="clear" w:color="auto" w:fill="F2F2F2"/>
+      </w:pPr>
+      <w:r>
+        <w:rPr>
+          <w:rFonts w:ascii="Consolas" w:hAnsi="Consolas" w:cs="Consolas"/>
+          <w:color w:val="3B3B3B"/>
+          <w:sz w:val="17"/>
+          <w:szCs w:val="17"/>
+        </w:rPr>
+        <w:t xml:space="preserve">if qs.exists():          # cheap EXISTS query</w:t>
+      </w:r>
+    </w:p>
+    <w:p>
+      <w:pPr>
+        <w:ind w:left="260" w:hanging="0"/>
+        <w:spacing w:before="0" w:after="15" w:line="230" w:lineRule="auto"/>
+        <w:shd w:val="clear" w:color="auto" w:fill="F2F2F2"/>
+      </w:pPr>
+      <w:r>
+        <w:rPr>
+          <w:rFonts w:ascii="Consolas" w:hAnsi="Consolas" w:cs="Consolas"/>
+          <w:color w:val="3B3B3B"/>
+          <w:sz w:val="17"/>
+          <w:szCs w:val="17"/>
+        </w:rPr>
+        <w:t xml:space="preserve">    total = qs.count()   # COUNT query</w:t>
+      </w:r>
+    </w:p>
+    <w:p>
+      <w:pPr>
+        <w:ind w:left="260" w:hanging="0"/>
+        <w:spacing w:before="0" w:after="15" w:line="230" w:lineRule="auto"/>
+        <w:shd w:val="clear" w:color="auto" w:fill="F2F2F2"/>
+      </w:pPr>
+      <w:r>
+        <w:rPr>
+          <w:rFonts w:ascii="Consolas" w:hAnsi="Consolas" w:cs="Consolas"/>
+          <w:color w:val="3B3B3B"/>
+          <w:sz w:val="17"/>
+          <w:szCs w:val="17"/>
+        </w:rPr>
+        <w:t xml:space="preserve">    for o in qs:         # SELECT + cache</w:t>
+      </w:r>
+    </w:p>
+    <w:p>
+      <w:pPr>
+        <w:ind w:left="260" w:hanging="0"/>
+        <w:spacing w:before="0" w:after="15" w:line="230" w:lineRule="auto"/>
+        <w:shd w:val="clear" w:color="auto" w:fill="F2F2F2"/>
+      </w:pPr>
+      <w:r>
+        <w:rPr>
+          <w:rFonts w:ascii="Consolas" w:hAnsi="Consolas" w:cs="Consolas"/>
+          <w:color w:val="3B3B3B"/>
+          <w:sz w:val="17"/>
+          <w:szCs w:val="17"/>
+        </w:rPr>
+        <w:t xml:space="preserve">        ...</w:t>
+      </w:r>
+    </w:p>
+    <w:p>
+      <w:pPr>
+        <w:ind w:left="260" w:hanging="0"/>
+        <w:spacing w:before="0" w:after="15" w:line="230" w:lineRule="auto"/>
+        <w:shd w:val="clear" w:color="auto" w:fill="F2F2F2"/>
+      </w:pPr>
+      <w:r>
+        <w:rPr>
+          <w:rFonts w:ascii="Consolas" w:hAnsi="Consolas" w:cs="Consolas"/>
+          <w:color w:val="3B3B3B"/>
+          <w:sz w:val="17"/>
+          <w:szCs w:val="17"/>
+        </w:rPr>
+        <w:t xml:space="preserve">    for o in qs:         # cached - no new query</w:t>
+      </w:r>
+    </w:p>
+    <w:p>
+      <w:pPr>
+        <w:ind w:left="120" w:hanging="0"/>
+        <w:spacing w:before="50" w:after="110" w:line="230" w:lineRule="auto"/>
+        <w:pBdr>
+          <w:left w:val="single" w:sz="12" w:space="4" w:color="2E5E1F"/>
+        </w:pBdr>
+      </w:pPr>
+      <w:r>
+        <w:rPr>
+          <w:b/>
+          <w:color w:val="2E5E1F"/>
+          <w:sz w:val="18"/>
+          <w:szCs w:val="18"/>
+        </w:rPr>
+        <w:t xml:space="preserve">Interview answer:  </w:t>
+      </w:r>
+      <w:r>
+        <w:rPr>
+          <w:i/>
+          <w:sz w:val="18"/>
+          <w:szCs w:val="18"/>
+        </w:rPr>
+        <w:t xml:space="preserve">QuerySets are lazy - filters just build the query, and SQL runs only on iteration, list(), len() or bool(), after which results cache on that object. I use exists() and count() for cheap checks, values_list() for light reads, iterator() for huge datasets, and I reuse one evaluated queryset instead of re-evaluating.</w:t>
+      </w:r>
+    </w:p>
+    <w:p>
+      <w:pPr>
+        <w:spacing w:before="140" w:after="40" w:line="230" w:lineRule="auto"/>
+      </w:pPr>
+      <w:r>
+        <w:rPr>
+          <w:b/>
+          <w:sz w:val="21"/>
+          <w:szCs w:val="21"/>
+        </w:rPr>
+        <w:t xml:space="preserve">D2.3  select_related vs prefetch_related - The N+1 Problem</w:t>
+      </w:r>
+    </w:p>
+    <w:p>
+      <w:pPr>
+        <w:spacing w:before="0" w:after="40" w:line="230" w:lineRule="auto"/>
+      </w:pPr>
+      <w:r>
+        <w:rPr>
+          <w:b/>
+          <w:sz w:val="18"/>
+          <w:szCs w:val="18"/>
+        </w:rPr>
+        <w:t xml:space="preserve">What it is:  </w:t>
+      </w:r>
+      <w:r>
+        <w:rPr>
+          <w:sz w:val="18"/>
+          <w:szCs w:val="18"/>
+        </w:rPr>
+        <w:t xml:space="preserve">N+1 means one query for the list plus one more per row for its relation; select_related and prefetch_related collapse that into 1-2 queries.</w:t>
+      </w:r>
+    </w:p>
+    <w:p>
+      <w:pPr>
+        <w:ind w:left="260" w:hanging="200"/>
+        <w:spacing w:before="0" w:after="25" w:line="230" w:lineRule="auto"/>
+      </w:pPr>
+      <w:r>
+        <w:rPr>
+          <w:sz w:val="18"/>
+          <w:szCs w:val="18"/>
+        </w:rPr>
+        <w:t xml:space="preserve">•   </w:t>
+      </w:r>
+      <w:r>
+        <w:rPr>
+          <w:sz w:val="18"/>
+          <w:szCs w:val="18"/>
+        </w:rPr>
+        <w:t xml:space="preserve">The bug: for o in Order.objects.all(): print(o.customer.name) - 1 query for orders + 1 per order for its customer. 200 orders = 201 queries.</w:t>
+      </w:r>
+    </w:p>
+    <w:p>
+      <w:pPr>
+        <w:ind w:left="260" w:hanging="200"/>
+        <w:spacing w:before="0" w:after="25" w:line="230" w:lineRule="auto"/>
+      </w:pPr>
+      <w:r>
+        <w:rPr>
+          <w:sz w:val="18"/>
+          <w:szCs w:val="18"/>
+        </w:rPr>
+        <w:t xml:space="preserve">•   </w:t>
+      </w:r>
+      <w:r>
+        <w:rPr>
+          <w:sz w:val="18"/>
+          <w:szCs w:val="18"/>
+        </w:rPr>
+        <w:t xml:space="preserve">select_related("customer"): SQL JOIN, one query. For single-valued relations - ForeignKey and OneToOne.</w:t>
+      </w:r>
+    </w:p>
+    <w:p>
+      <w:pPr>
+        <w:ind w:left="260" w:hanging="200"/>
+        <w:spacing w:before="0" w:after="25" w:line="230" w:lineRule="auto"/>
+      </w:pPr>
+      <w:r>
+        <w:rPr>
+          <w:sz w:val="18"/>
+          <w:szCs w:val="18"/>
+        </w:rPr>
+        <w:t xml:space="preserve">•   </w:t>
+      </w:r>
+      <w:r>
+        <w:rPr>
+          <w:sz w:val="18"/>
+          <w:szCs w:val="18"/>
+        </w:rPr>
+        <w:t xml:space="preserve">prefetch_related("items"): two queries (parents, then all children WHERE parent_id IN (...)), joined in Python. For multi-valued - ManyToMany and reverse FK.</w:t>
+      </w:r>
+    </w:p>
+    <w:p>
+      <w:pPr>
+        <w:ind w:left="260" w:hanging="200"/>
+        <w:spacing w:before="0" w:after="25" w:line="230" w:lineRule="auto"/>
+      </w:pPr>
+      <w:r>
+        <w:rPr>
+          <w:sz w:val="18"/>
+          <w:szCs w:val="18"/>
+        </w:rPr>
+        <w:t xml:space="preserve">•   </w:t>
+      </w:r>
+      <w:r>
+        <w:rPr>
+          <w:sz w:val="18"/>
+          <w:szCs w:val="18"/>
+        </w:rPr>
+        <w:t xml:space="preserve">Both chain and mix: Order.objects.select_related("customer").prefetch_related("items").</w:t>
+      </w:r>
+    </w:p>
+    <w:p>
+      <w:pPr>
+        <w:ind w:left="260" w:hanging="200"/>
+        <w:spacing w:before="0" w:after="25" w:line="230" w:lineRule="auto"/>
+      </w:pPr>
+      <w:r>
+        <w:rPr>
+          <w:sz w:val="18"/>
+          <w:szCs w:val="18"/>
+        </w:rPr>
+        <w:t xml:space="preserve">•   </w:t>
+      </w:r>
+      <w:r>
+        <w:rPr>
+          <w:sz w:val="18"/>
+          <w:szCs w:val="18"/>
+        </w:rPr>
+        <w:t xml:space="preserve">Prefetch(queryset=...) customizes the prefetch - filter or select_related inside it.</w:t>
+      </w:r>
+    </w:p>
+    <w:p>
+      <w:pPr>
+        <w:ind w:left="260" w:hanging="200"/>
+        <w:spacing w:before="0" w:after="25" w:line="230" w:lineRule="auto"/>
+      </w:pPr>
+      <w:r>
+        <w:rPr>
+          <w:sz w:val="18"/>
+          <w:szCs w:val="18"/>
+        </w:rPr>
+        <w:t xml:space="preserve">•   </w:t>
+      </w:r>
+      <w:r>
+        <w:rPr>
+          <w:sz w:val="18"/>
+          <w:szCs w:val="18"/>
+        </w:rPr>
+        <w:t xml:space="preserve">Follow relations with __: select_related("customer__city").</w:t>
+      </w:r>
+    </w:p>
+    <w:p>
+      <w:pPr>
+        <w:ind w:left="260" w:hanging="200"/>
+        <w:spacing w:before="0" w:after="25" w:line="230" w:lineRule="auto"/>
+      </w:pPr>
+      <w:r>
+        <w:rPr>
+          <w:sz w:val="18"/>
+          <w:szCs w:val="18"/>
+        </w:rPr>
+        <w:t xml:space="preserve">•   </w:t>
+      </w:r>
+      <w:r>
+        <w:rPr>
+          <w:sz w:val="18"/>
+          <w:szCs w:val="18"/>
+        </w:rPr>
+        <w:t xml:space="preserve">This is THE classic Django performance interview question - name the symptom (page slow, query count huge) and the fix.</w:t>
+      </w:r>
+    </w:p>
+    <w:p>
+      <w:pPr>
+        <w:ind w:left="260" w:hanging="0"/>
+        <w:spacing w:before="0" w:after="15" w:line="230" w:lineRule="auto"/>
+        <w:shd w:val="clear" w:color="auto" w:fill="F2F2F2"/>
+      </w:pPr>
+      <w:r>
+        <w:rPr>
+          <w:b/>
+          <w:sz w:val="17"/>
+          <w:szCs w:val="17"/>
+        </w:rPr>
+        <w:t xml:space="preserve">Example:  </w:t>
+      </w:r>
+      <w:r>
+        <w:rPr>
+          <w:rFonts w:ascii="Consolas" w:hAnsi="Consolas" w:cs="Consolas"/>
+          <w:color w:val="3B3B3B"/>
+          <w:sz w:val="17"/>
+          <w:szCs w:val="17"/>
+        </w:rPr>
+        <w:t xml:space="preserve"># 201 queries:</w:t>
+      </w:r>
+    </w:p>
+    <w:p>
+      <w:pPr>
+        <w:ind w:left="260" w:hanging="0"/>
+        <w:spacing w:before="0" w:after="15" w:line="230" w:lineRule="auto"/>
+        <w:shd w:val="clear" w:color="auto" w:fill="F2F2F2"/>
+      </w:pPr>
+      <w:r>
+        <w:rPr>
+          <w:rFonts w:ascii="Consolas" w:hAnsi="Consolas" w:cs="Consolas"/>
+          <w:color w:val="3B3B3B"/>
+          <w:sz w:val="17"/>
+          <w:szCs w:val="17"/>
+        </w:rPr>
+        <w:t xml:space="preserve">for o in Order.objects.all():</w:t>
+      </w:r>
+    </w:p>
+    <w:p>
+      <w:pPr>
+        <w:ind w:left="260" w:hanging="0"/>
+        <w:spacing w:before="0" w:after="15" w:line="230" w:lineRule="auto"/>
+        <w:shd w:val="clear" w:color="auto" w:fill="F2F2F2"/>
+      </w:pPr>
+      <w:r>
+        <w:rPr>
+          <w:rFonts w:ascii="Consolas" w:hAnsi="Consolas" w:cs="Consolas"/>
+          <w:color w:val="3B3B3B"/>
+          <w:sz w:val="17"/>
+          <w:szCs w:val="17"/>
+        </w:rPr>
+        <w:t xml:space="preserve">    print(o.customer.name)</w:t>
+      </w:r>
+    </w:p>
+    <w:p>
+      <w:pPr>
+        <w:ind w:left="260" w:hanging="0"/>
+        <w:spacing w:before="0" w:after="15" w:line="230" w:lineRule="auto"/>
+        <w:shd w:val="clear" w:color="auto" w:fill="F2F2F2"/>
+      </w:pPr>
+      <w:r>
+        <w:rPr>
+          <w:rFonts w:ascii="Consolas" w:hAnsi="Consolas" w:cs="Consolas"/>
+          <w:color w:val="3B3B3B"/>
+          <w:sz w:val="17"/>
+          <w:szCs w:val="17"/>
+        </w:rPr>
+        <w:t xml:space="preserve"># 1 query:</w:t>
+      </w:r>
+    </w:p>
+    <w:p>
+      <w:pPr>
+        <w:ind w:left="260" w:hanging="0"/>
+        <w:spacing w:before="0" w:after="15" w:line="230" w:lineRule="auto"/>
+        <w:shd w:val="clear" w:color="auto" w:fill="F2F2F2"/>
+      </w:pPr>
+      <w:r>
+        <w:rPr>
+          <w:rFonts w:ascii="Consolas" w:hAnsi="Consolas" w:cs="Consolas"/>
+          <w:color w:val="3B3B3B"/>
+          <w:sz w:val="17"/>
+          <w:szCs w:val="17"/>
+        </w:rPr>
+        <w:t xml:space="preserve">for o in Order.objects.select_related("customer"):</w:t>
+      </w:r>
+    </w:p>
+    <w:p>
+      <w:pPr>
+        <w:ind w:left="260" w:hanging="0"/>
+        <w:spacing w:before="0" w:after="15" w:line="230" w:lineRule="auto"/>
+        <w:shd w:val="clear" w:color="auto" w:fill="F2F2F2"/>
+      </w:pPr>
+      <w:r>
+        <w:rPr>
+          <w:rFonts w:ascii="Consolas" w:hAnsi="Consolas" w:cs="Consolas"/>
+          <w:color w:val="3B3B3B"/>
+          <w:sz w:val="17"/>
+          <w:szCs w:val="17"/>
+        </w:rPr>
+        <w:t xml:space="preserve">    print(o.customer.name)</w:t>
+      </w:r>
+    </w:p>
+    <w:p>
+      <w:pPr>
+        <w:ind w:left="260" w:hanging="0"/>
+        <w:spacing w:before="0" w:after="15" w:line="230" w:lineRule="auto"/>
+        <w:shd w:val="clear" w:color="auto" w:fill="F2F2F2"/>
+      </w:pPr>
+      <w:r>
+        <w:rPr>
+          <w:rFonts w:ascii="Consolas" w:hAnsi="Consolas" w:cs="Consolas"/>
+          <w:color w:val="3B3B3B"/>
+          <w:sz w:val="17"/>
+          <w:szCs w:val="17"/>
+        </w:rPr>
+        <w:t xml:space="preserve"># M2M: 2 queries</w:t>
+      </w:r>
+    </w:p>
+    <w:p>
+      <w:pPr>
+        <w:ind w:left="260" w:hanging="0"/>
+        <w:spacing w:before="0" w:after="15" w:line="230" w:lineRule="auto"/>
+        <w:shd w:val="clear" w:color="auto" w:fill="F2F2F2"/>
+      </w:pPr>
+      <w:r>
+        <w:rPr>
+          <w:rFonts w:ascii="Consolas" w:hAnsi="Consolas" w:cs="Consolas"/>
+          <w:color w:val="3B3B3B"/>
+          <w:sz w:val="17"/>
+          <w:szCs w:val="17"/>
+        </w:rPr>
+        <w:t xml:space="preserve">Order.objects.prefetch_related("items")</w:t>
+      </w:r>
+    </w:p>
+    <w:p>
+      <w:pPr>
+        <w:ind w:left="120" w:hanging="0"/>
+        <w:spacing w:before="50" w:after="110" w:line="230" w:lineRule="auto"/>
+        <w:pBdr>
+          <w:left w:val="single" w:sz="12" w:space="4" w:color="2E5E1F"/>
+        </w:pBdr>
+      </w:pPr>
+      <w:r>
+        <w:rPr>
+          <w:b/>
+          <w:color w:val="2E5E1F"/>
+          <w:sz w:val="18"/>
+          <w:szCs w:val="18"/>
+        </w:rPr>
+        <w:t xml:space="preserve">Interview answer:  </w:t>
+      </w:r>
+      <w:r>
+        <w:rPr>
+          <w:i/>
+          <w:sz w:val="18"/>
+          <w:szCs w:val="18"/>
+        </w:rPr>
+        <w:t xml:space="preserve">N+1 is one list query plus a query per row for its relation. select_related fixes single-valued relations (FK, OneToOne) with a JOIN in one query; prefetch_related fixes multi-valued ones (M2M, reverse FK) with a second IN-query stitched in Python. I spot it via query counts in debug toolbar and fix it at the queryset.</w:t>
+      </w:r>
+    </w:p>
+    <w:p>
+      <w:pPr>
+        <w:spacing w:before="140" w:after="40" w:line="230" w:lineRule="auto"/>
+      </w:pPr>
+      <w:r>
+        <w:rPr>
+          <w:b/>
+          <w:sz w:val="21"/>
+          <w:szCs w:val="21"/>
+        </w:rPr>
+        <w:t xml:space="preserve">D2.4  F Objects, Q Objects and Aggregation</w:t>
+      </w:r>
+    </w:p>
+    <w:p>
+      <w:pPr>
+        <w:spacing w:before="0" w:after="40" w:line="230" w:lineRule="auto"/>
+      </w:pPr>
+      <w:r>
+        <w:rPr>
+          <w:b/>
+          <w:sz w:val="18"/>
+          <w:szCs w:val="18"/>
+        </w:rPr>
+        <w:t xml:space="preserve">What it is:  </w:t>
+      </w:r>
+      <w:r>
+        <w:rPr>
+          <w:sz w:val="18"/>
+          <w:szCs w:val="18"/>
+        </w:rPr>
+        <w:t xml:space="preserve">F references a column inside the query, Q builds OR/NOT conditions, and aggregate/annotate compute values in the database.</w:t>
+      </w:r>
+    </w:p>
+    <w:p>
+      <w:pPr>
+        <w:ind w:left="260" w:hanging="200"/>
+        <w:spacing w:before="0" w:after="25" w:line="230" w:lineRule="auto"/>
+      </w:pPr>
+      <w:r>
+        <w:rPr>
+          <w:sz w:val="18"/>
+          <w:szCs w:val="18"/>
+        </w:rPr>
+        <w:t xml:space="preserve">•   </w:t>
+      </w:r>
+      <w:r>
+        <w:rPr>
+          <w:sz w:val="18"/>
+          <w:szCs w:val="18"/>
+        </w:rPr>
+        <w:t xml:space="preserve">F avoids race conditions: Product.objects.filter(id=5).update(stock=F("stock") - 1) - the DB does the maths atomically; read-modify-save in Python loses concurrent updates.</w:t>
+      </w:r>
+    </w:p>
+    <w:p>
+      <w:pPr>
+        <w:ind w:left="260" w:hanging="200"/>
+        <w:spacing w:before="0" w:after="25" w:line="230" w:lineRule="auto"/>
+      </w:pPr>
+      <w:r>
+        <w:rPr>
+          <w:sz w:val="18"/>
+          <w:szCs w:val="18"/>
+        </w:rPr>
+        <w:t xml:space="preserve">•   </w:t>
+      </w:r>
+      <w:r>
+        <w:rPr>
+          <w:sz w:val="18"/>
+          <w:szCs w:val="18"/>
+        </w:rPr>
+        <w:t xml:space="preserve">F also compares columns to each other: filter(sold=F("stock")).</w:t>
+      </w:r>
+    </w:p>
+    <w:p>
+      <w:pPr>
+        <w:ind w:left="260" w:hanging="200"/>
+        <w:spacing w:before="0" w:after="25" w:line="230" w:lineRule="auto"/>
+      </w:pPr>
+      <w:r>
+        <w:rPr>
+          <w:sz w:val="18"/>
+          <w:szCs w:val="18"/>
+        </w:rPr>
+        <w:t xml:space="preserve">•   </w:t>
+      </w:r>
+      <w:r>
+        <w:rPr>
+          <w:sz w:val="18"/>
+          <w:szCs w:val="18"/>
+        </w:rPr>
+        <w:t xml:space="preserve">Q enables OR and NOT, which plain filter kwargs (always AND) cannot: filter(Q(status="new") | Q(priority="high")), and ~Q for negation.</w:t>
+      </w:r>
+    </w:p>
+    <w:p>
+      <w:pPr>
+        <w:ind w:left="260" w:hanging="200"/>
+        <w:spacing w:before="0" w:after="25" w:line="230" w:lineRule="auto"/>
+      </w:pPr>
+      <w:r>
+        <w:rPr>
+          <w:sz w:val="18"/>
+          <w:szCs w:val="18"/>
+        </w:rPr>
+        <w:t xml:space="preserve">•   </w:t>
+      </w:r>
+      <w:r>
+        <w:rPr>
+          <w:sz w:val="18"/>
+          <w:szCs w:val="18"/>
+        </w:rPr>
+        <w:t xml:space="preserve">aggregate() collapses the whole queryset to one dict: aggregate(total=Sum("amount")).</w:t>
+      </w:r>
+    </w:p>
+    <w:p>
+      <w:pPr>
+        <w:ind w:left="260" w:hanging="200"/>
+        <w:spacing w:before="0" w:after="25" w:line="230" w:lineRule="auto"/>
+      </w:pPr>
+      <w:r>
+        <w:rPr>
+          <w:sz w:val="18"/>
+          <w:szCs w:val="18"/>
+        </w:rPr>
+        <w:t xml:space="preserve">•   </w:t>
+      </w:r>
+      <w:r>
+        <w:rPr>
+          <w:sz w:val="18"/>
+          <w:szCs w:val="18"/>
+        </w:rPr>
+        <w:t xml:space="preserve">annotate() adds a computed value PER ROW/group: Customer.objects.annotate(order_count=Count("order")) - then filter or order by it.</w:t>
+      </w:r>
+    </w:p>
+    <w:p>
+      <w:pPr>
+        <w:ind w:left="260" w:hanging="200"/>
+        <w:spacing w:before="0" w:after="25" w:line="230" w:lineRule="auto"/>
+      </w:pPr>
+      <w:r>
+        <w:rPr>
+          <w:sz w:val="18"/>
+          <w:szCs w:val="18"/>
+        </w:rPr>
+        <w:t xml:space="preserve">•   </w:t>
+      </w:r>
+      <w:r>
+        <w:rPr>
+          <w:sz w:val="18"/>
+          <w:szCs w:val="18"/>
+        </w:rPr>
+        <w:t xml:space="preserve">annotate + values gives GROUP BY reports; functions: Count, Sum, Avg, Min, Max, plus Case/When for conditional aggregates.</w:t>
+      </w:r>
+    </w:p>
+    <w:p>
+      <w:pPr>
+        <w:ind w:left="260" w:hanging="200"/>
+        <w:spacing w:before="0" w:after="25" w:line="230" w:lineRule="auto"/>
+      </w:pPr>
+      <w:r>
+        <w:rPr>
+          <w:sz w:val="18"/>
+          <w:szCs w:val="18"/>
+        </w:rPr>
+        <w:t xml:space="preserve">•   </w:t>
+      </w:r>
+      <w:r>
+        <w:rPr>
+          <w:sz w:val="18"/>
+          <w:szCs w:val="18"/>
+        </w:rPr>
+        <w:t xml:space="preserve">All of this runs in the database - almost always faster than looping in Python.</w:t>
+      </w:r>
+    </w:p>
+    <w:p>
+      <w:pPr>
+        <w:ind w:left="260" w:hanging="0"/>
+        <w:spacing w:before="0" w:after="15" w:line="230" w:lineRule="auto"/>
+        <w:shd w:val="clear" w:color="auto" w:fill="F2F2F2"/>
+      </w:pPr>
+      <w:r>
+        <w:rPr>
+          <w:b/>
+          <w:sz w:val="17"/>
+          <w:szCs w:val="17"/>
+        </w:rPr>
+        <w:t xml:space="preserve">Example:  </w:t>
+      </w:r>
+      <w:r>
+        <w:rPr>
+          <w:rFonts w:ascii="Consolas" w:hAnsi="Consolas" w:cs="Consolas"/>
+          <w:color w:val="3B3B3B"/>
+          <w:sz w:val="17"/>
+          <w:szCs w:val="17"/>
+        </w:rPr>
+        <w:t xml:space="preserve">Product.objects.filter(pk=5).update(</w:t>
+      </w:r>
+    </w:p>
+    <w:p>
+      <w:pPr>
+        <w:ind w:left="260" w:hanging="0"/>
+        <w:spacing w:before="0" w:after="15" w:line="230" w:lineRule="auto"/>
+        <w:shd w:val="clear" w:color="auto" w:fill="F2F2F2"/>
+      </w:pPr>
+      <w:r>
+        <w:rPr>
+          <w:rFonts w:ascii="Consolas" w:hAnsi="Consolas" w:cs="Consolas"/>
+          <w:color w:val="3B3B3B"/>
+          <w:sz w:val="17"/>
+          <w:szCs w:val="17"/>
+        </w:rPr>
+        <w:t xml:space="preserve">    stock=F("stock") - 1)          # atomic</w:t>
+      </w:r>
+    </w:p>
+    <w:p>
+      <w:pPr>
+        <w:ind w:left="260" w:hanging="0"/>
+        <w:spacing w:before="0" w:after="15" w:line="230" w:lineRule="auto"/>
+        <w:shd w:val="clear" w:color="auto" w:fill="F2F2F2"/>
+      </w:pPr>
+      <w:r>
+        <w:rPr>
+          <w:rFonts w:ascii="Consolas" w:hAnsi="Consolas" w:cs="Consolas"/>
+          <w:color w:val="3B3B3B"/>
+          <w:sz w:val="17"/>
+          <w:szCs w:val="17"/>
+        </w:rPr>
+        <w:t xml:space="preserve">Order.objects.filter(</w:t>
+      </w:r>
+    </w:p>
+    <w:p>
+      <w:pPr>
+        <w:ind w:left="260" w:hanging="0"/>
+        <w:spacing w:before="0" w:after="15" w:line="230" w:lineRule="auto"/>
+        <w:shd w:val="clear" w:color="auto" w:fill="F2F2F2"/>
+      </w:pPr>
+      <w:r>
+        <w:rPr>
+          <w:rFonts w:ascii="Consolas" w:hAnsi="Consolas" w:cs="Consolas"/>
+          <w:color w:val="3B3B3B"/>
+          <w:sz w:val="17"/>
+          <w:szCs w:val="17"/>
+        </w:rPr>
+        <w:t xml:space="preserve">    Q(status="new") | Q(amount__gt=5000))</w:t>
+      </w:r>
+    </w:p>
+    <w:p>
+      <w:pPr>
+        <w:ind w:left="260" w:hanging="0"/>
+        <w:spacing w:before="0" w:after="15" w:line="230" w:lineRule="auto"/>
+        <w:shd w:val="clear" w:color="auto" w:fill="F2F2F2"/>
+      </w:pPr>
+      <w:r>
+        <w:rPr>
+          <w:rFonts w:ascii="Consolas" w:hAnsi="Consolas" w:cs="Consolas"/>
+          <w:color w:val="3B3B3B"/>
+          <w:sz w:val="17"/>
+          <w:szCs w:val="17"/>
+        </w:rPr>
+        <w:t xml:space="preserve">Customer.objects.annotate(</w:t>
+      </w:r>
+    </w:p>
+    <w:p>
+      <w:pPr>
+        <w:ind w:left="260" w:hanging="0"/>
+        <w:spacing w:before="0" w:after="15" w:line="230" w:lineRule="auto"/>
+        <w:shd w:val="clear" w:color="auto" w:fill="F2F2F2"/>
+      </w:pPr>
+      <w:r>
+        <w:rPr>
+          <w:rFonts w:ascii="Consolas" w:hAnsi="Consolas" w:cs="Consolas"/>
+          <w:color w:val="3B3B3B"/>
+          <w:sz w:val="17"/>
+          <w:szCs w:val="17"/>
+        </w:rPr>
+        <w:t xml:space="preserve">    n=Count("order")).filter(n__gt=10)</w:t>
+      </w:r>
+    </w:p>
+    <w:p>
+      <w:pPr>
+        <w:ind w:left="120" w:hanging="0"/>
+        <w:spacing w:before="50" w:after="110" w:line="230" w:lineRule="auto"/>
+        <w:pBdr>
+          <w:left w:val="single" w:sz="12" w:space="4" w:color="2E5E1F"/>
+        </w:pBdr>
+      </w:pPr>
+      <w:r>
+        <w:rPr>
+          <w:b/>
+          <w:color w:val="2E5E1F"/>
+          <w:sz w:val="18"/>
+          <w:szCs w:val="18"/>
+        </w:rPr>
+        <w:t xml:space="preserve">Interview answer:  </w:t>
+      </w:r>
+      <w:r>
+        <w:rPr>
+          <w:i/>
+          <w:sz w:val="18"/>
+          <w:szCs w:val="18"/>
+        </w:rPr>
+        <w:t xml:space="preserve">F pushes column references into SQL - update(stock=F('stock')-1) is atomic and race-free, unlike read-modify-save. Q composes OR/NOT conditions that keyword filters can't. aggregate gives one summary row, annotate computes per row or group for filtering and ordering - all executed in the database where it belongs.</w:t>
+      </w:r>
+    </w:p>
+    <w:p>
+      <w:pPr>
+        <w:spacing w:before="140" w:after="40" w:line="230" w:lineRule="auto"/>
+      </w:pPr>
+      <w:r>
+        <w:rPr>
+          <w:b/>
+          <w:sz w:val="21"/>
+          <w:szCs w:val="21"/>
+        </w:rPr>
+        <w:t xml:space="preserve">D2.5  Relationships - FK, OneToOne, ManyToMany</w:t>
+      </w:r>
+    </w:p>
+    <w:p>
+      <w:pPr>
+        <w:spacing w:before="0" w:after="40" w:line="230" w:lineRule="auto"/>
+      </w:pPr>
+      <w:r>
+        <w:rPr>
+          <w:b/>
+          <w:sz w:val="18"/>
+          <w:szCs w:val="18"/>
+        </w:rPr>
+        <w:t xml:space="preserve">What it is:  </w:t>
+      </w:r>
+      <w:r>
+        <w:rPr>
+          <w:sz w:val="18"/>
+          <w:szCs w:val="18"/>
+        </w:rPr>
+        <w:t xml:space="preserve">ForeignKey is many-to-one, OneToOneField is one-to-one, ManyToManyField creates a junction table - with related_name controlling the reverse side.</w:t>
+      </w:r>
+    </w:p>
+    <w:p>
+      <w:pPr>
+        <w:ind w:left="260" w:hanging="200"/>
+        <w:spacing w:before="0" w:after="25" w:line="230" w:lineRule="auto"/>
+      </w:pPr>
+      <w:r>
+        <w:rPr>
+          <w:sz w:val="18"/>
+          <w:szCs w:val="18"/>
+        </w:rPr>
+        <w:t xml:space="preserve">•   </w:t>
+      </w:r>
+      <w:r>
+        <w:rPr>
+          <w:sz w:val="18"/>
+          <w:szCs w:val="18"/>
+        </w:rPr>
+        <w:t xml:space="preserve">ForeignKey(Customer, on_delete=...): many orders per customer. on_delete is mandatory: CASCADE (delete children), PROTECT (block), SET_NULL (needs null=True).</w:t>
+      </w:r>
+    </w:p>
+    <w:p>
+      <w:pPr>
+        <w:ind w:left="260" w:hanging="200"/>
+        <w:spacing w:before="0" w:after="25" w:line="230" w:lineRule="auto"/>
+      </w:pPr>
+      <w:r>
+        <w:rPr>
+          <w:sz w:val="18"/>
+          <w:szCs w:val="18"/>
+        </w:rPr>
+        <w:t xml:space="preserve">•   </w:t>
+      </w:r>
+      <w:r>
+        <w:rPr>
+          <w:sz w:val="18"/>
+          <w:szCs w:val="18"/>
+        </w:rPr>
+        <w:t xml:space="preserve">PROTECT is the safe default for business data - accidental parent deletes fail loudly instead of silently wiping children.</w:t>
+      </w:r>
+    </w:p>
+    <w:p>
+      <w:pPr>
+        <w:ind w:left="260" w:hanging="200"/>
+        <w:spacing w:before="0" w:after="25" w:line="230" w:lineRule="auto"/>
+      </w:pPr>
+      <w:r>
+        <w:rPr>
+          <w:sz w:val="18"/>
+          <w:szCs w:val="18"/>
+        </w:rPr>
+        <w:t xml:space="preserve">•   </w:t>
+      </w:r>
+      <w:r>
+        <w:rPr>
+          <w:sz w:val="18"/>
+          <w:szCs w:val="18"/>
+        </w:rPr>
+        <w:t xml:space="preserve">OneToOneField: profile-per-user pattern; access both ways as single objects.</w:t>
+      </w:r>
+    </w:p>
+    <w:p>
+      <w:pPr>
+        <w:ind w:left="260" w:hanging="200"/>
+        <w:spacing w:before="0" w:after="25" w:line="230" w:lineRule="auto"/>
+      </w:pPr>
+      <w:r>
+        <w:rPr>
+          <w:sz w:val="18"/>
+          <w:szCs w:val="18"/>
+        </w:rPr>
+        <w:t xml:space="preserve">•   </w:t>
+      </w:r>
+      <w:r>
+        <w:rPr>
+          <w:sz w:val="18"/>
+          <w:szCs w:val="18"/>
+        </w:rPr>
+        <w:t xml:space="preserve">ManyToManyField: Django creates the join table; through="Membership" replaces it with our own model when the relation itself has fields (date joined, role).</w:t>
+      </w:r>
+    </w:p>
+    <w:p>
+      <w:pPr>
+        <w:ind w:left="260" w:hanging="200"/>
+        <w:spacing w:before="0" w:after="25" w:line="230" w:lineRule="auto"/>
+      </w:pPr>
+      <w:r>
+        <w:rPr>
+          <w:sz w:val="18"/>
+          <w:szCs w:val="18"/>
+        </w:rPr>
+        <w:t xml:space="preserve">•   </w:t>
+      </w:r>
+      <w:r>
+        <w:rPr>
+          <w:sz w:val="18"/>
+          <w:szCs w:val="18"/>
+        </w:rPr>
+        <w:t xml:space="preserve">Reverse access: customer.order_set by default; related_name="orders" renames it (customer.orders.all()).</w:t>
+      </w:r>
+    </w:p>
+    <w:p>
+      <w:pPr>
+        <w:ind w:left="260" w:hanging="200"/>
+        <w:spacing w:before="0" w:after="25" w:line="230" w:lineRule="auto"/>
+      </w:pPr>
+      <w:r>
+        <w:rPr>
+          <w:sz w:val="18"/>
+          <w:szCs w:val="18"/>
+        </w:rPr>
+        <w:t xml:space="preserve">•   </w:t>
+      </w:r>
+      <w:r>
+        <w:rPr>
+          <w:sz w:val="18"/>
+          <w:szCs w:val="18"/>
+        </w:rPr>
+        <w:t xml:space="preserve">related_name="+" disables the reverse when it is never needed.</w:t>
+      </w:r>
+    </w:p>
+    <w:p>
+      <w:pPr>
+        <w:ind w:left="260" w:hanging="200"/>
+        <w:spacing w:before="0" w:after="25" w:line="230" w:lineRule="auto"/>
+      </w:pPr>
+      <w:r>
+        <w:rPr>
+          <w:sz w:val="18"/>
+          <w:szCs w:val="18"/>
+        </w:rPr>
+        <w:t xml:space="preserve">•   </w:t>
+      </w:r>
+      <w:r>
+        <w:rPr>
+          <w:sz w:val="18"/>
+          <w:szCs w:val="18"/>
+        </w:rPr>
+        <w:t xml:space="preserve">Self-relations: ForeignKey("self") builds trees (category parent); M2M to self builds graphs (followers, symmetrical=False).</w:t>
+      </w:r>
+    </w:p>
+    <w:p>
+      <w:pPr>
+        <w:ind w:left="260" w:hanging="0"/>
+        <w:spacing w:before="0" w:after="15" w:line="230" w:lineRule="auto"/>
+        <w:shd w:val="clear" w:color="auto" w:fill="F2F2F2"/>
+      </w:pPr>
+      <w:r>
+        <w:rPr>
+          <w:b/>
+          <w:sz w:val="17"/>
+          <w:szCs w:val="17"/>
+        </w:rPr>
+        <w:t xml:space="preserve">Example:  </w:t>
+      </w:r>
+      <w:r>
+        <w:rPr>
+          <w:rFonts w:ascii="Consolas" w:hAnsi="Consolas" w:cs="Consolas"/>
+          <w:color w:val="3B3B3B"/>
+          <w:sz w:val="17"/>
+          <w:szCs w:val="17"/>
+        </w:rPr>
+        <w:t xml:space="preserve">class Order(models.Model):</w:t>
+      </w:r>
+    </w:p>
+    <w:p>
+      <w:pPr>
+        <w:ind w:left="260" w:hanging="0"/>
+        <w:spacing w:before="0" w:after="15" w:line="230" w:lineRule="auto"/>
+        <w:shd w:val="clear" w:color="auto" w:fill="F2F2F2"/>
+      </w:pPr>
+      <w:r>
+        <w:rPr>
+          <w:rFonts w:ascii="Consolas" w:hAnsi="Consolas" w:cs="Consolas"/>
+          <w:color w:val="3B3B3B"/>
+          <w:sz w:val="17"/>
+          <w:szCs w:val="17"/>
+        </w:rPr>
+        <w:t xml:space="preserve">    customer = models.ForeignKey(Customer,</w:t>
+      </w:r>
+    </w:p>
+    <w:p>
+      <w:pPr>
+        <w:ind w:left="260" w:hanging="0"/>
+        <w:spacing w:before="0" w:after="15" w:line="230" w:lineRule="auto"/>
+        <w:shd w:val="clear" w:color="auto" w:fill="F2F2F2"/>
+      </w:pPr>
+      <w:r>
+        <w:rPr>
+          <w:rFonts w:ascii="Consolas" w:hAnsi="Consolas" w:cs="Consolas"/>
+          <w:color w:val="3B3B3B"/>
+          <w:sz w:val="17"/>
+          <w:szCs w:val="17"/>
+        </w:rPr>
+        <w:t xml:space="preserve">        on_delete=models.PROTECT,</w:t>
+      </w:r>
+    </w:p>
+    <w:p>
+      <w:pPr>
+        <w:ind w:left="260" w:hanging="0"/>
+        <w:spacing w:before="0" w:after="15" w:line="230" w:lineRule="auto"/>
+        <w:shd w:val="clear" w:color="auto" w:fill="F2F2F2"/>
+      </w:pPr>
+      <w:r>
+        <w:rPr>
+          <w:rFonts w:ascii="Consolas" w:hAnsi="Consolas" w:cs="Consolas"/>
+          <w:color w:val="3B3B3B"/>
+          <w:sz w:val="17"/>
+          <w:szCs w:val="17"/>
+        </w:rPr>
+        <w:t xml:space="preserve">        related_name="orders")</w:t>
+      </w:r>
+    </w:p>
+    <w:p>
+      <w:pPr>
+        <w:ind w:left="260" w:hanging="0"/>
+        <w:spacing w:before="0" w:after="15" w:line="230" w:lineRule="auto"/>
+        <w:shd w:val="clear" w:color="auto" w:fill="F2F2F2"/>
+      </w:pPr>
+      <w:r>
+        <w:rPr>
+          <w:rFonts w:ascii="Consolas" w:hAnsi="Consolas" w:cs="Consolas"/>
+          <w:color w:val="3B3B3B"/>
+          <w:sz w:val="17"/>
+          <w:szCs w:val="17"/>
+        </w:rPr>
+        <w:t xml:space="preserve">    tags = models.ManyToManyField(Tag, blank=True)</w:t>
+      </w:r>
+    </w:p>
+    <w:p>
+      <w:pPr>
+        <w:ind w:left="260" w:hanging="0"/>
+        <w:spacing w:before="0" w:after="15" w:line="230" w:lineRule="auto"/>
+        <w:shd w:val="clear" w:color="auto" w:fill="F2F2F2"/>
+      </w:pPr>
+      <w:r>
+        <w:rPr>
+          <w:rFonts w:ascii="Consolas" w:hAnsi="Consolas" w:cs="Consolas"/>
+          <w:color w:val="3B3B3B"/>
+          <w:sz w:val="17"/>
+          <w:szCs w:val="17"/>
+        </w:rPr>
+        <w:t xml:space="preserve"># customer.orders.all(), tag.order_set.all()</w:t>
+      </w:r>
+    </w:p>
+    <w:p>
+      <w:pPr>
+        <w:ind w:left="120" w:hanging="0"/>
+        <w:spacing w:before="50" w:after="110" w:line="230" w:lineRule="auto"/>
+        <w:pBdr>
+          <w:left w:val="single" w:sz="12" w:space="4" w:color="2E5E1F"/>
+        </w:pBdr>
+      </w:pPr>
+      <w:r>
+        <w:rPr>
+          <w:b/>
+          <w:color w:val="2E5E1F"/>
+          <w:sz w:val="18"/>
+          <w:szCs w:val="18"/>
+        </w:rPr>
+        <w:t xml:space="preserve">Interview answer:  </w:t>
+      </w:r>
+      <w:r>
+        <w:rPr>
+          <w:i/>
+          <w:sz w:val="18"/>
+          <w:szCs w:val="18"/>
+        </w:rPr>
+        <w:t xml:space="preserve">FK models many-to-one with a mandatory on_delete - I default to PROTECT for business data; OneToOne is the profile pattern; M2M builds a junction table, replaced by a through model when the relation carries its own fields. related_name names the reverse accessor, and self-referencing FKs model hierarchies.</w:t>
+      </w:r>
+    </w:p>
+    <w:p>
+      <w:pPr>
+        <w:spacing w:before="140" w:after="40" w:line="230" w:lineRule="auto"/>
+      </w:pPr>
+      <w:r>
+        <w:rPr>
+          <w:b/>
+          <w:sz w:val="21"/>
+          <w:szCs w:val="21"/>
+        </w:rPr>
+        <w:t xml:space="preserve">D2.6  Model Inheritance - Abstract, Multi-table, Proxy</w:t>
+      </w:r>
+    </w:p>
+    <w:p>
+      <w:pPr>
+        <w:spacing w:before="0" w:after="40" w:line="230" w:lineRule="auto"/>
+      </w:pPr>
+      <w:r>
+        <w:rPr>
+          <w:b/>
+          <w:sz w:val="18"/>
+          <w:szCs w:val="18"/>
+        </w:rPr>
+        <w:t xml:space="preserve">What it is:  </w:t>
+      </w:r>
+      <w:r>
+        <w:rPr>
+          <w:sz w:val="18"/>
+          <w:szCs w:val="18"/>
+        </w:rPr>
+        <w:t xml:space="preserve">Django offers three inheritance styles: abstract (shared fields, no extra table), multi-table (each class a table), proxy (same table, new behavior).</w:t>
+      </w:r>
+    </w:p>
+    <w:p>
+      <w:pPr>
+        <w:ind w:left="260" w:hanging="200"/>
+        <w:spacing w:before="0" w:after="25" w:line="230" w:lineRule="auto"/>
+      </w:pPr>
+      <w:r>
+        <w:rPr>
+          <w:sz w:val="18"/>
+          <w:szCs w:val="18"/>
+        </w:rPr>
+        <w:t xml:space="preserve">•   </w:t>
+      </w:r>
+      <w:r>
+        <w:rPr>
+          <w:sz w:val="18"/>
+          <w:szCs w:val="18"/>
+        </w:rPr>
+        <w:t xml:space="preserve">Abstract base (Meta: abstract = True): children copy its fields into their own tables; the base has no table. The workhorse - TimeStampedModel with created/updated used everywhere.</w:t>
+      </w:r>
+    </w:p>
+    <w:p>
+      <w:pPr>
+        <w:ind w:left="260" w:hanging="200"/>
+        <w:spacing w:before="0" w:after="25" w:line="230" w:lineRule="auto"/>
+      </w:pPr>
+      <w:r>
+        <w:rPr>
+          <w:sz w:val="18"/>
+          <w:szCs w:val="18"/>
+        </w:rPr>
+        <w:t xml:space="preserve">•   </w:t>
+      </w:r>
+      <w:r>
+        <w:rPr>
+          <w:sz w:val="18"/>
+          <w:szCs w:val="18"/>
+        </w:rPr>
+        <w:t xml:space="preserve">Multi-table: both parent and child get tables joined by an implicit OneToOne. Every child query joins - a hidden performance cost people forget. Rarely the right choice.</w:t>
+      </w:r>
+    </w:p>
+    <w:p>
+      <w:pPr>
+        <w:ind w:left="260" w:hanging="200"/>
+        <w:spacing w:before="0" w:after="25" w:line="230" w:lineRule="auto"/>
+      </w:pPr>
+      <w:r>
+        <w:rPr>
+          <w:sz w:val="18"/>
+          <w:szCs w:val="18"/>
+        </w:rPr>
+        <w:t xml:space="preserve">•   </w:t>
+      </w:r>
+      <w:r>
+        <w:rPr>
+          <w:sz w:val="18"/>
+          <w:szCs w:val="18"/>
+        </w:rPr>
+        <w:t xml:space="preserve">Proxy (Meta: proxy = True): no new table, no new fields - just different Python behavior: custom manager, different ordering, extra methods on the same data.</w:t>
+      </w:r>
+    </w:p>
+    <w:p>
+      <w:pPr>
+        <w:ind w:left="260" w:hanging="200"/>
+        <w:spacing w:before="0" w:after="25" w:line="230" w:lineRule="auto"/>
+      </w:pPr>
+      <w:r>
+        <w:rPr>
+          <w:sz w:val="18"/>
+          <w:szCs w:val="18"/>
+        </w:rPr>
+        <w:t xml:space="preserve">•   </w:t>
+      </w:r>
+      <w:r>
+        <w:rPr>
+          <w:sz w:val="18"/>
+          <w:szCs w:val="18"/>
+        </w:rPr>
+        <w:t xml:space="preserve">Choosing: share common fields -&gt; abstract; genuinely need parent-level querying across subtypes -&gt; multi-table (or reconsider: one table + type field); same data, different behavior -&gt; proxy.</w:t>
+      </w:r>
+    </w:p>
+    <w:p>
+      <w:pPr>
+        <w:ind w:left="260" w:hanging="200"/>
+        <w:spacing w:before="0" w:after="25" w:line="230" w:lineRule="auto"/>
+      </w:pPr>
+      <w:r>
+        <w:rPr>
+          <w:sz w:val="18"/>
+          <w:szCs w:val="18"/>
+        </w:rPr>
+        <w:t xml:space="preserve">•   </w:t>
+      </w:r>
+      <w:r>
+        <w:rPr>
+          <w:sz w:val="18"/>
+          <w:szCs w:val="18"/>
+        </w:rPr>
+        <w:t xml:space="preserve">Interviewers probe multi-table because of the surprise JOINs and the parent_ptr link.</w:t>
+      </w:r>
+    </w:p>
+    <w:p>
+      <w:pPr>
+        <w:ind w:left="260" w:hanging="0"/>
+        <w:spacing w:before="0" w:after="15" w:line="230" w:lineRule="auto"/>
+        <w:shd w:val="clear" w:color="auto" w:fill="F2F2F2"/>
+      </w:pPr>
+      <w:r>
+        <w:rPr>
+          <w:b/>
+          <w:sz w:val="17"/>
+          <w:szCs w:val="17"/>
+        </w:rPr>
+        <w:t xml:space="preserve">Example:  </w:t>
+      </w:r>
+      <w:r>
+        <w:rPr>
+          <w:rFonts w:ascii="Consolas" w:hAnsi="Consolas" w:cs="Consolas"/>
+          <w:color w:val="3B3B3B"/>
+          <w:sz w:val="17"/>
+          <w:szCs w:val="17"/>
+        </w:rPr>
+        <w:t xml:space="preserve">class TimeStamped(models.Model):</w:t>
+      </w:r>
+    </w:p>
+    <w:p>
+      <w:pPr>
+        <w:ind w:left="260" w:hanging="0"/>
+        <w:spacing w:before="0" w:after="15" w:line="230" w:lineRule="auto"/>
+        <w:shd w:val="clear" w:color="auto" w:fill="F2F2F2"/>
+      </w:pPr>
+      <w:r>
+        <w:rPr>
+          <w:rFonts w:ascii="Consolas" w:hAnsi="Consolas" w:cs="Consolas"/>
+          <w:color w:val="3B3B3B"/>
+          <w:sz w:val="17"/>
+          <w:szCs w:val="17"/>
+        </w:rPr>
+        <w:t xml:space="preserve">    created = models.DateTimeField(auto_now_add=True)</w:t>
+      </w:r>
+    </w:p>
+    <w:p>
+      <w:pPr>
+        <w:ind w:left="260" w:hanging="0"/>
+        <w:spacing w:before="0" w:after="15" w:line="230" w:lineRule="auto"/>
+        <w:shd w:val="clear" w:color="auto" w:fill="F2F2F2"/>
+      </w:pPr>
+      <w:r>
+        <w:rPr>
+          <w:rFonts w:ascii="Consolas" w:hAnsi="Consolas" w:cs="Consolas"/>
+          <w:color w:val="3B3B3B"/>
+          <w:sz w:val="17"/>
+          <w:szCs w:val="17"/>
+        </w:rPr>
+        <w:t xml:space="preserve">    updated = models.DateTimeField(auto_now=True)</w:t>
+      </w:r>
+    </w:p>
+    <w:p>
+      <w:pPr>
+        <w:ind w:left="260" w:hanging="0"/>
+        <w:spacing w:before="0" w:after="15" w:line="230" w:lineRule="auto"/>
+        <w:shd w:val="clear" w:color="auto" w:fill="F2F2F2"/>
+      </w:pPr>
+      <w:r>
+        <w:rPr>
+          <w:rFonts w:ascii="Consolas" w:hAnsi="Consolas" w:cs="Consolas"/>
+          <w:color w:val="3B3B3B"/>
+          <w:sz w:val="17"/>
+          <w:szCs w:val="17"/>
+        </w:rPr>
+        <w:t xml:space="preserve">    class Meta:</w:t>
+      </w:r>
+    </w:p>
+    <w:p>
+      <w:pPr>
+        <w:ind w:left="260" w:hanging="0"/>
+        <w:spacing w:before="0" w:after="15" w:line="230" w:lineRule="auto"/>
+        <w:shd w:val="clear" w:color="auto" w:fill="F2F2F2"/>
+      </w:pPr>
+      <w:r>
+        <w:rPr>
+          <w:rFonts w:ascii="Consolas" w:hAnsi="Consolas" w:cs="Consolas"/>
+          <w:color w:val="3B3B3B"/>
+          <w:sz w:val="17"/>
+          <w:szCs w:val="17"/>
+        </w:rPr>
+        <w:t xml:space="preserve">        abstract = True</w:t>
+      </w:r>
+    </w:p>
+    <w:p>
+      <w:pPr>
+        <w:ind w:left="260" w:hanging="0"/>
+        <w:spacing w:before="0" w:after="15" w:line="230" w:lineRule="auto"/>
+        <w:shd w:val="clear" w:color="auto" w:fill="F2F2F2"/>
+      </w:pPr>
+      <w:r>
+        <w:rPr>
+          <w:rFonts w:ascii="Consolas" w:hAnsi="Consolas" w:cs="Consolas"/>
+          <w:color w:val="3B3B3B"/>
+          <w:sz w:val="17"/>
+          <w:szCs w:val="17"/>
+        </w:rPr>
+        <w:t xml:space="preserve">class Order(TimeStamped): ...  # own table only</w:t>
+      </w:r>
+    </w:p>
+    <w:p>
+      <w:pPr>
+        <w:ind w:left="120" w:hanging="0"/>
+        <w:spacing w:before="50" w:after="110" w:line="230" w:lineRule="auto"/>
+        <w:pBdr>
+          <w:left w:val="single" w:sz="12" w:space="4" w:color="2E5E1F"/>
+        </w:pBdr>
+      </w:pPr>
+      <w:r>
+        <w:rPr>
+          <w:b/>
+          <w:color w:val="2E5E1F"/>
+          <w:sz w:val="18"/>
+          <w:szCs w:val="18"/>
+        </w:rPr>
+        <w:t xml:space="preserve">Interview answer:  </w:t>
+      </w:r>
+      <w:r>
+        <w:rPr>
+          <w:i/>
+          <w:sz w:val="18"/>
+          <w:szCs w:val="18"/>
+        </w:rPr>
+        <w:t xml:space="preserve">Abstract bases copy shared fields into each child's table - my default for things like timestamps. Multi-table inheritance gives every class a table linked by OneToOne, silently JOINing on each child query, so I avoid it unless cross-type querying truly pays. Proxy models reuse the same table with different behavior - managers, ordering, methods.</w:t>
+      </w:r>
+    </w:p>
+    <w:p>
+      <w:pPr>
+        <w:spacing w:before="140" w:after="40" w:line="230" w:lineRule="auto"/>
+      </w:pPr>
+      <w:r>
+        <w:rPr>
+          <w:b/>
+          <w:sz w:val="21"/>
+          <w:szCs w:val="21"/>
+        </w:rPr>
+        <w:t xml:space="preserve">D2.7  Transactions - atomic and select_for_update</w:t>
+      </w:r>
+    </w:p>
+    <w:p>
+      <w:pPr>
+        <w:spacing w:before="0" w:after="40" w:line="230" w:lineRule="auto"/>
+      </w:pPr>
+      <w:r>
+        <w:rPr>
+          <w:b/>
+          <w:sz w:val="18"/>
+          <w:szCs w:val="18"/>
+        </w:rPr>
+        <w:t xml:space="preserve">What it is:  </w:t>
+      </w:r>
+      <w:r>
+        <w:rPr>
+          <w:sz w:val="18"/>
+          <w:szCs w:val="18"/>
+        </w:rPr>
+        <w:t xml:space="preserve">transaction.atomic wraps DB work in all-or-nothing blocks, and select_for_update row-locks data against concurrent edits.</w:t>
+      </w:r>
+    </w:p>
+    <w:p>
+      <w:pPr>
+        <w:ind w:left="260" w:hanging="200"/>
+        <w:spacing w:before="0" w:after="25" w:line="230" w:lineRule="auto"/>
+      </w:pPr>
+      <w:r>
+        <w:rPr>
+          <w:sz w:val="18"/>
+          <w:szCs w:val="18"/>
+        </w:rPr>
+        <w:t xml:space="preserve">•   </w:t>
+      </w:r>
+      <w:r>
+        <w:rPr>
+          <w:sz w:val="18"/>
+          <w:szCs w:val="18"/>
+        </w:rPr>
+        <w:t xml:space="preserve">Default Django mode is autocommit - every ORM write commits alone. Multi-step operations need explicit grouping.</w:t>
+      </w:r>
+    </w:p>
+    <w:p>
+      <w:pPr>
+        <w:ind w:left="260" w:hanging="200"/>
+        <w:spacing w:before="0" w:after="25" w:line="230" w:lineRule="auto"/>
+      </w:pPr>
+      <w:r>
+        <w:rPr>
+          <w:sz w:val="18"/>
+          <w:szCs w:val="18"/>
+        </w:rPr>
+        <w:t xml:space="preserve">•   </w:t>
+      </w:r>
+      <w:r>
+        <w:rPr>
+          <w:sz w:val="18"/>
+          <w:szCs w:val="18"/>
+        </w:rPr>
+        <w:t xml:space="preserve">with transaction.atomic(): everything inside commits together or rolls back on exception. Also usable as a decorator.</w:t>
+      </w:r>
+    </w:p>
+    <w:p>
+      <w:pPr>
+        <w:ind w:left="260" w:hanging="200"/>
+        <w:spacing w:before="0" w:after="25" w:line="230" w:lineRule="auto"/>
+      </w:pPr>
+      <w:r>
+        <w:rPr>
+          <w:sz w:val="18"/>
+          <w:szCs w:val="18"/>
+        </w:rPr>
+        <w:t xml:space="preserve">•   </w:t>
+      </w:r>
+      <w:r>
+        <w:rPr>
+          <w:sz w:val="18"/>
+          <w:szCs w:val="18"/>
+        </w:rPr>
+        <w:t xml:space="preserve">atomic blocks nest - inner blocks become savepoints, so an inner failure can roll back partially.</w:t>
+      </w:r>
+    </w:p>
+    <w:p>
+      <w:pPr>
+        <w:ind w:left="260" w:hanging="200"/>
+        <w:spacing w:before="0" w:after="25" w:line="230" w:lineRule="auto"/>
+      </w:pPr>
+      <w:r>
+        <w:rPr>
+          <w:sz w:val="18"/>
+          <w:szCs w:val="18"/>
+        </w:rPr>
+        <w:t xml:space="preserve">•   </w:t>
+      </w:r>
+      <w:r>
+        <w:rPr>
+          <w:sz w:val="18"/>
+          <w:szCs w:val="18"/>
+        </w:rPr>
+        <w:t xml:space="preserve">ATOMIC_REQUESTS=True wraps every request in a transaction - simple, but holds transactions longer under load.</w:t>
+      </w:r>
+    </w:p>
+    <w:p>
+      <w:pPr>
+        <w:ind w:left="260" w:hanging="200"/>
+        <w:spacing w:before="0" w:after="25" w:line="230" w:lineRule="auto"/>
+      </w:pPr>
+      <w:r>
+        <w:rPr>
+          <w:sz w:val="18"/>
+          <w:szCs w:val="18"/>
+        </w:rPr>
+        <w:t xml:space="preserve">•   </w:t>
+      </w:r>
+      <w:r>
+        <w:rPr>
+          <w:sz w:val="18"/>
+          <w:szCs w:val="18"/>
+        </w:rPr>
+        <w:t xml:space="preserve">select_for_update() adds FOR UPDATE - other transactions wait for the lock: the fix for stock/wallet race conditions. Must run inside atomic.</w:t>
+      </w:r>
+    </w:p>
+    <w:p>
+      <w:pPr>
+        <w:ind w:left="260" w:hanging="200"/>
+        <w:spacing w:before="0" w:after="25" w:line="230" w:lineRule="auto"/>
+      </w:pPr>
+      <w:r>
+        <w:rPr>
+          <w:sz w:val="18"/>
+          <w:szCs w:val="18"/>
+        </w:rPr>
+        <w:t xml:space="preserve">•   </w:t>
+      </w:r>
+      <w:r>
+        <w:rPr>
+          <w:sz w:val="18"/>
+          <w:szCs w:val="18"/>
+        </w:rPr>
+        <w:t xml:space="preserve">F() expressions are the lighter alternative for simple counters; select_for_update is for read-then-decide logic.</w:t>
+      </w:r>
+    </w:p>
+    <w:p>
+      <w:pPr>
+        <w:ind w:left="260" w:hanging="200"/>
+        <w:spacing w:before="0" w:after="25" w:line="230" w:lineRule="auto"/>
+      </w:pPr>
+      <w:r>
+        <w:rPr>
+          <w:sz w:val="18"/>
+          <w:szCs w:val="18"/>
+        </w:rPr>
+        <w:t xml:space="preserve">•   </w:t>
+      </w:r>
+      <w:r>
+        <w:rPr>
+          <w:sz w:val="18"/>
+          <w:szCs w:val="18"/>
+        </w:rPr>
+        <w:t xml:space="preserve">on_commit(callback) delays side effects (emails, Celery tasks) until after commit - so a rollback cannot leave a task pointing at data that never got saved.</w:t>
+      </w:r>
+    </w:p>
+    <w:p>
+      <w:pPr>
+        <w:ind w:left="260" w:hanging="0"/>
+        <w:spacing w:before="0" w:after="15" w:line="230" w:lineRule="auto"/>
+        <w:shd w:val="clear" w:color="auto" w:fill="F2F2F2"/>
+      </w:pPr>
+      <w:r>
+        <w:rPr>
+          <w:b/>
+          <w:sz w:val="17"/>
+          <w:szCs w:val="17"/>
+        </w:rPr>
+        <w:t xml:space="preserve">Example:  </w:t>
+      </w:r>
+      <w:r>
+        <w:rPr>
+          <w:rFonts w:ascii="Consolas" w:hAnsi="Consolas" w:cs="Consolas"/>
+          <w:color w:val="3B3B3B"/>
+          <w:sz w:val="17"/>
+          <w:szCs w:val="17"/>
+        </w:rPr>
+        <w:t xml:space="preserve">with transaction.atomic():</w:t>
+      </w:r>
+    </w:p>
+    <w:p>
+      <w:pPr>
+        <w:ind w:left="260" w:hanging="0"/>
+        <w:spacing w:before="0" w:after="15" w:line="230" w:lineRule="auto"/>
+        <w:shd w:val="clear" w:color="auto" w:fill="F2F2F2"/>
+      </w:pPr>
+      <w:r>
+        <w:rPr>
+          <w:rFonts w:ascii="Consolas" w:hAnsi="Consolas" w:cs="Consolas"/>
+          <w:color w:val="3B3B3B"/>
+          <w:sz w:val="17"/>
+          <w:szCs w:val="17"/>
+        </w:rPr>
+        <w:t xml:space="preserve">    p = (Product.objects</w:t>
+      </w:r>
+    </w:p>
+    <w:p>
+      <w:pPr>
+        <w:ind w:left="260" w:hanging="0"/>
+        <w:spacing w:before="0" w:after="15" w:line="230" w:lineRule="auto"/>
+        <w:shd w:val="clear" w:color="auto" w:fill="F2F2F2"/>
+      </w:pPr>
+      <w:r>
+        <w:rPr>
+          <w:rFonts w:ascii="Consolas" w:hAnsi="Consolas" w:cs="Consolas"/>
+          <w:color w:val="3B3B3B"/>
+          <w:sz w:val="17"/>
+          <w:szCs w:val="17"/>
+        </w:rPr>
+        <w:t xml:space="preserve">         .select_for_update().get(pk=5))</w:t>
+      </w:r>
+    </w:p>
+    <w:p>
+      <w:pPr>
+        <w:ind w:left="260" w:hanging="0"/>
+        <w:spacing w:before="0" w:after="15" w:line="230" w:lineRule="auto"/>
+        <w:shd w:val="clear" w:color="auto" w:fill="F2F2F2"/>
+      </w:pPr>
+      <w:r>
+        <w:rPr>
+          <w:rFonts w:ascii="Consolas" w:hAnsi="Consolas" w:cs="Consolas"/>
+          <w:color w:val="3B3B3B"/>
+          <w:sz w:val="17"/>
+          <w:szCs w:val="17"/>
+        </w:rPr>
+        <w:t xml:space="preserve">    if p.stock &gt; 0:</w:t>
+      </w:r>
+    </w:p>
+    <w:p>
+      <w:pPr>
+        <w:ind w:left="260" w:hanging="0"/>
+        <w:spacing w:before="0" w:after="15" w:line="230" w:lineRule="auto"/>
+        <w:shd w:val="clear" w:color="auto" w:fill="F2F2F2"/>
+      </w:pPr>
+      <w:r>
+        <w:rPr>
+          <w:rFonts w:ascii="Consolas" w:hAnsi="Consolas" w:cs="Consolas"/>
+          <w:color w:val="3B3B3B"/>
+          <w:sz w:val="17"/>
+          <w:szCs w:val="17"/>
+        </w:rPr>
+        <w:t xml:space="preserve">        p.stock -= 1</w:t>
+      </w:r>
+    </w:p>
+    <w:p>
+      <w:pPr>
+        <w:ind w:left="260" w:hanging="0"/>
+        <w:spacing w:before="0" w:after="15" w:line="230" w:lineRule="auto"/>
+        <w:shd w:val="clear" w:color="auto" w:fill="F2F2F2"/>
+      </w:pPr>
+      <w:r>
+        <w:rPr>
+          <w:rFonts w:ascii="Consolas" w:hAnsi="Consolas" w:cs="Consolas"/>
+          <w:color w:val="3B3B3B"/>
+          <w:sz w:val="17"/>
+          <w:szCs w:val="17"/>
+        </w:rPr>
+        <w:t xml:space="preserve">        p.save()</w:t>
+      </w:r>
+    </w:p>
+    <w:p>
+      <w:pPr>
+        <w:ind w:left="260" w:hanging="0"/>
+        <w:spacing w:before="0" w:after="15" w:line="230" w:lineRule="auto"/>
+        <w:shd w:val="clear" w:color="auto" w:fill="F2F2F2"/>
+      </w:pPr>
+      <w:r>
+        <w:rPr>
+          <w:rFonts w:ascii="Consolas" w:hAnsi="Consolas" w:cs="Consolas"/>
+          <w:color w:val="3B3B3B"/>
+          <w:sz w:val="17"/>
+          <w:szCs w:val="17"/>
+        </w:rPr>
+        <w:t xml:space="preserve">transaction.on_commit(lambda:</w:t>
+      </w:r>
+    </w:p>
+    <w:p>
+      <w:pPr>
+        <w:ind w:left="260" w:hanging="0"/>
+        <w:spacing w:before="0" w:after="15" w:line="230" w:lineRule="auto"/>
+        <w:shd w:val="clear" w:color="auto" w:fill="F2F2F2"/>
+      </w:pPr>
+      <w:r>
+        <w:rPr>
+          <w:rFonts w:ascii="Consolas" w:hAnsi="Consolas" w:cs="Consolas"/>
+          <w:color w:val="3B3B3B"/>
+          <w:sz w:val="17"/>
+          <w:szCs w:val="17"/>
+        </w:rPr>
+        <w:t xml:space="preserve">    notify_task.delay(p.id))</w:t>
+      </w:r>
+    </w:p>
+    <w:p>
+      <w:pPr>
+        <w:ind w:left="120" w:hanging="0"/>
+        <w:spacing w:before="50" w:after="110" w:line="230" w:lineRule="auto"/>
+        <w:pBdr>
+          <w:left w:val="single" w:sz="12" w:space="4" w:color="2E5E1F"/>
+        </w:pBdr>
+      </w:pPr>
+      <w:r>
+        <w:rPr>
+          <w:b/>
+          <w:color w:val="2E5E1F"/>
+          <w:sz w:val="18"/>
+          <w:szCs w:val="18"/>
+        </w:rPr>
+        <w:t xml:space="preserve">Interview answer:  </w:t>
+      </w:r>
+      <w:r>
+        <w:rPr>
+          <w:i/>
+          <w:sz w:val="18"/>
+          <w:szCs w:val="18"/>
+        </w:rPr>
+        <w:t xml:space="preserve">transaction.atomic makes a block all-or-nothing with savepoints when nested; select_for_update inside it row-locks against races - my pattern for stock and payment flows, with F() expressions for simple atomic counters. on_commit defers emails and Celery tasks until the data is truly committed.</w:t>
+      </w:r>
+    </w:p>
+    <w:p>
+      <w:pPr>
+        <w:spacing w:before="140" w:after="40" w:line="230" w:lineRule="auto"/>
+      </w:pPr>
+      <w:r>
+        <w:rPr>
+          <w:b/>
+          <w:sz w:val="21"/>
+          <w:szCs w:val="21"/>
+        </w:rPr>
+        <w:t xml:space="preserve">D2.8  Custom Managers and QuerySets</w:t>
+      </w:r>
+    </w:p>
+    <w:p>
+      <w:pPr>
+        <w:spacing w:before="0" w:after="40" w:line="230" w:lineRule="auto"/>
+      </w:pPr>
+      <w:r>
+        <w:rPr>
+          <w:b/>
+          <w:sz w:val="18"/>
+          <w:szCs w:val="18"/>
+        </w:rPr>
+        <w:t xml:space="preserve">What it is:  </w:t>
+      </w:r>
+      <w:r>
+        <w:rPr>
+          <w:sz w:val="18"/>
+          <w:szCs w:val="18"/>
+        </w:rPr>
+        <w:t xml:space="preserve">A custom QuerySet holds reusable, chainable query logic; a manager exposes it as the model's entry point (objects).</w:t>
+      </w:r>
+    </w:p>
+    <w:p>
+      <w:pPr>
+        <w:ind w:left="260" w:hanging="200"/>
+        <w:spacing w:before="0" w:after="25" w:line="230" w:lineRule="auto"/>
+      </w:pPr>
+      <w:r>
+        <w:rPr>
+          <w:sz w:val="18"/>
+          <w:szCs w:val="18"/>
+        </w:rPr>
+        <w:t xml:space="preserve">•   </w:t>
+      </w:r>
+      <w:r>
+        <w:rPr>
+          <w:sz w:val="18"/>
+          <w:szCs w:val="18"/>
+        </w:rPr>
+        <w:t xml:space="preserve">Problem: filter(status='active', deleted_at__isnull=True) copy-pasted through the codebase - one rule change touches twenty files.</w:t>
+      </w:r>
+    </w:p>
+    <w:p>
+      <w:pPr>
+        <w:ind w:left="260" w:hanging="200"/>
+        <w:spacing w:before="0" w:after="25" w:line="230" w:lineRule="auto"/>
+      </w:pPr>
+      <w:r>
+        <w:rPr>
+          <w:sz w:val="18"/>
+          <w:szCs w:val="18"/>
+        </w:rPr>
+        <w:t xml:space="preserve">•   </w:t>
+      </w:r>
+      <w:r>
+        <w:rPr>
+          <w:sz w:val="18"/>
+          <w:szCs w:val="18"/>
+        </w:rPr>
+        <w:t xml:space="preserve">Solution: methods on a custom QuerySet - Order.objects.paid().recent().for_customer(c) - named business language, chainable.</w:t>
+      </w:r>
+    </w:p>
+    <w:p>
+      <w:pPr>
+        <w:ind w:left="260" w:hanging="200"/>
+        <w:spacing w:before="0" w:after="25" w:line="230" w:lineRule="auto"/>
+      </w:pPr>
+      <w:r>
+        <w:rPr>
+          <w:sz w:val="18"/>
+          <w:szCs w:val="18"/>
+        </w:rPr>
+        <w:t xml:space="preserve">•   </w:t>
+      </w:r>
+      <w:r>
+        <w:rPr>
+          <w:sz w:val="18"/>
+          <w:szCs w:val="18"/>
+        </w:rPr>
+        <w:t xml:space="preserve">Wiring: OrderQuerySet.as_manager(), or a Manager whose get_queryset() returns the custom QuerySet.</w:t>
+      </w:r>
+    </w:p>
+    <w:p>
+      <w:pPr>
+        <w:ind w:left="260" w:hanging="200"/>
+        <w:spacing w:before="0" w:after="25" w:line="230" w:lineRule="auto"/>
+      </w:pPr>
+      <w:r>
+        <w:rPr>
+          <w:sz w:val="18"/>
+          <w:szCs w:val="18"/>
+        </w:rPr>
+        <w:t xml:space="preserve">•   </w:t>
+      </w:r>
+      <w:r>
+        <w:rPr>
+          <w:sz w:val="18"/>
+          <w:szCs w:val="18"/>
+        </w:rPr>
+        <w:t xml:space="preserve">Default-filtering managers (e.g. auto-hiding soft-deleted rows) are risky: admin and shell silently miss data. Keep objects honest; add a separate manager or explicit methods for filtered views.</w:t>
+      </w:r>
+    </w:p>
+    <w:p>
+      <w:pPr>
+        <w:ind w:left="260" w:hanging="200"/>
+        <w:spacing w:before="0" w:after="25" w:line="230" w:lineRule="auto"/>
+      </w:pPr>
+      <w:r>
+        <w:rPr>
+          <w:sz w:val="18"/>
+          <w:szCs w:val="18"/>
+        </w:rPr>
+        <w:t xml:space="preserve">•   </w:t>
+      </w:r>
+      <w:r>
+        <w:rPr>
+          <w:sz w:val="18"/>
+          <w:szCs w:val="18"/>
+        </w:rPr>
+        <w:t xml:space="preserve">The first declared manager is the default one used by admin and dumpdata - order matters.</w:t>
+      </w:r>
+    </w:p>
+    <w:p>
+      <w:pPr>
+        <w:ind w:left="260" w:hanging="200"/>
+        <w:spacing w:before="0" w:after="25" w:line="230" w:lineRule="auto"/>
+      </w:pPr>
+      <w:r>
+        <w:rPr>
+          <w:sz w:val="18"/>
+          <w:szCs w:val="18"/>
+        </w:rPr>
+        <w:t xml:space="preserve">•   </w:t>
+      </w:r>
+      <w:r>
+        <w:rPr>
+          <w:sz w:val="18"/>
+          <w:szCs w:val="18"/>
+        </w:rPr>
+        <w:t xml:space="preserve">This is the standard 'fat model, thin view' pattern - query logic lives at the data layer where it is testable.</w:t>
+      </w:r>
+    </w:p>
+    <w:p>
+      <w:pPr>
+        <w:ind w:left="260" w:hanging="0"/>
+        <w:spacing w:before="0" w:after="15" w:line="230" w:lineRule="auto"/>
+        <w:shd w:val="clear" w:color="auto" w:fill="F2F2F2"/>
+      </w:pPr>
+      <w:r>
+        <w:rPr>
+          <w:b/>
+          <w:sz w:val="17"/>
+          <w:szCs w:val="17"/>
+        </w:rPr>
+        <w:t xml:space="preserve">Example:  </w:t>
+      </w:r>
+      <w:r>
+        <w:rPr>
+          <w:rFonts w:ascii="Consolas" w:hAnsi="Consolas" w:cs="Consolas"/>
+          <w:color w:val="3B3B3B"/>
+          <w:sz w:val="17"/>
+          <w:szCs w:val="17"/>
+        </w:rPr>
+        <w:t xml:space="preserve">class OrderQuerySet(models.QuerySet):</w:t>
+      </w:r>
+    </w:p>
+    <w:p>
+      <w:pPr>
+        <w:ind w:left="260" w:hanging="0"/>
+        <w:spacing w:before="0" w:after="15" w:line="230" w:lineRule="auto"/>
+        <w:shd w:val="clear" w:color="auto" w:fill="F2F2F2"/>
+      </w:pPr>
+      <w:r>
+        <w:rPr>
+          <w:rFonts w:ascii="Consolas" w:hAnsi="Consolas" w:cs="Consolas"/>
+          <w:color w:val="3B3B3B"/>
+          <w:sz w:val="17"/>
+          <w:szCs w:val="17"/>
+        </w:rPr>
+        <w:t xml:space="preserve">    def paid(self):</w:t>
+      </w:r>
+    </w:p>
+    <w:p>
+      <w:pPr>
+        <w:ind w:left="260" w:hanging="0"/>
+        <w:spacing w:before="0" w:after="15" w:line="230" w:lineRule="auto"/>
+        <w:shd w:val="clear" w:color="auto" w:fill="F2F2F2"/>
+      </w:pPr>
+      <w:r>
+        <w:rPr>
+          <w:rFonts w:ascii="Consolas" w:hAnsi="Consolas" w:cs="Consolas"/>
+          <w:color w:val="3B3B3B"/>
+          <w:sz w:val="17"/>
+          <w:szCs w:val="17"/>
+        </w:rPr>
+        <w:t xml:space="preserve">        return self.filter(status="paid")</w:t>
+      </w:r>
+    </w:p>
+    <w:p>
+      <w:pPr>
+        <w:ind w:left="260" w:hanging="0"/>
+        <w:spacing w:before="0" w:after="15" w:line="230" w:lineRule="auto"/>
+        <w:shd w:val="clear" w:color="auto" w:fill="F2F2F2"/>
+      </w:pPr>
+      <w:r>
+        <w:rPr>
+          <w:rFonts w:ascii="Consolas" w:hAnsi="Consolas" w:cs="Consolas"/>
+          <w:color w:val="3B3B3B"/>
+          <w:sz w:val="17"/>
+          <w:szCs w:val="17"/>
+        </w:rPr>
+        <w:t xml:space="preserve">    def recent(self):</w:t>
+      </w:r>
+    </w:p>
+    <w:p>
+      <w:pPr>
+        <w:ind w:left="260" w:hanging="0"/>
+        <w:spacing w:before="0" w:after="15" w:line="230" w:lineRule="auto"/>
+        <w:shd w:val="clear" w:color="auto" w:fill="F2F2F2"/>
+      </w:pPr>
+      <w:r>
+        <w:rPr>
+          <w:rFonts w:ascii="Consolas" w:hAnsi="Consolas" w:cs="Consolas"/>
+          <w:color w:val="3B3B3B"/>
+          <w:sz w:val="17"/>
+          <w:szCs w:val="17"/>
+        </w:rPr>
+        <w:t xml:space="preserve">        return self.order_by("-created")[:50]</w:t>
+      </w:r>
+    </w:p>
+    <w:p>
+      <w:pPr>
+        <w:ind w:left="260" w:hanging="0"/>
+        <w:spacing w:before="0" w:after="15" w:line="230" w:lineRule="auto"/>
+        <w:shd w:val="clear" w:color="auto" w:fill="F2F2F2"/>
+      </w:pPr>
+      <w:r>
+        <w:rPr>
+          <w:rFonts w:ascii="Consolas" w:hAnsi="Consolas" w:cs="Consolas"/>
+          <w:color w:val="3B3B3B"/>
+          <w:sz w:val="17"/>
+          <w:szCs w:val="17"/>
+        </w:rPr>
+        <w:t xml:space="preserve">class Order(models.Model):</w:t>
+      </w:r>
+    </w:p>
+    <w:p>
+      <w:pPr>
+        <w:ind w:left="260" w:hanging="0"/>
+        <w:spacing w:before="0" w:after="15" w:line="230" w:lineRule="auto"/>
+        <w:shd w:val="clear" w:color="auto" w:fill="F2F2F2"/>
+      </w:pPr>
+      <w:r>
+        <w:rPr>
+          <w:rFonts w:ascii="Consolas" w:hAnsi="Consolas" w:cs="Consolas"/>
+          <w:color w:val="3B3B3B"/>
+          <w:sz w:val="17"/>
+          <w:szCs w:val="17"/>
+        </w:rPr>
+        <w:t xml:space="preserve">    objects = OrderQuerySet.as_manager()</w:t>
+      </w:r>
+    </w:p>
+    <w:p>
+      <w:pPr>
+        <w:ind w:left="260" w:hanging="0"/>
+        <w:spacing w:before="0" w:after="15" w:line="230" w:lineRule="auto"/>
+        <w:shd w:val="clear" w:color="auto" w:fill="F2F2F2"/>
+      </w:pPr>
+      <w:r>
+        <w:rPr>
+          <w:rFonts w:ascii="Consolas" w:hAnsi="Consolas" w:cs="Consolas"/>
+          <w:color w:val="3B3B3B"/>
+          <w:sz w:val="17"/>
+          <w:szCs w:val="17"/>
+        </w:rPr>
+        <w:t xml:space="preserve"># Order.objects.paid().recent()</w:t>
+      </w:r>
+    </w:p>
+    <w:p>
+      <w:pPr>
+        <w:ind w:left="120" w:hanging="0"/>
+        <w:spacing w:before="50" w:after="110" w:line="230" w:lineRule="auto"/>
+        <w:pBdr>
+          <w:left w:val="single" w:sz="12" w:space="4" w:color="2E5E1F"/>
+        </w:pBdr>
+      </w:pPr>
+      <w:r>
+        <w:rPr>
+          <w:b/>
+          <w:color w:val="2E5E1F"/>
+          <w:sz w:val="18"/>
+          <w:szCs w:val="18"/>
+        </w:rPr>
+        <w:t xml:space="preserve">Interview answer:  </w:t>
+      </w:r>
+      <w:r>
+        <w:rPr>
+          <w:i/>
+          <w:sz w:val="18"/>
+          <w:szCs w:val="18"/>
+        </w:rPr>
+        <w:t xml:space="preserve">I put reusable filters on a custom QuerySet and expose it via as_manager, so queries read like business language and stay chainable - Order.objects.paid().recent(). I avoid default managers that silently hide rows (soft-delete traps admin and shell); explicit methods are safer, and the first manager declared is the default the admin uses.</w:t>
       </w:r>
     </w:p>
     <w:sectPr>

</xml_diff>

<commit_message>
Django Phase 3: Middleware, Auth, Signals, Caching (6 topics, 3-YOE depth)
Middleware chain/order, signals + bulk gotcha, custom user model,
permissions/groups, CSRF/XSS/injection defenses, caching + invalidation

Co-Authored-By: Claude Fable 5 <noreply@anthropic.com>
Claude-Session: https://claude.ai/code/session_01Vm8nqoCZNTvUn3BNmW1Tgz
</commit_message>
<xml_diff>
--- a/Django_Interview_Theory.docx
+++ b/Django_Interview_Theory.docx
@@ -4199,6 +4199,1878 @@
           <w:szCs w:val="18"/>
         </w:rPr>
         <w:t xml:space="preserve">I put reusable filters on a custom QuerySet and expose it via as_manager, so queries read like business language and stay chainable - Order.objects.paid().recent(). I avoid default managers that silently hide rows (soft-delete traps admin and shell); explicit methods are safer, and the first manager declared is the default the admin uses.</w:t>
+      </w:r>
+    </w:p>
+    <w:p>
+      <w:pPr>
+        <w:spacing w:before="200" w:after="60" w:line="230" w:lineRule="auto"/>
+      </w:pPr>
+      <w:r>
+        <w:rPr>
+          <w:b/>
+          <w:color w:val="1F4E79"/>
+          <w:sz w:val="26"/>
+          <w:szCs w:val="26"/>
+        </w:rPr>
+        <w:t xml:space="preserve">Django Phase 3 - Middleware, Auth, Signals, Caching</w:t>
+      </w:r>
+    </w:p>
+    <w:p>
+      <w:pPr>
+        <w:spacing w:before="140" w:after="40" w:line="230" w:lineRule="auto"/>
+      </w:pPr>
+      <w:r>
+        <w:rPr>
+          <w:b/>
+          <w:sz w:val="21"/>
+          <w:szCs w:val="21"/>
+        </w:rPr>
+        <w:t xml:space="preserve">D3.1  Middleware</w:t>
+      </w:r>
+    </w:p>
+    <w:p>
+      <w:pPr>
+        <w:spacing w:before="0" w:after="40" w:line="230" w:lineRule="auto"/>
+      </w:pPr>
+      <w:r>
+        <w:rPr>
+          <w:b/>
+          <w:sz w:val="18"/>
+          <w:szCs w:val="18"/>
+        </w:rPr>
+        <w:t xml:space="preserve">What it is:  </w:t>
+      </w:r>
+      <w:r>
+        <w:rPr>
+          <w:sz w:val="18"/>
+          <w:szCs w:val="18"/>
+        </w:rPr>
+        <w:t xml:space="preserve">Middleware is a chain of hooks that every request passes through before the view and every response passes through after it.</w:t>
+      </w:r>
+    </w:p>
+    <w:p>
+      <w:pPr>
+        <w:ind w:left="260" w:hanging="200"/>
+        <w:spacing w:before="0" w:after="25" w:line="230" w:lineRule="auto"/>
+      </w:pPr>
+      <w:r>
+        <w:rPr>
+          <w:sz w:val="18"/>
+          <w:szCs w:val="18"/>
+        </w:rPr>
+        <w:t xml:space="preserve">•   </w:t>
+      </w:r>
+      <w:r>
+        <w:rPr>
+          <w:sz w:val="18"/>
+          <w:szCs w:val="18"/>
+        </w:rPr>
+        <w:t xml:space="preserve">Listed in settings MIDDLEWARE - request runs the list top-down, response bottom-up. Order is functional, not cosmetic.</w:t>
+      </w:r>
+    </w:p>
+    <w:p>
+      <w:pPr>
+        <w:ind w:left="260" w:hanging="200"/>
+        <w:spacing w:before="0" w:after="25" w:line="230" w:lineRule="auto"/>
+      </w:pPr>
+      <w:r>
+        <w:rPr>
+          <w:sz w:val="18"/>
+          <w:szCs w:val="18"/>
+        </w:rPr>
+        <w:t xml:space="preserve">•   </w:t>
+      </w:r>
+      <w:r>
+        <w:rPr>
+          <w:sz w:val="18"/>
+          <w:szCs w:val="18"/>
+        </w:rPr>
+        <w:t xml:space="preserve">Built-ins do real work: SecurityMiddleware (HTTPS headers), SessionMiddleware, AuthenticationMiddleware (attaches request.user), CsrfViewMiddleware.</w:t>
+      </w:r>
+    </w:p>
+    <w:p>
+      <w:pPr>
+        <w:ind w:left="260" w:hanging="200"/>
+        <w:spacing w:before="0" w:after="25" w:line="230" w:lineRule="auto"/>
+      </w:pPr>
+      <w:r>
+        <w:rPr>
+          <w:sz w:val="18"/>
+          <w:szCs w:val="18"/>
+        </w:rPr>
+        <w:t xml:space="preserve">•   </w:t>
+      </w:r>
+      <w:r>
+        <w:rPr>
+          <w:sz w:val="18"/>
+          <w:szCs w:val="18"/>
+        </w:rPr>
+        <w:t xml:space="preserve">Auth must come after sessions - it reads the session to find the user. Wrong order = broken auth.</w:t>
+      </w:r>
+    </w:p>
+    <w:p>
+      <w:pPr>
+        <w:ind w:left="260" w:hanging="200"/>
+        <w:spacing w:before="0" w:after="25" w:line="230" w:lineRule="auto"/>
+      </w:pPr>
+      <w:r>
+        <w:rPr>
+          <w:sz w:val="18"/>
+          <w:szCs w:val="18"/>
+        </w:rPr>
+        <w:t xml:space="preserve">•   </w:t>
+      </w:r>
+      <w:r>
+        <w:rPr>
+          <w:sz w:val="18"/>
+          <w:szCs w:val="18"/>
+        </w:rPr>
+        <w:t xml:space="preserve">Custom middleware: a callable taking get_response; code before the call sees the request, after it sees the response.</w:t>
+      </w:r>
+    </w:p>
+    <w:p>
+      <w:pPr>
+        <w:ind w:left="260" w:hanging="200"/>
+        <w:spacing w:before="0" w:after="25" w:line="230" w:lineRule="auto"/>
+      </w:pPr>
+      <w:r>
+        <w:rPr>
+          <w:sz w:val="18"/>
+          <w:szCs w:val="18"/>
+        </w:rPr>
+        <w:t xml:space="preserve">•   </w:t>
+      </w:r>
+      <w:r>
+        <w:rPr>
+          <w:sz w:val="18"/>
+          <w:szCs w:val="18"/>
+        </w:rPr>
+        <w:t xml:space="preserve">A middleware can short-circuit: return a response early (rate limiting, maintenance mode) and the view never runs.</w:t>
+      </w:r>
+    </w:p>
+    <w:p>
+      <w:pPr>
+        <w:ind w:left="260" w:hanging="200"/>
+        <w:spacing w:before="0" w:after="25" w:line="230" w:lineRule="auto"/>
+      </w:pPr>
+      <w:r>
+        <w:rPr>
+          <w:sz w:val="18"/>
+          <w:szCs w:val="18"/>
+        </w:rPr>
+        <w:t xml:space="preserve">•   </w:t>
+      </w:r>
+      <w:r>
+        <w:rPr>
+          <w:sz w:val="18"/>
+          <w:szCs w:val="18"/>
+        </w:rPr>
+        <w:t xml:space="preserve">Extra hooks: process_view, process_exception, process_template_response.</w:t>
+      </w:r>
+    </w:p>
+    <w:p>
+      <w:pPr>
+        <w:ind w:left="260" w:hanging="200"/>
+        <w:spacing w:before="0" w:after="25" w:line="230" w:lineRule="auto"/>
+      </w:pPr>
+      <w:r>
+        <w:rPr>
+          <w:sz w:val="18"/>
+          <w:szCs w:val="18"/>
+        </w:rPr>
+        <w:t xml:space="preserve">•   </w:t>
+      </w:r>
+      <w:r>
+        <w:rPr>
+          <w:sz w:val="18"/>
+          <w:szCs w:val="18"/>
+        </w:rPr>
+        <w:t xml:space="preserve">Use for true cross-cutting concerns (logging, tenant resolution, timing); per-endpoint logic belongs in decorators or DRF permissions instead.</w:t>
+      </w:r>
+    </w:p>
+    <w:p>
+      <w:pPr>
+        <w:ind w:left="260" w:hanging="0"/>
+        <w:spacing w:before="0" w:after="15" w:line="230" w:lineRule="auto"/>
+        <w:shd w:val="clear" w:color="auto" w:fill="F2F2F2"/>
+      </w:pPr>
+      <w:r>
+        <w:rPr>
+          <w:b/>
+          <w:sz w:val="17"/>
+          <w:szCs w:val="17"/>
+        </w:rPr>
+        <w:t xml:space="preserve">Example:  </w:t>
+      </w:r>
+      <w:r>
+        <w:rPr>
+          <w:rFonts w:ascii="Consolas" w:hAnsi="Consolas" w:cs="Consolas"/>
+          <w:color w:val="3B3B3B"/>
+          <w:sz w:val="17"/>
+          <w:szCs w:val="17"/>
+        </w:rPr>
+        <w:t xml:space="preserve">class TimingMiddleware:</w:t>
+      </w:r>
+    </w:p>
+    <w:p>
+      <w:pPr>
+        <w:ind w:left="260" w:hanging="0"/>
+        <w:spacing w:before="0" w:after="15" w:line="230" w:lineRule="auto"/>
+        <w:shd w:val="clear" w:color="auto" w:fill="F2F2F2"/>
+      </w:pPr>
+      <w:r>
+        <w:rPr>
+          <w:rFonts w:ascii="Consolas" w:hAnsi="Consolas" w:cs="Consolas"/>
+          <w:color w:val="3B3B3B"/>
+          <w:sz w:val="17"/>
+          <w:szCs w:val="17"/>
+        </w:rPr>
+        <w:t xml:space="preserve">    def __init__(self, get_response):</w:t>
+      </w:r>
+    </w:p>
+    <w:p>
+      <w:pPr>
+        <w:ind w:left="260" w:hanging="0"/>
+        <w:spacing w:before="0" w:after="15" w:line="230" w:lineRule="auto"/>
+        <w:shd w:val="clear" w:color="auto" w:fill="F2F2F2"/>
+      </w:pPr>
+      <w:r>
+        <w:rPr>
+          <w:rFonts w:ascii="Consolas" w:hAnsi="Consolas" w:cs="Consolas"/>
+          <w:color w:val="3B3B3B"/>
+          <w:sz w:val="17"/>
+          <w:szCs w:val="17"/>
+        </w:rPr>
+        <w:t xml:space="preserve">        self.get_response = get_response</w:t>
+      </w:r>
+    </w:p>
+    <w:p>
+      <w:pPr>
+        <w:ind w:left="260" w:hanging="0"/>
+        <w:spacing w:before="0" w:after="15" w:line="230" w:lineRule="auto"/>
+        <w:shd w:val="clear" w:color="auto" w:fill="F2F2F2"/>
+      </w:pPr>
+      <w:r>
+        <w:rPr>
+          <w:rFonts w:ascii="Consolas" w:hAnsi="Consolas" w:cs="Consolas"/>
+          <w:color w:val="3B3B3B"/>
+          <w:sz w:val="17"/>
+          <w:szCs w:val="17"/>
+        </w:rPr>
+        <w:t xml:space="preserve">    def __call__(self, request):</w:t>
+      </w:r>
+    </w:p>
+    <w:p>
+      <w:pPr>
+        <w:ind w:left="260" w:hanging="0"/>
+        <w:spacing w:before="0" w:after="15" w:line="230" w:lineRule="auto"/>
+        <w:shd w:val="clear" w:color="auto" w:fill="F2F2F2"/>
+      </w:pPr>
+      <w:r>
+        <w:rPr>
+          <w:rFonts w:ascii="Consolas" w:hAnsi="Consolas" w:cs="Consolas"/>
+          <w:color w:val="3B3B3B"/>
+          <w:sz w:val="17"/>
+          <w:szCs w:val="17"/>
+        </w:rPr>
+        <w:t xml:space="preserve">        t0 = time.time()</w:t>
+      </w:r>
+    </w:p>
+    <w:p>
+      <w:pPr>
+        <w:ind w:left="260" w:hanging="0"/>
+        <w:spacing w:before="0" w:after="15" w:line="230" w:lineRule="auto"/>
+        <w:shd w:val="clear" w:color="auto" w:fill="F2F2F2"/>
+      </w:pPr>
+      <w:r>
+        <w:rPr>
+          <w:rFonts w:ascii="Consolas" w:hAnsi="Consolas" w:cs="Consolas"/>
+          <w:color w:val="3B3B3B"/>
+          <w:sz w:val="17"/>
+          <w:szCs w:val="17"/>
+        </w:rPr>
+        <w:t xml:space="preserve">        response = self.get_response(request)</w:t>
+      </w:r>
+    </w:p>
+    <w:p>
+      <w:pPr>
+        <w:ind w:left="260" w:hanging="0"/>
+        <w:spacing w:before="0" w:after="15" w:line="230" w:lineRule="auto"/>
+        <w:shd w:val="clear" w:color="auto" w:fill="F2F2F2"/>
+      </w:pPr>
+      <w:r>
+        <w:rPr>
+          <w:rFonts w:ascii="Consolas" w:hAnsi="Consolas" w:cs="Consolas"/>
+          <w:color w:val="3B3B3B"/>
+          <w:sz w:val="17"/>
+          <w:szCs w:val="17"/>
+        </w:rPr>
+        <w:t xml:space="preserve">        response["X-Time-ms"] = str(</w:t>
+      </w:r>
+    </w:p>
+    <w:p>
+      <w:pPr>
+        <w:ind w:left="260" w:hanging="0"/>
+        <w:spacing w:before="0" w:after="15" w:line="230" w:lineRule="auto"/>
+        <w:shd w:val="clear" w:color="auto" w:fill="F2F2F2"/>
+      </w:pPr>
+      <w:r>
+        <w:rPr>
+          <w:rFonts w:ascii="Consolas" w:hAnsi="Consolas" w:cs="Consolas"/>
+          <w:color w:val="3B3B3B"/>
+          <w:sz w:val="17"/>
+          <w:szCs w:val="17"/>
+        </w:rPr>
+        <w:t xml:space="preserve">            int((time.time()-t0)*1000))</w:t>
+      </w:r>
+    </w:p>
+    <w:p>
+      <w:pPr>
+        <w:ind w:left="260" w:hanging="0"/>
+        <w:spacing w:before="0" w:after="15" w:line="230" w:lineRule="auto"/>
+        <w:shd w:val="clear" w:color="auto" w:fill="F2F2F2"/>
+      </w:pPr>
+      <w:r>
+        <w:rPr>
+          <w:rFonts w:ascii="Consolas" w:hAnsi="Consolas" w:cs="Consolas"/>
+          <w:color w:val="3B3B3B"/>
+          <w:sz w:val="17"/>
+          <w:szCs w:val="17"/>
+        </w:rPr>
+        <w:t xml:space="preserve">        return response</w:t>
+      </w:r>
+    </w:p>
+    <w:p>
+      <w:pPr>
+        <w:ind w:left="120" w:hanging="0"/>
+        <w:spacing w:before="50" w:after="110" w:line="230" w:lineRule="auto"/>
+        <w:pBdr>
+          <w:left w:val="single" w:sz="12" w:space="4" w:color="2E5E1F"/>
+        </w:pBdr>
+      </w:pPr>
+      <w:r>
+        <w:rPr>
+          <w:b/>
+          <w:color w:val="2E5E1F"/>
+          <w:sz w:val="18"/>
+          <w:szCs w:val="18"/>
+        </w:rPr>
+        <w:t xml:space="preserve">Interview answer:  </w:t>
+      </w:r>
+      <w:r>
+        <w:rPr>
+          <w:i/>
+          <w:sz w:val="18"/>
+          <w:szCs w:val="18"/>
+        </w:rPr>
+        <w:t xml:space="preserve">Middleware wraps every request/response: the list runs top-down on the way in, bottom-up on the way out, and order matters - auth needs sessions before it. I write one as a callable around get_response for cross-cutting concerns like timing or tenant detection, and it can short-circuit requests before any view runs.</w:t>
+      </w:r>
+    </w:p>
+    <w:p>
+      <w:pPr>
+        <w:spacing w:before="140" w:after="40" w:line="230" w:lineRule="auto"/>
+      </w:pPr>
+      <w:r>
+        <w:rPr>
+          <w:b/>
+          <w:sz w:val="21"/>
+          <w:szCs w:val="21"/>
+        </w:rPr>
+        <w:t xml:space="preserve">D3.2  Signals</w:t>
+      </w:r>
+    </w:p>
+    <w:p>
+      <w:pPr>
+        <w:spacing w:before="0" w:after="40" w:line="230" w:lineRule="auto"/>
+      </w:pPr>
+      <w:r>
+        <w:rPr>
+          <w:b/>
+          <w:sz w:val="18"/>
+          <w:szCs w:val="18"/>
+        </w:rPr>
+        <w:t xml:space="preserve">What it is:  </w:t>
+      </w:r>
+      <w:r>
+        <w:rPr>
+          <w:sz w:val="18"/>
+          <w:szCs w:val="18"/>
+        </w:rPr>
+        <w:t xml:space="preserve">Signals let code react to events elsewhere - post_save, pre_delete - decoupling the sender from the receivers.</w:t>
+      </w:r>
+    </w:p>
+    <w:p>
+      <w:pPr>
+        <w:ind w:left="260" w:hanging="200"/>
+        <w:spacing w:before="0" w:after="25" w:line="230" w:lineRule="auto"/>
+      </w:pPr>
+      <w:r>
+        <w:rPr>
+          <w:sz w:val="18"/>
+          <w:szCs w:val="18"/>
+        </w:rPr>
+        <w:t xml:space="preserve">•   </w:t>
+      </w:r>
+      <w:r>
+        <w:rPr>
+          <w:sz w:val="18"/>
+          <w:szCs w:val="18"/>
+        </w:rPr>
+        <w:t xml:space="preserve">Common ones: pre_save/post_save, pre_delete/post_delete, m2m_changed, request_started/finished.</w:t>
+      </w:r>
+    </w:p>
+    <w:p>
+      <w:pPr>
+        <w:ind w:left="260" w:hanging="200"/>
+        <w:spacing w:before="0" w:after="25" w:line="230" w:lineRule="auto"/>
+      </w:pPr>
+      <w:r>
+        <w:rPr>
+          <w:sz w:val="18"/>
+          <w:szCs w:val="18"/>
+        </w:rPr>
+        <w:t xml:space="preserve">•   </w:t>
+      </w:r>
+      <w:r>
+        <w:rPr>
+          <w:sz w:val="18"/>
+          <w:szCs w:val="18"/>
+        </w:rPr>
+        <w:t xml:space="preserve">Receiver: @receiver(post_save, sender=User) def make_profile(sender, instance, created, **kw) - the created flag separates insert from update.</w:t>
+      </w:r>
+    </w:p>
+    <w:p>
+      <w:pPr>
+        <w:ind w:left="260" w:hanging="200"/>
+        <w:spacing w:before="0" w:after="25" w:line="230" w:lineRule="auto"/>
+      </w:pPr>
+      <w:r>
+        <w:rPr>
+          <w:sz w:val="18"/>
+          <w:szCs w:val="18"/>
+        </w:rPr>
+        <w:t xml:space="preserve">•   </w:t>
+      </w:r>
+      <w:r>
+        <w:rPr>
+          <w:sz w:val="18"/>
+          <w:szCs w:val="18"/>
+        </w:rPr>
+        <w:t xml:space="preserve">Registered in apps.py ready() (import the signals module there) so receivers actually load.</w:t>
+      </w:r>
+    </w:p>
+    <w:p>
+      <w:pPr>
+        <w:ind w:left="260" w:hanging="200"/>
+        <w:spacing w:before="0" w:after="25" w:line="230" w:lineRule="auto"/>
+      </w:pPr>
+      <w:r>
+        <w:rPr>
+          <w:sz w:val="18"/>
+          <w:szCs w:val="18"/>
+        </w:rPr>
+        <w:t xml:space="preserve">•   </w:t>
+      </w:r>
+      <w:r>
+        <w:rPr>
+          <w:sz w:val="18"/>
+          <w:szCs w:val="18"/>
+        </w:rPr>
+        <w:t xml:space="preserve">Right uses: reacting to models our code does not own (e.g. building a profile on User creation from a third-party auth flow).</w:t>
+      </w:r>
+    </w:p>
+    <w:p>
+      <w:pPr>
+        <w:ind w:left="260" w:hanging="200"/>
+        <w:spacing w:before="0" w:after="25" w:line="230" w:lineRule="auto"/>
+      </w:pPr>
+      <w:r>
+        <w:rPr>
+          <w:sz w:val="18"/>
+          <w:szCs w:val="18"/>
+        </w:rPr>
+        <w:t xml:space="preserve">•   </w:t>
+      </w:r>
+      <w:r>
+        <w:rPr>
+          <w:sz w:val="18"/>
+          <w:szCs w:val="18"/>
+        </w:rPr>
+        <w:t xml:space="preserve">Why to be careful: invisible control flow - a save triggers hidden work; debugging "who changed this?" gets painful; receivers run synchronously inside the same transaction/request.</w:t>
+      </w:r>
+    </w:p>
+    <w:p>
+      <w:pPr>
+        <w:ind w:left="260" w:hanging="200"/>
+        <w:spacing w:before="0" w:after="25" w:line="230" w:lineRule="auto"/>
+      </w:pPr>
+      <w:r>
+        <w:rPr>
+          <w:sz w:val="18"/>
+          <w:szCs w:val="18"/>
+        </w:rPr>
+        <w:t xml:space="preserve">•   </w:t>
+      </w:r>
+      <w:r>
+        <w:rPr>
+          <w:sz w:val="18"/>
+          <w:szCs w:val="18"/>
+        </w:rPr>
+        <w:t xml:space="preserve">Big gotcha: bulk operations (bulk_create, queryset.update()) do NOT fire per-object signals - logic in signals silently skips bulk paths.</w:t>
+      </w:r>
+    </w:p>
+    <w:p>
+      <w:pPr>
+        <w:ind w:left="260" w:hanging="200"/>
+        <w:spacing w:before="0" w:after="25" w:line="230" w:lineRule="auto"/>
+      </w:pPr>
+      <w:r>
+        <w:rPr>
+          <w:sz w:val="18"/>
+          <w:szCs w:val="18"/>
+        </w:rPr>
+        <w:t xml:space="preserve">•   </w:t>
+      </w:r>
+      <w:r>
+        <w:rPr>
+          <w:sz w:val="18"/>
+          <w:szCs w:val="18"/>
+        </w:rPr>
+        <w:t xml:space="preserve">Team rule of thumb: prefer explicit service functions or overridden save(); keep signals for genuine decoupling.</w:t>
+      </w:r>
+    </w:p>
+    <w:p>
+      <w:pPr>
+        <w:ind w:left="260" w:hanging="0"/>
+        <w:spacing w:before="0" w:after="15" w:line="230" w:lineRule="auto"/>
+        <w:shd w:val="clear" w:color="auto" w:fill="F2F2F2"/>
+      </w:pPr>
+      <w:r>
+        <w:rPr>
+          <w:b/>
+          <w:sz w:val="17"/>
+          <w:szCs w:val="17"/>
+        </w:rPr>
+        <w:t xml:space="preserve">Example:  </w:t>
+      </w:r>
+      <w:r>
+        <w:rPr>
+          <w:rFonts w:ascii="Consolas" w:hAnsi="Consolas" w:cs="Consolas"/>
+          <w:color w:val="3B3B3B"/>
+          <w:sz w:val="17"/>
+          <w:szCs w:val="17"/>
+        </w:rPr>
+        <w:t xml:space="preserve">@receiver(post_save, sender=User)</w:t>
+      </w:r>
+    </w:p>
+    <w:p>
+      <w:pPr>
+        <w:ind w:left="260" w:hanging="0"/>
+        <w:spacing w:before="0" w:after="15" w:line="230" w:lineRule="auto"/>
+        <w:shd w:val="clear" w:color="auto" w:fill="F2F2F2"/>
+      </w:pPr>
+      <w:r>
+        <w:rPr>
+          <w:rFonts w:ascii="Consolas" w:hAnsi="Consolas" w:cs="Consolas"/>
+          <w:color w:val="3B3B3B"/>
+          <w:sz w:val="17"/>
+          <w:szCs w:val="17"/>
+        </w:rPr>
+        <w:t xml:space="preserve">def create_profile(sender, instance,</w:t>
+      </w:r>
+    </w:p>
+    <w:p>
+      <w:pPr>
+        <w:ind w:left="260" w:hanging="0"/>
+        <w:spacing w:before="0" w:after="15" w:line="230" w:lineRule="auto"/>
+        <w:shd w:val="clear" w:color="auto" w:fill="F2F2F2"/>
+      </w:pPr>
+      <w:r>
+        <w:rPr>
+          <w:rFonts w:ascii="Consolas" w:hAnsi="Consolas" w:cs="Consolas"/>
+          <w:color w:val="3B3B3B"/>
+          <w:sz w:val="17"/>
+          <w:szCs w:val="17"/>
+        </w:rPr>
+        <w:t xml:space="preserve">                   created, **kwargs):</w:t>
+      </w:r>
+    </w:p>
+    <w:p>
+      <w:pPr>
+        <w:ind w:left="260" w:hanging="0"/>
+        <w:spacing w:before="0" w:after="15" w:line="230" w:lineRule="auto"/>
+        <w:shd w:val="clear" w:color="auto" w:fill="F2F2F2"/>
+      </w:pPr>
+      <w:r>
+        <w:rPr>
+          <w:rFonts w:ascii="Consolas" w:hAnsi="Consolas" w:cs="Consolas"/>
+          <w:color w:val="3B3B3B"/>
+          <w:sz w:val="17"/>
+          <w:szCs w:val="17"/>
+        </w:rPr>
+        <w:t xml:space="preserve">    if created:</w:t>
+      </w:r>
+    </w:p>
+    <w:p>
+      <w:pPr>
+        <w:ind w:left="260" w:hanging="0"/>
+        <w:spacing w:before="0" w:after="15" w:line="230" w:lineRule="auto"/>
+        <w:shd w:val="clear" w:color="auto" w:fill="F2F2F2"/>
+      </w:pPr>
+      <w:r>
+        <w:rPr>
+          <w:rFonts w:ascii="Consolas" w:hAnsi="Consolas" w:cs="Consolas"/>
+          <w:color w:val="3B3B3B"/>
+          <w:sz w:val="17"/>
+          <w:szCs w:val="17"/>
+        </w:rPr>
+        <w:t xml:space="preserve">        Profile.objects.create(user=instance)</w:t>
+      </w:r>
+    </w:p>
+    <w:p>
+      <w:pPr>
+        <w:ind w:left="120" w:hanging="0"/>
+        <w:spacing w:before="50" w:after="110" w:line="230" w:lineRule="auto"/>
+        <w:pBdr>
+          <w:left w:val="single" w:sz="12" w:space="4" w:color="2E5E1F"/>
+        </w:pBdr>
+      </w:pPr>
+      <w:r>
+        <w:rPr>
+          <w:b/>
+          <w:color w:val="2E5E1F"/>
+          <w:sz w:val="18"/>
+          <w:szCs w:val="18"/>
+        </w:rPr>
+        <w:t xml:space="preserve">Interview answer:  </w:t>
+      </w:r>
+      <w:r>
+        <w:rPr>
+          <w:i/>
+          <w:sz w:val="18"/>
+          <w:szCs w:val="18"/>
+        </w:rPr>
+        <w:t xml:space="preserve">Signals are event hooks - post_save, pre_delete - that decouple reactions from the code doing the save. I register receivers in apps.ready() and use the created flag. But they hide control flow, run synchronously, and bulk operations never fire them - so I prefer explicit service-layer calls and keep signals only where real decoupling is needed.</w:t>
+      </w:r>
+    </w:p>
+    <w:p>
+      <w:pPr>
+        <w:spacing w:before="140" w:after="40" w:line="230" w:lineRule="auto"/>
+      </w:pPr>
+      <w:r>
+        <w:rPr>
+          <w:b/>
+          <w:sz w:val="21"/>
+          <w:szCs w:val="21"/>
+        </w:rPr>
+        <w:t xml:space="preserve">D3.3  Authentication - Sessions and Custom User Model</w:t>
+      </w:r>
+    </w:p>
+    <w:p>
+      <w:pPr>
+        <w:spacing w:before="0" w:after="40" w:line="230" w:lineRule="auto"/>
+      </w:pPr>
+      <w:r>
+        <w:rPr>
+          <w:b/>
+          <w:sz w:val="18"/>
+          <w:szCs w:val="18"/>
+        </w:rPr>
+        <w:t xml:space="preserve">What it is:  </w:t>
+      </w:r>
+      <w:r>
+        <w:rPr>
+          <w:sz w:val="18"/>
+          <w:szCs w:val="18"/>
+        </w:rPr>
+        <w:t xml:space="preserve">Django ships a full auth system - hashed passwords, login sessions, and a User model that projects should replace with a custom one on day one.</w:t>
+      </w:r>
+    </w:p>
+    <w:p>
+      <w:pPr>
+        <w:ind w:left="260" w:hanging="200"/>
+        <w:spacing w:before="0" w:after="25" w:line="230" w:lineRule="auto"/>
+      </w:pPr>
+      <w:r>
+        <w:rPr>
+          <w:sz w:val="18"/>
+          <w:szCs w:val="18"/>
+        </w:rPr>
+        <w:t xml:space="preserve">•   </w:t>
+      </w:r>
+      <w:r>
+        <w:rPr>
+          <w:sz w:val="18"/>
+          <w:szCs w:val="18"/>
+        </w:rPr>
+        <w:t xml:space="preserve">Session flow: authenticate() checks credentials, login() stores the user id in the session, the session key rides in a cookie; AuthenticationMiddleware rebuilds request.user each request.</w:t>
+      </w:r>
+    </w:p>
+    <w:p>
+      <w:pPr>
+        <w:ind w:left="260" w:hanging="200"/>
+        <w:spacing w:before="0" w:after="25" w:line="230" w:lineRule="auto"/>
+      </w:pPr>
+      <w:r>
+        <w:rPr>
+          <w:sz w:val="18"/>
+          <w:szCs w:val="18"/>
+        </w:rPr>
+        <w:t xml:space="preserve">•   </w:t>
+      </w:r>
+      <w:r>
+        <w:rPr>
+          <w:sz w:val="18"/>
+          <w:szCs w:val="18"/>
+        </w:rPr>
+        <w:t xml:space="preserve">Passwords are salted and hashed (PBKDF2 default; argon2 available) - never stored or logged raw.</w:t>
+      </w:r>
+    </w:p>
+    <w:p>
+      <w:pPr>
+        <w:ind w:left="260" w:hanging="200"/>
+        <w:spacing w:before="0" w:after="25" w:line="230" w:lineRule="auto"/>
+      </w:pPr>
+      <w:r>
+        <w:rPr>
+          <w:sz w:val="18"/>
+          <w:szCs w:val="18"/>
+        </w:rPr>
+        <w:t xml:space="preserve">•   </w:t>
+      </w:r>
+      <w:r>
+        <w:rPr>
+          <w:sz w:val="18"/>
+          <w:szCs w:val="18"/>
+        </w:rPr>
+        <w:t xml:space="preserve">AUTH_USER_MODEL = "accounts.User" with a custom user (AbstractUser to extend, AbstractBaseUser to rebuild e.g. email login) - deciding this AFTER migrations exist is a painful migration story, so do it first.</w:t>
+      </w:r>
+    </w:p>
+    <w:p>
+      <w:pPr>
+        <w:ind w:left="260" w:hanging="200"/>
+        <w:spacing w:before="0" w:after="25" w:line="230" w:lineRule="auto"/>
+      </w:pPr>
+      <w:r>
+        <w:rPr>
+          <w:sz w:val="18"/>
+          <w:szCs w:val="18"/>
+        </w:rPr>
+        <w:t xml:space="preserve">•   </w:t>
+      </w:r>
+      <w:r>
+        <w:rPr>
+          <w:sz w:val="18"/>
+          <w:szCs w:val="18"/>
+        </w:rPr>
+        <w:t xml:space="preserve">Reference users via settings.AUTH_USER_MODEL / get_user_model(), never a direct import of User.</w:t>
+      </w:r>
+    </w:p>
+    <w:p>
+      <w:pPr>
+        <w:ind w:left="260" w:hanging="200"/>
+        <w:spacing w:before="0" w:after="25" w:line="230" w:lineRule="auto"/>
+      </w:pPr>
+      <w:r>
+        <w:rPr>
+          <w:sz w:val="18"/>
+          <w:szCs w:val="18"/>
+        </w:rPr>
+        <w:t xml:space="preserve">•   </w:t>
+      </w:r>
+      <w:r>
+        <w:rPr>
+          <w:sz w:val="18"/>
+          <w:szCs w:val="18"/>
+        </w:rPr>
+        <w:t xml:space="preserve">authenticate() runs through AUTHENTICATION_BACKENDS - adding a backend enables email login or SSO alongside.</w:t>
+      </w:r>
+    </w:p>
+    <w:p>
+      <w:pPr>
+        <w:ind w:left="260" w:hanging="200"/>
+        <w:spacing w:before="0" w:after="25" w:line="230" w:lineRule="auto"/>
+      </w:pPr>
+      <w:r>
+        <w:rPr>
+          <w:sz w:val="18"/>
+          <w:szCs w:val="18"/>
+        </w:rPr>
+        <w:t xml:space="preserve">•   </w:t>
+      </w:r>
+      <w:r>
+        <w:rPr>
+          <w:sz w:val="18"/>
+          <w:szCs w:val="18"/>
+        </w:rPr>
+        <w:t xml:space="preserve">login_required decorator / LoginRequiredMixin guard views; for APIs this shifts to DRF authentication classes (JWT etc. - Phase 4).</w:t>
+      </w:r>
+    </w:p>
+    <w:p>
+      <w:pPr>
+        <w:ind w:left="260" w:hanging="0"/>
+        <w:spacing w:before="0" w:after="15" w:line="230" w:lineRule="auto"/>
+        <w:shd w:val="clear" w:color="auto" w:fill="F2F2F2"/>
+      </w:pPr>
+      <w:r>
+        <w:rPr>
+          <w:b/>
+          <w:sz w:val="17"/>
+          <w:szCs w:val="17"/>
+        </w:rPr>
+        <w:t xml:space="preserve">Example:  </w:t>
+      </w:r>
+      <w:r>
+        <w:rPr>
+          <w:rFonts w:ascii="Consolas" w:hAnsi="Consolas" w:cs="Consolas"/>
+          <w:color w:val="3B3B3B"/>
+          <w:sz w:val="17"/>
+          <w:szCs w:val="17"/>
+        </w:rPr>
+        <w:t xml:space="preserve">class User(AbstractUser):</w:t>
+      </w:r>
+    </w:p>
+    <w:p>
+      <w:pPr>
+        <w:ind w:left="260" w:hanging="0"/>
+        <w:spacing w:before="0" w:after="15" w:line="230" w:lineRule="auto"/>
+        <w:shd w:val="clear" w:color="auto" w:fill="F2F2F2"/>
+      </w:pPr>
+      <w:r>
+        <w:rPr>
+          <w:rFonts w:ascii="Consolas" w:hAnsi="Consolas" w:cs="Consolas"/>
+          <w:color w:val="3B3B3B"/>
+          <w:sz w:val="17"/>
+          <w:szCs w:val="17"/>
+        </w:rPr>
+        <w:t xml:space="preserve">    phone = models.CharField(max_length=15,</w:t>
+      </w:r>
+    </w:p>
+    <w:p>
+      <w:pPr>
+        <w:ind w:left="260" w:hanging="0"/>
+        <w:spacing w:before="0" w:after="15" w:line="230" w:lineRule="auto"/>
+        <w:shd w:val="clear" w:color="auto" w:fill="F2F2F2"/>
+      </w:pPr>
+      <w:r>
+        <w:rPr>
+          <w:rFonts w:ascii="Consolas" w:hAnsi="Consolas" w:cs="Consolas"/>
+          <w:color w:val="3B3B3B"/>
+          <w:sz w:val="17"/>
+          <w:szCs w:val="17"/>
+        </w:rPr>
+        <w:t xml:space="preserve">                             blank=True)</w:t>
+      </w:r>
+    </w:p>
+    <w:p>
+      <w:pPr>
+        <w:ind w:left="260" w:hanging="0"/>
+        <w:spacing w:before="0" w:after="15" w:line="230" w:lineRule="auto"/>
+        <w:shd w:val="clear" w:color="auto" w:fill="F2F2F2"/>
+      </w:pPr>
+      <w:r>
+        <w:rPr>
+          <w:rFonts w:ascii="Consolas" w:hAnsi="Consolas" w:cs="Consolas"/>
+          <w:color w:val="3B3B3B"/>
+          <w:sz w:val="17"/>
+          <w:szCs w:val="17"/>
+        </w:rPr>
+        <w:t xml:space="preserve"># settings.py</w:t>
+      </w:r>
+    </w:p>
+    <w:p>
+      <w:pPr>
+        <w:ind w:left="260" w:hanging="0"/>
+        <w:spacing w:before="0" w:after="15" w:line="230" w:lineRule="auto"/>
+        <w:shd w:val="clear" w:color="auto" w:fill="F2F2F2"/>
+      </w:pPr>
+      <w:r>
+        <w:rPr>
+          <w:rFonts w:ascii="Consolas" w:hAnsi="Consolas" w:cs="Consolas"/>
+          <w:color w:val="3B3B3B"/>
+          <w:sz w:val="17"/>
+          <w:szCs w:val="17"/>
+        </w:rPr>
+        <w:t xml:space="preserve">AUTH_USER_MODEL = "accounts.User"</w:t>
+      </w:r>
+    </w:p>
+    <w:p>
+      <w:pPr>
+        <w:ind w:left="260" w:hanging="0"/>
+        <w:spacing w:before="0" w:after="15" w:line="230" w:lineRule="auto"/>
+        <w:shd w:val="clear" w:color="auto" w:fill="F2F2F2"/>
+      </w:pPr>
+      <w:r>
+        <w:rPr>
+          <w:rFonts w:ascii="Consolas" w:hAnsi="Consolas" w:cs="Consolas"/>
+          <w:color w:val="3B3B3B"/>
+          <w:sz w:val="17"/>
+          <w:szCs w:val="17"/>
+        </w:rPr>
+        <w:t xml:space="preserve"># usage</w:t>
+      </w:r>
+    </w:p>
+    <w:p>
+      <w:pPr>
+        <w:ind w:left="260" w:hanging="0"/>
+        <w:spacing w:before="0" w:after="15" w:line="230" w:lineRule="auto"/>
+        <w:shd w:val="clear" w:color="auto" w:fill="F2F2F2"/>
+      </w:pPr>
+      <w:r>
+        <w:rPr>
+          <w:rFonts w:ascii="Consolas" w:hAnsi="Consolas" w:cs="Consolas"/>
+          <w:color w:val="3B3B3B"/>
+          <w:sz w:val="17"/>
+          <w:szCs w:val="17"/>
+        </w:rPr>
+        <w:t xml:space="preserve">User = get_user_model()</w:t>
+      </w:r>
+    </w:p>
+    <w:p>
+      <w:pPr>
+        <w:ind w:left="120" w:hanging="0"/>
+        <w:spacing w:before="50" w:after="110" w:line="230" w:lineRule="auto"/>
+        <w:pBdr>
+          <w:left w:val="single" w:sz="12" w:space="4" w:color="2E5E1F"/>
+        </w:pBdr>
+      </w:pPr>
+      <w:r>
+        <w:rPr>
+          <w:b/>
+          <w:color w:val="2E5E1F"/>
+          <w:sz w:val="18"/>
+          <w:szCs w:val="18"/>
+        </w:rPr>
+        <w:t xml:space="preserve">Interview answer:  </w:t>
+      </w:r>
+      <w:r>
+        <w:rPr>
+          <w:i/>
+          <w:sz w:val="18"/>
+          <w:szCs w:val="18"/>
+        </w:rPr>
+        <w:t xml:space="preserve">Django auth handles hashed passwords, authenticate/login, and sessions - the middleware rebuilds request.user from the session cookie each request. The experienced move is a custom user model via AUTH_USER_MODEL before the first migration, referenced through get_user_model(), with extra authentication backends for email or SSO login.</w:t>
+      </w:r>
+    </w:p>
+    <w:p>
+      <w:pPr>
+        <w:spacing w:before="140" w:after="40" w:line="230" w:lineRule="auto"/>
+      </w:pPr>
+      <w:r>
+        <w:rPr>
+          <w:b/>
+          <w:sz w:val="21"/>
+          <w:szCs w:val="21"/>
+        </w:rPr>
+        <w:t xml:space="preserve">D3.4  Permissions and Groups</w:t>
+      </w:r>
+    </w:p>
+    <w:p>
+      <w:pPr>
+        <w:spacing w:before="0" w:after="40" w:line="230" w:lineRule="auto"/>
+      </w:pPr>
+      <w:r>
+        <w:rPr>
+          <w:b/>
+          <w:sz w:val="18"/>
+          <w:szCs w:val="18"/>
+        </w:rPr>
+        <w:t xml:space="preserve">What it is:  </w:t>
+      </w:r>
+      <w:r>
+        <w:rPr>
+          <w:sz w:val="18"/>
+          <w:szCs w:val="18"/>
+        </w:rPr>
+        <w:t xml:space="preserve">Django auto-creates add/change/delete/view permissions per model, lets us define custom ones, and bundles them into groups as roles.</w:t>
+      </w:r>
+    </w:p>
+    <w:p>
+      <w:pPr>
+        <w:ind w:left="260" w:hanging="200"/>
+        <w:spacing w:before="0" w:after="25" w:line="230" w:lineRule="auto"/>
+      </w:pPr>
+      <w:r>
+        <w:rPr>
+          <w:sz w:val="18"/>
+          <w:szCs w:val="18"/>
+        </w:rPr>
+        <w:t xml:space="preserve">•   </w:t>
+      </w:r>
+      <w:r>
+        <w:rPr>
+          <w:sz w:val="18"/>
+          <w:szCs w:val="18"/>
+        </w:rPr>
+        <w:t xml:space="preserve">Every model gets four permissions (app.add_order etc.); user.has_perm("orders.change_order") checks them; admin respects them automatically.</w:t>
+      </w:r>
+    </w:p>
+    <w:p>
+      <w:pPr>
+        <w:ind w:left="260" w:hanging="200"/>
+        <w:spacing w:before="0" w:after="25" w:line="230" w:lineRule="auto"/>
+      </w:pPr>
+      <w:r>
+        <w:rPr>
+          <w:sz w:val="18"/>
+          <w:szCs w:val="18"/>
+        </w:rPr>
+        <w:t xml:space="preserve">•   </w:t>
+      </w:r>
+      <w:r>
+        <w:rPr>
+          <w:sz w:val="18"/>
+          <w:szCs w:val="18"/>
+        </w:rPr>
+        <w:t xml:space="preserve">Custom permissions in Meta: ("can_refund", "Can refund orders") - business actions, not just CRUD.</w:t>
+      </w:r>
+    </w:p>
+    <w:p>
+      <w:pPr>
+        <w:ind w:left="260" w:hanging="200"/>
+        <w:spacing w:before="0" w:after="25" w:line="230" w:lineRule="auto"/>
+      </w:pPr>
+      <w:r>
+        <w:rPr>
+          <w:sz w:val="18"/>
+          <w:szCs w:val="18"/>
+        </w:rPr>
+        <w:t xml:space="preserve">•   </w:t>
+      </w:r>
+      <w:r>
+        <w:rPr>
+          <w:sz w:val="18"/>
+          <w:szCs w:val="18"/>
+        </w:rPr>
+        <w:t xml:space="preserve">Groups = named permission sets = roles: 'support', 'accounts'. Users join groups; role changes touch the group, not every user.</w:t>
+      </w:r>
+    </w:p>
+    <w:p>
+      <w:pPr>
+        <w:ind w:left="260" w:hanging="200"/>
+        <w:spacing w:before="0" w:after="25" w:line="230" w:lineRule="auto"/>
+      </w:pPr>
+      <w:r>
+        <w:rPr>
+          <w:sz w:val="18"/>
+          <w:szCs w:val="18"/>
+        </w:rPr>
+        <w:t xml:space="preserve">•   </w:t>
+      </w:r>
+      <w:r>
+        <w:rPr>
+          <w:sz w:val="18"/>
+          <w:szCs w:val="18"/>
+        </w:rPr>
+        <w:t xml:space="preserve">Views enforce with @permission_required or PermissionRequiredMixin; is_superuser passes every check by definition.</w:t>
+      </w:r>
+    </w:p>
+    <w:p>
+      <w:pPr>
+        <w:ind w:left="260" w:hanging="200"/>
+        <w:spacing w:before="0" w:after="25" w:line="230" w:lineRule="auto"/>
+      </w:pPr>
+      <w:r>
+        <w:rPr>
+          <w:sz w:val="18"/>
+          <w:szCs w:val="18"/>
+        </w:rPr>
+        <w:t xml:space="preserve">•   </w:t>
+      </w:r>
+      <w:r>
+        <w:rPr>
+          <w:sz w:val="18"/>
+          <w:szCs w:val="18"/>
+        </w:rPr>
+        <w:t xml:space="preserve">These are model-level, not object-level - "can edit orders", not "can edit THIS order". Row-level needs django-guardian or explicit queryset filtering by ownership (the common API pattern).</w:t>
+      </w:r>
+    </w:p>
+    <w:p>
+      <w:pPr>
+        <w:ind w:left="260" w:hanging="200"/>
+        <w:spacing w:before="0" w:after="25" w:line="230" w:lineRule="auto"/>
+      </w:pPr>
+      <w:r>
+        <w:rPr>
+          <w:sz w:val="18"/>
+          <w:szCs w:val="18"/>
+        </w:rPr>
+        <w:t xml:space="preserve">•   </w:t>
+      </w:r>
+      <w:r>
+        <w:rPr>
+          <w:sz w:val="18"/>
+          <w:szCs w:val="18"/>
+        </w:rPr>
+        <w:t xml:space="preserve">In DRF this maps to permission classes; DjangoModelPermissions bridges DRF to these model permissions.</w:t>
+      </w:r>
+    </w:p>
+    <w:p>
+      <w:pPr>
+        <w:ind w:left="260" w:hanging="0"/>
+        <w:spacing w:before="0" w:after="15" w:line="230" w:lineRule="auto"/>
+        <w:shd w:val="clear" w:color="auto" w:fill="F2F2F2"/>
+      </w:pPr>
+      <w:r>
+        <w:rPr>
+          <w:b/>
+          <w:sz w:val="17"/>
+          <w:szCs w:val="17"/>
+        </w:rPr>
+        <w:t xml:space="preserve">Example:  </w:t>
+      </w:r>
+      <w:r>
+        <w:rPr>
+          <w:rFonts w:ascii="Consolas" w:hAnsi="Consolas" w:cs="Consolas"/>
+          <w:color w:val="3B3B3B"/>
+          <w:sz w:val="17"/>
+          <w:szCs w:val="17"/>
+        </w:rPr>
+        <w:t xml:space="preserve">class Order(models.Model):</w:t>
+      </w:r>
+    </w:p>
+    <w:p>
+      <w:pPr>
+        <w:ind w:left="260" w:hanging="0"/>
+        <w:spacing w:before="0" w:after="15" w:line="230" w:lineRule="auto"/>
+        <w:shd w:val="clear" w:color="auto" w:fill="F2F2F2"/>
+      </w:pPr>
+      <w:r>
+        <w:rPr>
+          <w:rFonts w:ascii="Consolas" w:hAnsi="Consolas" w:cs="Consolas"/>
+          <w:color w:val="3B3B3B"/>
+          <w:sz w:val="17"/>
+          <w:szCs w:val="17"/>
+        </w:rPr>
+        <w:t xml:space="preserve">    class Meta:</w:t>
+      </w:r>
+    </w:p>
+    <w:p>
+      <w:pPr>
+        <w:ind w:left="260" w:hanging="0"/>
+        <w:spacing w:before="0" w:after="15" w:line="230" w:lineRule="auto"/>
+        <w:shd w:val="clear" w:color="auto" w:fill="F2F2F2"/>
+      </w:pPr>
+      <w:r>
+        <w:rPr>
+          <w:rFonts w:ascii="Consolas" w:hAnsi="Consolas" w:cs="Consolas"/>
+          <w:color w:val="3B3B3B"/>
+          <w:sz w:val="17"/>
+          <w:szCs w:val="17"/>
+        </w:rPr>
+        <w:t xml:space="preserve">        permissions = [</w:t>
+      </w:r>
+    </w:p>
+    <w:p>
+      <w:pPr>
+        <w:ind w:left="260" w:hanging="0"/>
+        <w:spacing w:before="0" w:after="15" w:line="230" w:lineRule="auto"/>
+        <w:shd w:val="clear" w:color="auto" w:fill="F2F2F2"/>
+      </w:pPr>
+      <w:r>
+        <w:rPr>
+          <w:rFonts w:ascii="Consolas" w:hAnsi="Consolas" w:cs="Consolas"/>
+          <w:color w:val="3B3B3B"/>
+          <w:sz w:val="17"/>
+          <w:szCs w:val="17"/>
+        </w:rPr>
+        <w:t xml:space="preserve">          ("can_refund", "Can refund orders")]</w:t>
+      </w:r>
+    </w:p>
+    <w:p>
+      <w:pPr>
+        <w:ind w:left="260" w:hanging="0"/>
+        <w:spacing w:before="0" w:after="15" w:line="230" w:lineRule="auto"/>
+        <w:shd w:val="clear" w:color="auto" w:fill="F2F2F2"/>
+      </w:pPr>
+      <w:r>
+        <w:rPr>
+          <w:rFonts w:ascii="Consolas" w:hAnsi="Consolas" w:cs="Consolas"/>
+          <w:color w:val="3B3B3B"/>
+          <w:sz w:val="17"/>
+          <w:szCs w:val="17"/>
+        </w:rPr>
+        <w:t xml:space="preserve"># view</w:t>
+      </w:r>
+    </w:p>
+    <w:p>
+      <w:pPr>
+        <w:ind w:left="260" w:hanging="0"/>
+        <w:spacing w:before="0" w:after="15" w:line="230" w:lineRule="auto"/>
+        <w:shd w:val="clear" w:color="auto" w:fill="F2F2F2"/>
+      </w:pPr>
+      <w:r>
+        <w:rPr>
+          <w:rFonts w:ascii="Consolas" w:hAnsi="Consolas" w:cs="Consolas"/>
+          <w:color w:val="3B3B3B"/>
+          <w:sz w:val="17"/>
+          <w:szCs w:val="17"/>
+        </w:rPr>
+        <w:t xml:space="preserve">@permission_required("orders.can_refund")</w:t>
+      </w:r>
+    </w:p>
+    <w:p>
+      <w:pPr>
+        <w:ind w:left="260" w:hanging="0"/>
+        <w:spacing w:before="0" w:after="15" w:line="230" w:lineRule="auto"/>
+        <w:shd w:val="clear" w:color="auto" w:fill="F2F2F2"/>
+      </w:pPr>
+      <w:r>
+        <w:rPr>
+          <w:rFonts w:ascii="Consolas" w:hAnsi="Consolas" w:cs="Consolas"/>
+          <w:color w:val="3B3B3B"/>
+          <w:sz w:val="17"/>
+          <w:szCs w:val="17"/>
+        </w:rPr>
+        <w:t xml:space="preserve">def refund(request, pk): ...</w:t>
+      </w:r>
+    </w:p>
+    <w:p>
+      <w:pPr>
+        <w:ind w:left="120" w:hanging="0"/>
+        <w:spacing w:before="50" w:after="110" w:line="230" w:lineRule="auto"/>
+        <w:pBdr>
+          <w:left w:val="single" w:sz="12" w:space="4" w:color="2E5E1F"/>
+        </w:pBdr>
+      </w:pPr>
+      <w:r>
+        <w:rPr>
+          <w:b/>
+          <w:color w:val="2E5E1F"/>
+          <w:sz w:val="18"/>
+          <w:szCs w:val="18"/>
+        </w:rPr>
+        <w:t xml:space="preserve">Interview answer:  </w:t>
+      </w:r>
+      <w:r>
+        <w:rPr>
+          <w:i/>
+          <w:sz w:val="18"/>
+          <w:szCs w:val="18"/>
+        </w:rPr>
+        <w:t xml:space="preserve">Django gives per-model add/change/delete/view permissions plus custom ones declared in Meta, checked via has_perm and enforced by decorators, mixins and the admin. Groups act as roles holding permission sets. It is all model-level though - object-level control needs queryset ownership filtering or django-guardian, and in DRF it becomes permission classes.</w:t>
+      </w:r>
+    </w:p>
+    <w:p>
+      <w:pPr>
+        <w:spacing w:before="140" w:after="40" w:line="230" w:lineRule="auto"/>
+      </w:pPr>
+      <w:r>
+        <w:rPr>
+          <w:b/>
+          <w:sz w:val="21"/>
+          <w:szCs w:val="21"/>
+        </w:rPr>
+        <w:t xml:space="preserve">D3.5  Security Features - CSRF, XSS, SQL Injection</w:t>
+      </w:r>
+    </w:p>
+    <w:p>
+      <w:pPr>
+        <w:spacing w:before="0" w:after="40" w:line="230" w:lineRule="auto"/>
+      </w:pPr>
+      <w:r>
+        <w:rPr>
+          <w:b/>
+          <w:sz w:val="18"/>
+          <w:szCs w:val="18"/>
+        </w:rPr>
+        <w:t xml:space="preserve">What it is:  </w:t>
+      </w:r>
+      <w:r>
+        <w:rPr>
+          <w:sz w:val="18"/>
+          <w:szCs w:val="18"/>
+        </w:rPr>
+        <w:t xml:space="preserve">Django blocks the classic web attacks by default - the interview answer is knowing WHAT it does and where the developer can still break it.</w:t>
+      </w:r>
+    </w:p>
+    <w:p>
+      <w:pPr>
+        <w:ind w:left="260" w:hanging="200"/>
+        <w:spacing w:before="0" w:after="25" w:line="230" w:lineRule="auto"/>
+      </w:pPr>
+      <w:r>
+        <w:rPr>
+          <w:sz w:val="18"/>
+          <w:szCs w:val="18"/>
+        </w:rPr>
+        <w:t xml:space="preserve">•   </w:t>
+      </w:r>
+      <w:r>
+        <w:rPr>
+          <w:sz w:val="18"/>
+          <w:szCs w:val="18"/>
+        </w:rPr>
+        <w:t xml:space="preserve">CSRF: forged cross-site POSTs riding the user's cookies. CsrfViewMiddleware + {% csrf_token %} verify a token per unsafe request. APIs using token/JWT headers skip cookies - that is why pure DRF token auth does not need CSRF.</w:t>
+      </w:r>
+    </w:p>
+    <w:p>
+      <w:pPr>
+        <w:ind w:left="260" w:hanging="200"/>
+        <w:spacing w:before="0" w:after="25" w:line="230" w:lineRule="auto"/>
+      </w:pPr>
+      <w:r>
+        <w:rPr>
+          <w:sz w:val="18"/>
+          <w:szCs w:val="18"/>
+        </w:rPr>
+        <w:t xml:space="preserve">•   </w:t>
+      </w:r>
+      <w:r>
+        <w:rPr>
+          <w:sz w:val="18"/>
+          <w:szCs w:val="18"/>
+        </w:rPr>
+        <w:t xml:space="preserve">XSS: injected scripts in rendered HTML. Templates auto-escape all variables; the developer breaks it with careless |safe or mark_safe on user content.</w:t>
+      </w:r>
+    </w:p>
+    <w:p>
+      <w:pPr>
+        <w:ind w:left="260" w:hanging="200"/>
+        <w:spacing w:before="0" w:after="25" w:line="230" w:lineRule="auto"/>
+      </w:pPr>
+      <w:r>
+        <w:rPr>
+          <w:sz w:val="18"/>
+          <w:szCs w:val="18"/>
+        </w:rPr>
+        <w:t xml:space="preserve">•   </w:t>
+      </w:r>
+      <w:r>
+        <w:rPr>
+          <w:sz w:val="18"/>
+          <w:szCs w:val="18"/>
+        </w:rPr>
+        <w:t xml:space="preserve">SQL injection: the ORM parameterizes everything. The hole is raw SQL with string formatting - raw()/cursor.execute must use params=[...], never f-strings.</w:t>
+      </w:r>
+    </w:p>
+    <w:p>
+      <w:pPr>
+        <w:ind w:left="260" w:hanging="200"/>
+        <w:spacing w:before="0" w:after="25" w:line="230" w:lineRule="auto"/>
+      </w:pPr>
+      <w:r>
+        <w:rPr>
+          <w:sz w:val="18"/>
+          <w:szCs w:val="18"/>
+        </w:rPr>
+        <w:t xml:space="preserve">•   </w:t>
+      </w:r>
+      <w:r>
+        <w:rPr>
+          <w:sz w:val="18"/>
+          <w:szCs w:val="18"/>
+        </w:rPr>
+        <w:t xml:space="preserve">Clickjacking: XFrameOptionsMiddleware sends X-Frame-Options: DENY.</w:t>
+      </w:r>
+    </w:p>
+    <w:p>
+      <w:pPr>
+        <w:ind w:left="260" w:hanging="200"/>
+        <w:spacing w:before="0" w:after="25" w:line="230" w:lineRule="auto"/>
+      </w:pPr>
+      <w:r>
+        <w:rPr>
+          <w:sz w:val="18"/>
+          <w:szCs w:val="18"/>
+        </w:rPr>
+        <w:t xml:space="preserve">•   </w:t>
+      </w:r>
+      <w:r>
+        <w:rPr>
+          <w:sz w:val="18"/>
+          <w:szCs w:val="18"/>
+        </w:rPr>
+        <w:t xml:space="preserve">HTTPS hardening: SECURE_SSL_REDIRECT, HSTS settings, SESSION_COOKIE_SECURE, CSRF_COOKIE_SECURE.</w:t>
+      </w:r>
+    </w:p>
+    <w:p>
+      <w:pPr>
+        <w:ind w:left="260" w:hanging="200"/>
+        <w:spacing w:before="0" w:after="25" w:line="230" w:lineRule="auto"/>
+      </w:pPr>
+      <w:r>
+        <w:rPr>
+          <w:sz w:val="18"/>
+          <w:szCs w:val="18"/>
+        </w:rPr>
+        <w:t xml:space="preserve">•   </w:t>
+      </w:r>
+      <w:r>
+        <w:rPr>
+          <w:sz w:val="18"/>
+          <w:szCs w:val="18"/>
+        </w:rPr>
+        <w:t xml:space="preserve">Also free: password hashing, host header validation via ALLOWED_HOSTS. python manage.py check --deploy audits prod settings.</w:t>
+      </w:r>
+    </w:p>
+    <w:p>
+      <w:pPr>
+        <w:ind w:left="260" w:hanging="200"/>
+        <w:spacing w:before="0" w:after="25" w:line="230" w:lineRule="auto"/>
+      </w:pPr>
+      <w:r>
+        <w:rPr>
+          <w:sz w:val="18"/>
+          <w:szCs w:val="18"/>
+        </w:rPr>
+        <w:t xml:space="preserve">•   </w:t>
+      </w:r>
+      <w:r>
+        <w:rPr>
+          <w:sz w:val="18"/>
+          <w:szCs w:val="18"/>
+        </w:rPr>
+        <w:t xml:space="preserve">Summary line: the framework is safe by default; incidents come from developers bypassing it.</w:t>
+      </w:r>
+    </w:p>
+    <w:p>
+      <w:pPr>
+        <w:ind w:left="260" w:hanging="0"/>
+        <w:spacing w:before="0" w:after="15" w:line="230" w:lineRule="auto"/>
+        <w:shd w:val="clear" w:color="auto" w:fill="F2F2F2"/>
+      </w:pPr>
+      <w:r>
+        <w:rPr>
+          <w:b/>
+          <w:sz w:val="17"/>
+          <w:szCs w:val="17"/>
+        </w:rPr>
+        <w:t xml:space="preserve">Example:  </w:t>
+      </w:r>
+      <w:r>
+        <w:rPr>
+          <w:rFonts w:ascii="Consolas" w:hAnsi="Consolas" w:cs="Consolas"/>
+          <w:color w:val="3B3B3B"/>
+          <w:sz w:val="17"/>
+          <w:szCs w:val="17"/>
+        </w:rPr>
+        <w:t xml:space="preserve"># safe raw SQL</w:t>
+      </w:r>
+    </w:p>
+    <w:p>
+      <w:pPr>
+        <w:ind w:left="260" w:hanging="0"/>
+        <w:spacing w:before="0" w:after="15" w:line="230" w:lineRule="auto"/>
+        <w:shd w:val="clear" w:color="auto" w:fill="F2F2F2"/>
+      </w:pPr>
+      <w:r>
+        <w:rPr>
+          <w:rFonts w:ascii="Consolas" w:hAnsi="Consolas" w:cs="Consolas"/>
+          <w:color w:val="3B3B3B"/>
+          <w:sz w:val="17"/>
+          <w:szCs w:val="17"/>
+        </w:rPr>
+        <w:t xml:space="preserve">Order.objects.raw(</w:t>
+      </w:r>
+    </w:p>
+    <w:p>
+      <w:pPr>
+        <w:ind w:left="260" w:hanging="0"/>
+        <w:spacing w:before="0" w:after="15" w:line="230" w:lineRule="auto"/>
+        <w:shd w:val="clear" w:color="auto" w:fill="F2F2F2"/>
+      </w:pPr>
+      <w:r>
+        <w:rPr>
+          <w:rFonts w:ascii="Consolas" w:hAnsi="Consolas" w:cs="Consolas"/>
+          <w:color w:val="3B3B3B"/>
+          <w:sz w:val="17"/>
+          <w:szCs w:val="17"/>
+        </w:rPr>
+        <w:t xml:space="preserve">  "SELECT * FROM orders WHERE status = %s",</w:t>
+      </w:r>
+    </w:p>
+    <w:p>
+      <w:pPr>
+        <w:ind w:left="260" w:hanging="0"/>
+        <w:spacing w:before="0" w:after="15" w:line="230" w:lineRule="auto"/>
+        <w:shd w:val="clear" w:color="auto" w:fill="F2F2F2"/>
+      </w:pPr>
+      <w:r>
+        <w:rPr>
+          <w:rFonts w:ascii="Consolas" w:hAnsi="Consolas" w:cs="Consolas"/>
+          <w:color w:val="3B3B3B"/>
+          <w:sz w:val="17"/>
+          <w:szCs w:val="17"/>
+        </w:rPr>
+        <w:t xml:space="preserve">  params=[status])</w:t>
+      </w:r>
+    </w:p>
+    <w:p>
+      <w:pPr>
+        <w:ind w:left="260" w:hanging="0"/>
+        <w:spacing w:before="0" w:after="15" w:line="230" w:lineRule="auto"/>
+        <w:shd w:val="clear" w:color="auto" w:fill="F2F2F2"/>
+      </w:pPr>
+      <w:r>
+        <w:rPr>
+          <w:rFonts w:ascii="Consolas" w:hAnsi="Consolas" w:cs="Consolas"/>
+          <w:color w:val="3B3B3B"/>
+          <w:sz w:val="17"/>
+          <w:szCs w:val="17"/>
+        </w:rPr>
+        <w:t xml:space="preserve"># NEVER: f"... WHERE status = '{status}'"</w:t>
+      </w:r>
+    </w:p>
+    <w:p>
+      <w:pPr>
+        <w:ind w:left="120" w:hanging="0"/>
+        <w:spacing w:before="50" w:after="110" w:line="230" w:lineRule="auto"/>
+        <w:pBdr>
+          <w:left w:val="single" w:sz="12" w:space="4" w:color="2E5E1F"/>
+        </w:pBdr>
+      </w:pPr>
+      <w:r>
+        <w:rPr>
+          <w:b/>
+          <w:color w:val="2E5E1F"/>
+          <w:sz w:val="18"/>
+          <w:szCs w:val="18"/>
+        </w:rPr>
+        <w:t xml:space="preserve">Interview answer:  </w:t>
+      </w:r>
+      <w:r>
+        <w:rPr>
+          <w:i/>
+          <w:sz w:val="18"/>
+          <w:szCs w:val="18"/>
+        </w:rPr>
+        <w:t xml:space="preserve">Django defends by default: CSRF tokens on unsafe methods, template auto-escaping against XSS, a fully parameterized ORM against injection, clickjacking headers, ALLOWED_HOSTS, and hashed passwords. Breaches come from bypassing it - mark_safe on user input or f-string raw SQL - and check --deploy audits the production settings.</w:t>
+      </w:r>
+    </w:p>
+    <w:p>
+      <w:pPr>
+        <w:spacing w:before="140" w:after="40" w:line="230" w:lineRule="auto"/>
+      </w:pPr>
+      <w:r>
+        <w:rPr>
+          <w:b/>
+          <w:sz w:val="21"/>
+          <w:szCs w:val="21"/>
+        </w:rPr>
+        <w:t xml:space="preserve">D3.6  Caching</w:t>
+      </w:r>
+    </w:p>
+    <w:p>
+      <w:pPr>
+        <w:spacing w:before="0" w:after="40" w:line="230" w:lineRule="auto"/>
+      </w:pPr>
+      <w:r>
+        <w:rPr>
+          <w:b/>
+          <w:sz w:val="18"/>
+          <w:szCs w:val="18"/>
+        </w:rPr>
+        <w:t xml:space="preserve">What it is:  </w:t>
+      </w:r>
+      <w:r>
+        <w:rPr>
+          <w:sz w:val="18"/>
+          <w:szCs w:val="18"/>
+        </w:rPr>
+        <w:t xml:space="preserve">Django caches at several levels - per-site, per-view, template fragment, or manual low-level - with Redis/Memcached as the usual backend.</w:t>
+      </w:r>
+    </w:p>
+    <w:p>
+      <w:pPr>
+        <w:ind w:left="260" w:hanging="200"/>
+        <w:spacing w:before="0" w:after="25" w:line="230" w:lineRule="auto"/>
+      </w:pPr>
+      <w:r>
+        <w:rPr>
+          <w:sz w:val="18"/>
+          <w:szCs w:val="18"/>
+        </w:rPr>
+        <w:t xml:space="preserve">•   </w:t>
+      </w:r>
+      <w:r>
+        <w:rPr>
+          <w:sz w:val="18"/>
+          <w:szCs w:val="18"/>
+        </w:rPr>
+        <w:t xml:space="preserve">Backends via CACHES: Redis (standard in production - shared across processes), Memcached, LocMem (per-process, dev only), database/file.</w:t>
+      </w:r>
+    </w:p>
+    <w:p>
+      <w:pPr>
+        <w:ind w:left="260" w:hanging="200"/>
+        <w:spacing w:before="0" w:after="25" w:line="230" w:lineRule="auto"/>
+      </w:pPr>
+      <w:r>
+        <w:rPr>
+          <w:sz w:val="18"/>
+          <w:szCs w:val="18"/>
+        </w:rPr>
+        <w:t xml:space="preserve">•   </w:t>
+      </w:r>
+      <w:r>
+        <w:rPr>
+          <w:sz w:val="18"/>
+          <w:szCs w:val="18"/>
+        </w:rPr>
+        <w:t xml:space="preserve">Low-level API is the workhorse: cache.get(key) / cache.set(key, value, timeout) / cache.get_or_set() around expensive queries or API calls.</w:t>
+      </w:r>
+    </w:p>
+    <w:p>
+      <w:pPr>
+        <w:ind w:left="260" w:hanging="200"/>
+        <w:spacing w:before="0" w:after="25" w:line="230" w:lineRule="auto"/>
+      </w:pPr>
+      <w:r>
+        <w:rPr>
+          <w:sz w:val="18"/>
+          <w:szCs w:val="18"/>
+        </w:rPr>
+        <w:t xml:space="preserve">•   </w:t>
+      </w:r>
+      <w:r>
+        <w:rPr>
+          <w:sz w:val="18"/>
+          <w:szCs w:val="18"/>
+        </w:rPr>
+        <w:t xml:space="preserve">@cache_page(60) caches a whole view's response; template {% cache %} caches fragments; per-site middleware caches everything (blunt).</w:t>
+      </w:r>
+    </w:p>
+    <w:p>
+      <w:pPr>
+        <w:ind w:left="260" w:hanging="200"/>
+        <w:spacing w:before="0" w:after="25" w:line="230" w:lineRule="auto"/>
+      </w:pPr>
+      <w:r>
+        <w:rPr>
+          <w:sz w:val="18"/>
+          <w:szCs w:val="18"/>
+        </w:rPr>
+        <w:t xml:space="preserve">•   </w:t>
+      </w:r>
+      <w:r>
+        <w:rPr>
+          <w:sz w:val="18"/>
+          <w:szCs w:val="18"/>
+        </w:rPr>
+        <w:t xml:space="preserve">Real problem #1 - invalidation: stale data after writes. Patterns: short TTLs, explicit cache.delete(key) on save, or key versioning.</w:t>
+      </w:r>
+    </w:p>
+    <w:p>
+      <w:pPr>
+        <w:ind w:left="260" w:hanging="200"/>
+        <w:spacing w:before="0" w:after="25" w:line="230" w:lineRule="auto"/>
+      </w:pPr>
+      <w:r>
+        <w:rPr>
+          <w:sz w:val="18"/>
+          <w:szCs w:val="18"/>
+        </w:rPr>
+        <w:t xml:space="preserve">•   </w:t>
+      </w:r>
+      <w:r>
+        <w:rPr>
+          <w:sz w:val="18"/>
+          <w:szCs w:val="18"/>
+        </w:rPr>
+        <w:t xml:space="preserve">Key discipline: include the variables in the key (f"orders:{user_id}:{page}") or users see each other's data - a classic production bug.</w:t>
+      </w:r>
+    </w:p>
+    <w:p>
+      <w:pPr>
+        <w:ind w:left="260" w:hanging="200"/>
+        <w:spacing w:before="0" w:after="25" w:line="230" w:lineRule="auto"/>
+      </w:pPr>
+      <w:r>
+        <w:rPr>
+          <w:sz w:val="18"/>
+          <w:szCs w:val="18"/>
+        </w:rPr>
+        <w:t xml:space="preserve">•   </w:t>
+      </w:r>
+      <w:r>
+        <w:rPr>
+          <w:sz w:val="18"/>
+          <w:szCs w:val="18"/>
+        </w:rPr>
+        <w:t xml:space="preserve">cached_property caches a computed attribute for one object's lifetime - free win for repeated property access.</w:t>
+      </w:r>
+    </w:p>
+    <w:p>
+      <w:pPr>
+        <w:ind w:left="260" w:hanging="200"/>
+        <w:spacing w:before="0" w:after="25" w:line="230" w:lineRule="auto"/>
+      </w:pPr>
+      <w:r>
+        <w:rPr>
+          <w:sz w:val="18"/>
+          <w:szCs w:val="18"/>
+        </w:rPr>
+        <w:t xml:space="preserve">•   </w:t>
+      </w:r>
+      <w:r>
+        <w:rPr>
+          <w:sz w:val="18"/>
+          <w:szCs w:val="18"/>
+        </w:rPr>
+        <w:t xml:space="preserve">Sessions can also ride the cache backend for speed.</w:t>
+      </w:r>
+    </w:p>
+    <w:p>
+      <w:pPr>
+        <w:ind w:left="260" w:hanging="0"/>
+        <w:spacing w:before="0" w:after="15" w:line="230" w:lineRule="auto"/>
+        <w:shd w:val="clear" w:color="auto" w:fill="F2F2F2"/>
+      </w:pPr>
+      <w:r>
+        <w:rPr>
+          <w:b/>
+          <w:sz w:val="17"/>
+          <w:szCs w:val="17"/>
+        </w:rPr>
+        <w:t xml:space="preserve">Example:  </w:t>
+      </w:r>
+      <w:r>
+        <w:rPr>
+          <w:rFonts w:ascii="Consolas" w:hAnsi="Consolas" w:cs="Consolas"/>
+          <w:color w:val="3B3B3B"/>
+          <w:sz w:val="17"/>
+          <w:szCs w:val="17"/>
+        </w:rPr>
+        <w:t xml:space="preserve">from django.core.cache import cache</w:t>
+      </w:r>
+    </w:p>
+    <w:p>
+      <w:pPr>
+        <w:ind w:left="260" w:hanging="0"/>
+        <w:spacing w:before="0" w:after="15" w:line="230" w:lineRule="auto"/>
+        <w:shd w:val="clear" w:color="auto" w:fill="F2F2F2"/>
+      </w:pPr>
+      <w:r>
+        <w:rPr>
+          <w:rFonts w:ascii="Consolas" w:hAnsi="Consolas" w:cs="Consolas"/>
+          <w:color w:val="3B3B3B"/>
+          <w:sz w:val="17"/>
+          <w:szCs w:val="17"/>
+        </w:rPr>
+        <w:t xml:space="preserve"/>
+      </w:r>
+    </w:p>
+    <w:p>
+      <w:pPr>
+        <w:ind w:left="260" w:hanging="0"/>
+        <w:spacing w:before="0" w:after="15" w:line="230" w:lineRule="auto"/>
+        <w:shd w:val="clear" w:color="auto" w:fill="F2F2F2"/>
+      </w:pPr>
+      <w:r>
+        <w:rPr>
+          <w:rFonts w:ascii="Consolas" w:hAnsi="Consolas" w:cs="Consolas"/>
+          <w:color w:val="3B3B3B"/>
+          <w:sz w:val="17"/>
+          <w:szCs w:val="17"/>
+        </w:rPr>
+        <w:t xml:space="preserve">def dashboard_stats():</w:t>
+      </w:r>
+    </w:p>
+    <w:p>
+      <w:pPr>
+        <w:ind w:left="260" w:hanging="0"/>
+        <w:spacing w:before="0" w:after="15" w:line="230" w:lineRule="auto"/>
+        <w:shd w:val="clear" w:color="auto" w:fill="F2F2F2"/>
+      </w:pPr>
+      <w:r>
+        <w:rPr>
+          <w:rFonts w:ascii="Consolas" w:hAnsi="Consolas" w:cs="Consolas"/>
+          <w:color w:val="3B3B3B"/>
+          <w:sz w:val="17"/>
+          <w:szCs w:val="17"/>
+        </w:rPr>
+        <w:t xml:space="preserve">    return cache.get_or_set(</w:t>
+      </w:r>
+    </w:p>
+    <w:p>
+      <w:pPr>
+        <w:ind w:left="260" w:hanging="0"/>
+        <w:spacing w:before="0" w:after="15" w:line="230" w:lineRule="auto"/>
+        <w:shd w:val="clear" w:color="auto" w:fill="F2F2F2"/>
+      </w:pPr>
+      <w:r>
+        <w:rPr>
+          <w:rFonts w:ascii="Consolas" w:hAnsi="Consolas" w:cs="Consolas"/>
+          <w:color w:val="3B3B3B"/>
+          <w:sz w:val="17"/>
+          <w:szCs w:val="17"/>
+        </w:rPr>
+        <w:t xml:space="preserve">        "dashboard:stats",</w:t>
+      </w:r>
+    </w:p>
+    <w:p>
+      <w:pPr>
+        <w:ind w:left="260" w:hanging="0"/>
+        <w:spacing w:before="0" w:after="15" w:line="230" w:lineRule="auto"/>
+        <w:shd w:val="clear" w:color="auto" w:fill="F2F2F2"/>
+      </w:pPr>
+      <w:r>
+        <w:rPr>
+          <w:rFonts w:ascii="Consolas" w:hAnsi="Consolas" w:cs="Consolas"/>
+          <w:color w:val="3B3B3B"/>
+          <w:sz w:val="17"/>
+          <w:szCs w:val="17"/>
+        </w:rPr>
+        <w:t xml:space="preserve">        compute_expensive_stats,  # callable</w:t>
+      </w:r>
+    </w:p>
+    <w:p>
+      <w:pPr>
+        <w:ind w:left="260" w:hanging="0"/>
+        <w:spacing w:before="0" w:after="15" w:line="230" w:lineRule="auto"/>
+        <w:shd w:val="clear" w:color="auto" w:fill="F2F2F2"/>
+      </w:pPr>
+      <w:r>
+        <w:rPr>
+          <w:rFonts w:ascii="Consolas" w:hAnsi="Consolas" w:cs="Consolas"/>
+          <w:color w:val="3B3B3B"/>
+          <w:sz w:val="17"/>
+          <w:szCs w:val="17"/>
+        </w:rPr>
+        <w:t xml:space="preserve">        timeout=300)</w:t>
+      </w:r>
+    </w:p>
+    <w:p>
+      <w:pPr>
+        <w:ind w:left="260" w:hanging="0"/>
+        <w:spacing w:before="0" w:after="15" w:line="230" w:lineRule="auto"/>
+        <w:shd w:val="clear" w:color="auto" w:fill="F2F2F2"/>
+      </w:pPr>
+      <w:r>
+        <w:rPr>
+          <w:rFonts w:ascii="Consolas" w:hAnsi="Consolas" w:cs="Consolas"/>
+          <w:color w:val="3B3B3B"/>
+          <w:sz w:val="17"/>
+          <w:szCs w:val="17"/>
+        </w:rPr>
+        <w:t xml:space="preserve"># on write: cache.delete("dashboard:stats")</w:t>
+      </w:r>
+    </w:p>
+    <w:p>
+      <w:pPr>
+        <w:ind w:left="120" w:hanging="0"/>
+        <w:spacing w:before="50" w:after="110" w:line="230" w:lineRule="auto"/>
+        <w:pBdr>
+          <w:left w:val="single" w:sz="12" w:space="4" w:color="2E5E1F"/>
+        </w:pBdr>
+      </w:pPr>
+      <w:r>
+        <w:rPr>
+          <w:b/>
+          <w:color w:val="2E5E1F"/>
+          <w:sz w:val="18"/>
+          <w:szCs w:val="18"/>
+        </w:rPr>
+        <w:t xml:space="preserve">Interview answer:  </w:t>
+      </w:r>
+      <w:r>
+        <w:rPr>
+          <w:i/>
+          <w:sz w:val="18"/>
+          <w:szCs w:val="18"/>
+        </w:rPr>
+        <w:t xml:space="preserve">I mostly use the low-level API - cache.get_or_set with Redis - around expensive queries, plus cache_page for read-heavy endpoints and fragment caching in templates. The hard part is invalidation: I keep TTLs short, delete keys on writes, and always build keys from their variables so users never see each other's cached data.</w:t>
       </w:r>
     </w:p>
     <w:sectPr>

</xml_diff>

<commit_message>
Django Phase 4: DRF (7 topics, 3-YOE depth)
Serializers + validation layers, APIView/generics/ViewSets, session/token/JWT
auth, permissions + throttling, pagination/filtering, API testing

Co-Authored-By: Claude Fable 5 <noreply@anthropic.com>
Claude-Session: https://claude.ai/code/session_01Vm8nqoCZNTvUn3BNmW1Tgz
</commit_message>
<xml_diff>
--- a/Django_Interview_Theory.docx
+++ b/Django_Interview_Theory.docx
@@ -6071,6 +6071,2421 @@
           <w:szCs w:val="18"/>
         </w:rPr>
         <w:t xml:space="preserve">I mostly use the low-level API - cache.get_or_set with Redis - around expensive queries, plus cache_page for read-heavy endpoints and fragment caching in templates. The hard part is invalidation: I keep TTLs short, delete keys on writes, and always build keys from their variables so users never see each other's cached data.</w:t>
+      </w:r>
+    </w:p>
+    <w:p>
+      <w:pPr>
+        <w:spacing w:before="200" w:after="60" w:line="230" w:lineRule="auto"/>
+      </w:pPr>
+      <w:r>
+        <w:rPr>
+          <w:b/>
+          <w:color w:val="1F4E79"/>
+          <w:sz w:val="26"/>
+          <w:szCs w:val="26"/>
+        </w:rPr>
+        <w:t xml:space="preserve">Django Phase 4 - Django REST Framework (DRF)</w:t>
+      </w:r>
+    </w:p>
+    <w:p>
+      <w:pPr>
+        <w:spacing w:before="140" w:after="40" w:line="230" w:lineRule="auto"/>
+      </w:pPr>
+      <w:r>
+        <w:rPr>
+          <w:b/>
+          <w:sz w:val="21"/>
+          <w:szCs w:val="21"/>
+        </w:rPr>
+        <w:t xml:space="preserve">D4.1  What is DRF and Why</w:t>
+      </w:r>
+    </w:p>
+    <w:p>
+      <w:pPr>
+        <w:spacing w:before="0" w:after="40" w:line="230" w:lineRule="auto"/>
+      </w:pPr>
+      <w:r>
+        <w:rPr>
+          <w:b/>
+          <w:sz w:val="18"/>
+          <w:szCs w:val="18"/>
+        </w:rPr>
+        <w:t xml:space="preserve">What it is:  </w:t>
+      </w:r>
+      <w:r>
+        <w:rPr>
+          <w:sz w:val="18"/>
+          <w:szCs w:val="18"/>
+        </w:rPr>
+        <w:t xml:space="preserve">DRF is the standard toolkit on top of Django for building REST APIs - serialization, auth, permissions, throttling and browsable docs out of the box.</w:t>
+      </w:r>
+    </w:p>
+    <w:p>
+      <w:pPr>
+        <w:ind w:left="260" w:hanging="200"/>
+        <w:spacing w:before="0" w:after="25" w:line="230" w:lineRule="auto"/>
+      </w:pPr>
+      <w:r>
+        <w:rPr>
+          <w:sz w:val="18"/>
+          <w:szCs w:val="18"/>
+        </w:rPr>
+        <w:t xml:space="preserve">•   </w:t>
+      </w:r>
+      <w:r>
+        <w:rPr>
+          <w:sz w:val="18"/>
+          <w:szCs w:val="18"/>
+        </w:rPr>
+        <w:t xml:space="preserve">Plain Django returns HTML or hand-built JsonResponse; DRF adds the missing API layer: serializers (validation + conversion), class-based API views, and content negotiation.</w:t>
+      </w:r>
+    </w:p>
+    <w:p>
+      <w:pPr>
+        <w:ind w:left="260" w:hanging="200"/>
+        <w:spacing w:before="0" w:after="25" w:line="230" w:lineRule="auto"/>
+      </w:pPr>
+      <w:r>
+        <w:rPr>
+          <w:sz w:val="18"/>
+          <w:szCs w:val="18"/>
+        </w:rPr>
+        <w:t xml:space="preserve">•   </w:t>
+      </w:r>
+      <w:r>
+        <w:rPr>
+          <w:sz w:val="18"/>
+          <w:szCs w:val="18"/>
+        </w:rPr>
+        <w:t xml:space="preserve">Ships with pluggable authentication (session, token, JWT via libs), permissions, throttling, pagination, filtering, versioning - each a setting away.</w:t>
+      </w:r>
+    </w:p>
+    <w:p>
+      <w:pPr>
+        <w:ind w:left="260" w:hanging="200"/>
+        <w:spacing w:before="0" w:after="25" w:line="230" w:lineRule="auto"/>
+      </w:pPr>
+      <w:r>
+        <w:rPr>
+          <w:sz w:val="18"/>
+          <w:szCs w:val="18"/>
+        </w:rPr>
+        <w:t xml:space="preserve">•   </w:t>
+      </w:r>
+      <w:r>
+        <w:rPr>
+          <w:sz w:val="18"/>
+          <w:szCs w:val="18"/>
+        </w:rPr>
+        <w:t xml:space="preserve">The browsable API renders endpoints as web pages - exploring and testing without Postman; schema generation feeds Swagger/OpenAPI docs.</w:t>
+      </w:r>
+    </w:p>
+    <w:p>
+      <w:pPr>
+        <w:ind w:left="260" w:hanging="200"/>
+        <w:spacing w:before="0" w:after="25" w:line="230" w:lineRule="auto"/>
+      </w:pPr>
+      <w:r>
+        <w:rPr>
+          <w:sz w:val="18"/>
+          <w:szCs w:val="18"/>
+        </w:rPr>
+        <w:t xml:space="preserve">•   </w:t>
+      </w:r>
+      <w:r>
+        <w:rPr>
+          <w:sz w:val="18"/>
+          <w:szCs w:val="18"/>
+        </w:rPr>
+        <w:t xml:space="preserve">Request/Response wrappers: request.data unifies JSON/form parsing; Response picks the output format per client.</w:t>
+      </w:r>
+    </w:p>
+    <w:p>
+      <w:pPr>
+        <w:ind w:left="260" w:hanging="200"/>
+        <w:spacing w:before="0" w:after="25" w:line="230" w:lineRule="auto"/>
+      </w:pPr>
+      <w:r>
+        <w:rPr>
+          <w:sz w:val="18"/>
+          <w:szCs w:val="18"/>
+        </w:rPr>
+        <w:t xml:space="preserve">•   </w:t>
+      </w:r>
+      <w:r>
+        <w:rPr>
+          <w:sz w:val="18"/>
+          <w:szCs w:val="18"/>
+        </w:rPr>
+        <w:t xml:space="preserve">Core flow of every DRF endpoint: request -&gt; authentication -&gt; permissions -&gt; throttling -&gt; view logic -&gt; serializer -&gt; Response.</w:t>
+      </w:r>
+    </w:p>
+    <w:p>
+      <w:pPr>
+        <w:ind w:left="260" w:hanging="200"/>
+        <w:spacing w:before="0" w:after="25" w:line="230" w:lineRule="auto"/>
+      </w:pPr>
+      <w:r>
+        <w:rPr>
+          <w:sz w:val="18"/>
+          <w:szCs w:val="18"/>
+        </w:rPr>
+        <w:t xml:space="preserve">•   </w:t>
+      </w:r>
+      <w:r>
+        <w:rPr>
+          <w:sz w:val="18"/>
+          <w:szCs w:val="18"/>
+        </w:rPr>
+        <w:t xml:space="preserve">Alternative in the ecosystem: FastAPI for greenfield async microservices - but inside a Django project, DRF is the default answer.</w:t>
+      </w:r>
+    </w:p>
+    <w:p>
+      <w:pPr>
+        <w:ind w:left="260" w:hanging="0"/>
+        <w:spacing w:before="0" w:after="15" w:line="230" w:lineRule="auto"/>
+        <w:shd w:val="clear" w:color="auto" w:fill="F2F2F2"/>
+      </w:pPr>
+      <w:r>
+        <w:rPr>
+          <w:b/>
+          <w:sz w:val="17"/>
+          <w:szCs w:val="17"/>
+        </w:rPr>
+        <w:t xml:space="preserve">Example:  </w:t>
+      </w:r>
+      <w:r>
+        <w:rPr>
+          <w:rFonts w:ascii="Consolas" w:hAnsi="Consolas" w:cs="Consolas"/>
+          <w:color w:val="3B3B3B"/>
+          <w:sz w:val="17"/>
+          <w:szCs w:val="17"/>
+        </w:rPr>
+        <w:t xml:space="preserve">class OrderSerializer(serializers.ModelSerializer):</w:t>
+      </w:r>
+    </w:p>
+    <w:p>
+      <w:pPr>
+        <w:ind w:left="260" w:hanging="0"/>
+        <w:spacing w:before="0" w:after="15" w:line="230" w:lineRule="auto"/>
+        <w:shd w:val="clear" w:color="auto" w:fill="F2F2F2"/>
+      </w:pPr>
+      <w:r>
+        <w:rPr>
+          <w:rFonts w:ascii="Consolas" w:hAnsi="Consolas" w:cs="Consolas"/>
+          <w:color w:val="3B3B3B"/>
+          <w:sz w:val="17"/>
+          <w:szCs w:val="17"/>
+        </w:rPr>
+        <w:t xml:space="preserve">    class Meta:</w:t>
+      </w:r>
+    </w:p>
+    <w:p>
+      <w:pPr>
+        <w:ind w:left="260" w:hanging="0"/>
+        <w:spacing w:before="0" w:after="15" w:line="230" w:lineRule="auto"/>
+        <w:shd w:val="clear" w:color="auto" w:fill="F2F2F2"/>
+      </w:pPr>
+      <w:r>
+        <w:rPr>
+          <w:rFonts w:ascii="Consolas" w:hAnsi="Consolas" w:cs="Consolas"/>
+          <w:color w:val="3B3B3B"/>
+          <w:sz w:val="17"/>
+          <w:szCs w:val="17"/>
+        </w:rPr>
+        <w:t xml:space="preserve">        model = Order</w:t>
+      </w:r>
+    </w:p>
+    <w:p>
+      <w:pPr>
+        <w:ind w:left="260" w:hanging="0"/>
+        <w:spacing w:before="0" w:after="15" w:line="230" w:lineRule="auto"/>
+        <w:shd w:val="clear" w:color="auto" w:fill="F2F2F2"/>
+      </w:pPr>
+      <w:r>
+        <w:rPr>
+          <w:rFonts w:ascii="Consolas" w:hAnsi="Consolas" w:cs="Consolas"/>
+          <w:color w:val="3B3B3B"/>
+          <w:sz w:val="17"/>
+          <w:szCs w:val="17"/>
+        </w:rPr>
+        <w:t xml:space="preserve">        fields = ["id", "amount", "status"]</w:t>
+      </w:r>
+    </w:p>
+    <w:p>
+      <w:pPr>
+        <w:ind w:left="260" w:hanging="0"/>
+        <w:spacing w:before="0" w:after="15" w:line="230" w:lineRule="auto"/>
+        <w:shd w:val="clear" w:color="auto" w:fill="F2F2F2"/>
+      </w:pPr>
+      <w:r>
+        <w:rPr>
+          <w:rFonts w:ascii="Consolas" w:hAnsi="Consolas" w:cs="Consolas"/>
+          <w:color w:val="3B3B3B"/>
+          <w:sz w:val="17"/>
+          <w:szCs w:val="17"/>
+        </w:rPr>
+        <w:t xml:space="preserve"/>
+      </w:r>
+    </w:p>
+    <w:p>
+      <w:pPr>
+        <w:ind w:left="260" w:hanging="0"/>
+        <w:spacing w:before="0" w:after="15" w:line="230" w:lineRule="auto"/>
+        <w:shd w:val="clear" w:color="auto" w:fill="F2F2F2"/>
+      </w:pPr>
+      <w:r>
+        <w:rPr>
+          <w:rFonts w:ascii="Consolas" w:hAnsi="Consolas" w:cs="Consolas"/>
+          <w:color w:val="3B3B3B"/>
+          <w:sz w:val="17"/>
+          <w:szCs w:val="17"/>
+        </w:rPr>
+        <w:t xml:space="preserve">class OrderViewSet(viewsets.ModelViewSet):</w:t>
+      </w:r>
+    </w:p>
+    <w:p>
+      <w:pPr>
+        <w:ind w:left="260" w:hanging="0"/>
+        <w:spacing w:before="0" w:after="15" w:line="230" w:lineRule="auto"/>
+        <w:shd w:val="clear" w:color="auto" w:fill="F2F2F2"/>
+      </w:pPr>
+      <w:r>
+        <w:rPr>
+          <w:rFonts w:ascii="Consolas" w:hAnsi="Consolas" w:cs="Consolas"/>
+          <w:color w:val="3B3B3B"/>
+          <w:sz w:val="17"/>
+          <w:szCs w:val="17"/>
+        </w:rPr>
+        <w:t xml:space="preserve">    queryset = Order.objects.all()</w:t>
+      </w:r>
+    </w:p>
+    <w:p>
+      <w:pPr>
+        <w:ind w:left="260" w:hanging="0"/>
+        <w:spacing w:before="0" w:after="15" w:line="230" w:lineRule="auto"/>
+        <w:shd w:val="clear" w:color="auto" w:fill="F2F2F2"/>
+      </w:pPr>
+      <w:r>
+        <w:rPr>
+          <w:rFonts w:ascii="Consolas" w:hAnsi="Consolas" w:cs="Consolas"/>
+          <w:color w:val="3B3B3B"/>
+          <w:sz w:val="17"/>
+          <w:szCs w:val="17"/>
+        </w:rPr>
+        <w:t xml:space="preserve">    serializer_class = OrderSerializer</w:t>
+      </w:r>
+    </w:p>
+    <w:p>
+      <w:pPr>
+        <w:ind w:left="120" w:hanging="0"/>
+        <w:spacing w:before="50" w:after="110" w:line="230" w:lineRule="auto"/>
+        <w:pBdr>
+          <w:left w:val="single" w:sz="12" w:space="4" w:color="2E5E1F"/>
+        </w:pBdr>
+      </w:pPr>
+      <w:r>
+        <w:rPr>
+          <w:b/>
+          <w:color w:val="2E5E1F"/>
+          <w:sz w:val="18"/>
+          <w:szCs w:val="18"/>
+        </w:rPr>
+        <w:t xml:space="preserve">Interview answer:  </w:t>
+      </w:r>
+      <w:r>
+        <w:rPr>
+          <w:i/>
+          <w:sz w:val="18"/>
+          <w:szCs w:val="18"/>
+        </w:rPr>
+        <w:t xml:space="preserve">DRF layers a complete REST toolkit over Django: serializers for validation and JSON conversion, API views/viewsets, plus pluggable auth, permissions, throttling, pagination and a browsable API. Every request flows authentication -&gt; permissions -&gt; throttle -&gt; view -&gt; serializer -&gt; Response. It is the default for APIs inside a Django codebase.</w:t>
+      </w:r>
+    </w:p>
+    <w:p>
+      <w:pPr>
+        <w:spacing w:before="140" w:after="40" w:line="230" w:lineRule="auto"/>
+      </w:pPr>
+      <w:r>
+        <w:rPr>
+          <w:b/>
+          <w:sz w:val="21"/>
+          <w:szCs w:val="21"/>
+        </w:rPr>
+        <w:t xml:space="preserve">D4.2  Serializers</w:t>
+      </w:r>
+    </w:p>
+    <w:p>
+      <w:pPr>
+        <w:spacing w:before="0" w:after="40" w:line="230" w:lineRule="auto"/>
+      </w:pPr>
+      <w:r>
+        <w:rPr>
+          <w:b/>
+          <w:sz w:val="18"/>
+          <w:szCs w:val="18"/>
+        </w:rPr>
+        <w:t xml:space="preserve">What it is:  </w:t>
+      </w:r>
+      <w:r>
+        <w:rPr>
+          <w:sz w:val="18"/>
+          <w:szCs w:val="18"/>
+        </w:rPr>
+        <w:t xml:space="preserve">A serializer converts between model instances and JSON in both directions, validating everything on the way in.</w:t>
+      </w:r>
+    </w:p>
+    <w:p>
+      <w:pPr>
+        <w:ind w:left="260" w:hanging="200"/>
+        <w:spacing w:before="0" w:after="25" w:line="230" w:lineRule="auto"/>
+      </w:pPr>
+      <w:r>
+        <w:rPr>
+          <w:sz w:val="18"/>
+          <w:szCs w:val="18"/>
+        </w:rPr>
+        <w:t xml:space="preserve">•   </w:t>
+      </w:r>
+      <w:r>
+        <w:rPr>
+          <w:sz w:val="18"/>
+          <w:szCs w:val="18"/>
+        </w:rPr>
+        <w:t xml:space="preserve">ModelSerializer generates fields from the model; plain Serializer is fully manual (for non-model payloads).</w:t>
+      </w:r>
+    </w:p>
+    <w:p>
+      <w:pPr>
+        <w:ind w:left="260" w:hanging="200"/>
+        <w:spacing w:before="0" w:after="25" w:line="230" w:lineRule="auto"/>
+      </w:pPr>
+      <w:r>
+        <w:rPr>
+          <w:sz w:val="18"/>
+          <w:szCs w:val="18"/>
+        </w:rPr>
+        <w:t xml:space="preserve">•   </w:t>
+      </w:r>
+      <w:r>
+        <w:rPr>
+          <w:sz w:val="18"/>
+          <w:szCs w:val="18"/>
+        </w:rPr>
+        <w:t xml:space="preserve">Read path: serializer = OrderSerializer(order) -&gt; .data. Write path: serializer = OrderSerializer(data=request.data); is_valid(raise_exception=True); save().</w:t>
+      </w:r>
+    </w:p>
+    <w:p>
+      <w:pPr>
+        <w:ind w:left="260" w:hanging="200"/>
+        <w:spacing w:before="0" w:after="25" w:line="230" w:lineRule="auto"/>
+      </w:pPr>
+      <w:r>
+        <w:rPr>
+          <w:sz w:val="18"/>
+          <w:szCs w:val="18"/>
+        </w:rPr>
+        <w:t xml:space="preserve">•   </w:t>
+      </w:r>
+      <w:r>
+        <w:rPr>
+          <w:sz w:val="18"/>
+          <w:szCs w:val="18"/>
+        </w:rPr>
+        <w:t xml:space="preserve">Validation layers, in order: field arguments (max_length...), validate_&lt;field&gt; methods, then validate() for cross-field rules - errors collect into serializer.errors.</w:t>
+      </w:r>
+    </w:p>
+    <w:p>
+      <w:pPr>
+        <w:ind w:left="260" w:hanging="200"/>
+        <w:spacing w:before="0" w:after="25" w:line="230" w:lineRule="auto"/>
+      </w:pPr>
+      <w:r>
+        <w:rPr>
+          <w:sz w:val="18"/>
+          <w:szCs w:val="18"/>
+        </w:rPr>
+        <w:t xml:space="preserve">•   </w:t>
+      </w:r>
+      <w:r>
+        <w:rPr>
+          <w:sz w:val="18"/>
+          <w:szCs w:val="18"/>
+        </w:rPr>
+        <w:t xml:space="preserve">create() and update() define how validated_data becomes rows - override them for nested writes or side effects.</w:t>
+      </w:r>
+    </w:p>
+    <w:p>
+      <w:pPr>
+        <w:ind w:left="260" w:hanging="200"/>
+        <w:spacing w:before="0" w:after="25" w:line="230" w:lineRule="auto"/>
+      </w:pPr>
+      <w:r>
+        <w:rPr>
+          <w:sz w:val="18"/>
+          <w:szCs w:val="18"/>
+        </w:rPr>
+        <w:t xml:space="preserve">•   </w:t>
+      </w:r>
+      <w:r>
+        <w:rPr>
+          <w:sz w:val="18"/>
+          <w:szCs w:val="18"/>
+        </w:rPr>
+        <w:t xml:space="preserve">Nested serializers embed related data read-only by default; writable nesting requires custom create/update - say this, it is a known pain point.</w:t>
+      </w:r>
+    </w:p>
+    <w:p>
+      <w:pPr>
+        <w:ind w:left="260" w:hanging="200"/>
+        <w:spacing w:before="0" w:after="25" w:line="230" w:lineRule="auto"/>
+      </w:pPr>
+      <w:r>
+        <w:rPr>
+          <w:sz w:val="18"/>
+          <w:szCs w:val="18"/>
+        </w:rPr>
+        <w:t xml:space="preserve">•   </w:t>
+      </w:r>
+      <w:r>
+        <w:rPr>
+          <w:sz w:val="18"/>
+          <w:szCs w:val="18"/>
+        </w:rPr>
+        <w:t xml:space="preserve">SerializerMethodField computes read-only values; source= renames/reaches through relations (source="customer.name").</w:t>
+      </w:r>
+    </w:p>
+    <w:p>
+      <w:pPr>
+        <w:ind w:left="260" w:hanging="200"/>
+        <w:spacing w:before="0" w:after="25" w:line="230" w:lineRule="auto"/>
+      </w:pPr>
+      <w:r>
+        <w:rPr>
+          <w:sz w:val="18"/>
+          <w:szCs w:val="18"/>
+        </w:rPr>
+        <w:t xml:space="preserve">•   </w:t>
+      </w:r>
+      <w:r>
+        <w:rPr>
+          <w:sz w:val="18"/>
+          <w:szCs w:val="18"/>
+        </w:rPr>
+        <w:t xml:space="preserve">N+1 warning: a nested serializer touching relations per row needs select_related/prefetch_related on the view's queryset.</w:t>
+      </w:r>
+    </w:p>
+    <w:p>
+      <w:pPr>
+        <w:ind w:left="260" w:hanging="0"/>
+        <w:spacing w:before="0" w:after="15" w:line="230" w:lineRule="auto"/>
+        <w:shd w:val="clear" w:color="auto" w:fill="F2F2F2"/>
+      </w:pPr>
+      <w:r>
+        <w:rPr>
+          <w:b/>
+          <w:sz w:val="17"/>
+          <w:szCs w:val="17"/>
+        </w:rPr>
+        <w:t xml:space="preserve">Example:  </w:t>
+      </w:r>
+      <w:r>
+        <w:rPr>
+          <w:rFonts w:ascii="Consolas" w:hAnsi="Consolas" w:cs="Consolas"/>
+          <w:color w:val="3B3B3B"/>
+          <w:sz w:val="17"/>
+          <w:szCs w:val="17"/>
+        </w:rPr>
+        <w:t xml:space="preserve">class OrderSerializer(serializers.ModelSerializer):</w:t>
+      </w:r>
+    </w:p>
+    <w:p>
+      <w:pPr>
+        <w:ind w:left="260" w:hanging="0"/>
+        <w:spacing w:before="0" w:after="15" w:line="230" w:lineRule="auto"/>
+        <w:shd w:val="clear" w:color="auto" w:fill="F2F2F2"/>
+      </w:pPr>
+      <w:r>
+        <w:rPr>
+          <w:rFonts w:ascii="Consolas" w:hAnsi="Consolas" w:cs="Consolas"/>
+          <w:color w:val="3B3B3B"/>
+          <w:sz w:val="17"/>
+          <w:szCs w:val="17"/>
+        </w:rPr>
+        <w:t xml:space="preserve">    customer_name = serializers.CharField(</w:t>
+      </w:r>
+    </w:p>
+    <w:p>
+      <w:pPr>
+        <w:ind w:left="260" w:hanging="0"/>
+        <w:spacing w:before="0" w:after="15" w:line="230" w:lineRule="auto"/>
+        <w:shd w:val="clear" w:color="auto" w:fill="F2F2F2"/>
+      </w:pPr>
+      <w:r>
+        <w:rPr>
+          <w:rFonts w:ascii="Consolas" w:hAnsi="Consolas" w:cs="Consolas"/>
+          <w:color w:val="3B3B3B"/>
+          <w:sz w:val="17"/>
+          <w:szCs w:val="17"/>
+        </w:rPr>
+        <w:t xml:space="preserve">        source="customer.name", read_only=True)</w:t>
+      </w:r>
+    </w:p>
+    <w:p>
+      <w:pPr>
+        <w:ind w:left="260" w:hanging="0"/>
+        <w:spacing w:before="0" w:after="15" w:line="230" w:lineRule="auto"/>
+        <w:shd w:val="clear" w:color="auto" w:fill="F2F2F2"/>
+      </w:pPr>
+      <w:r>
+        <w:rPr>
+          <w:rFonts w:ascii="Consolas" w:hAnsi="Consolas" w:cs="Consolas"/>
+          <w:color w:val="3B3B3B"/>
+          <w:sz w:val="17"/>
+          <w:szCs w:val="17"/>
+        </w:rPr>
+        <w:t xml:space="preserve">    class Meta:</w:t>
+      </w:r>
+    </w:p>
+    <w:p>
+      <w:pPr>
+        <w:ind w:left="260" w:hanging="0"/>
+        <w:spacing w:before="0" w:after="15" w:line="230" w:lineRule="auto"/>
+        <w:shd w:val="clear" w:color="auto" w:fill="F2F2F2"/>
+      </w:pPr>
+      <w:r>
+        <w:rPr>
+          <w:rFonts w:ascii="Consolas" w:hAnsi="Consolas" w:cs="Consolas"/>
+          <w:color w:val="3B3B3B"/>
+          <w:sz w:val="17"/>
+          <w:szCs w:val="17"/>
+        </w:rPr>
+        <w:t xml:space="preserve">        model = Order</w:t>
+      </w:r>
+    </w:p>
+    <w:p>
+      <w:pPr>
+        <w:ind w:left="260" w:hanging="0"/>
+        <w:spacing w:before="0" w:after="15" w:line="230" w:lineRule="auto"/>
+        <w:shd w:val="clear" w:color="auto" w:fill="F2F2F2"/>
+      </w:pPr>
+      <w:r>
+        <w:rPr>
+          <w:rFonts w:ascii="Consolas" w:hAnsi="Consolas" w:cs="Consolas"/>
+          <w:color w:val="3B3B3B"/>
+          <w:sz w:val="17"/>
+          <w:szCs w:val="17"/>
+        </w:rPr>
+        <w:t xml:space="preserve">        fields = ["id", "amount", "customer_name"]</w:t>
+      </w:r>
+    </w:p>
+    <w:p>
+      <w:pPr>
+        <w:ind w:left="260" w:hanging="0"/>
+        <w:spacing w:before="0" w:after="15" w:line="230" w:lineRule="auto"/>
+        <w:shd w:val="clear" w:color="auto" w:fill="F2F2F2"/>
+      </w:pPr>
+      <w:r>
+        <w:rPr>
+          <w:rFonts w:ascii="Consolas" w:hAnsi="Consolas" w:cs="Consolas"/>
+          <w:color w:val="3B3B3B"/>
+          <w:sz w:val="17"/>
+          <w:szCs w:val="17"/>
+        </w:rPr>
+        <w:t xml:space="preserve">    def validate_amount(self, value):</w:t>
+      </w:r>
+    </w:p>
+    <w:p>
+      <w:pPr>
+        <w:ind w:left="260" w:hanging="0"/>
+        <w:spacing w:before="0" w:after="15" w:line="230" w:lineRule="auto"/>
+        <w:shd w:val="clear" w:color="auto" w:fill="F2F2F2"/>
+      </w:pPr>
+      <w:r>
+        <w:rPr>
+          <w:rFonts w:ascii="Consolas" w:hAnsi="Consolas" w:cs="Consolas"/>
+          <w:color w:val="3B3B3B"/>
+          <w:sz w:val="17"/>
+          <w:szCs w:val="17"/>
+        </w:rPr>
+        <w:t xml:space="preserve">        if value &lt;= 0:</w:t>
+      </w:r>
+    </w:p>
+    <w:p>
+      <w:pPr>
+        <w:ind w:left="260" w:hanging="0"/>
+        <w:spacing w:before="0" w:after="15" w:line="230" w:lineRule="auto"/>
+        <w:shd w:val="clear" w:color="auto" w:fill="F2F2F2"/>
+      </w:pPr>
+      <w:r>
+        <w:rPr>
+          <w:rFonts w:ascii="Consolas" w:hAnsi="Consolas" w:cs="Consolas"/>
+          <w:color w:val="3B3B3B"/>
+          <w:sz w:val="17"/>
+          <w:szCs w:val="17"/>
+        </w:rPr>
+        <w:t xml:space="preserve">            raise serializers.ValidationError(</w:t>
+      </w:r>
+    </w:p>
+    <w:p>
+      <w:pPr>
+        <w:ind w:left="260" w:hanging="0"/>
+        <w:spacing w:before="0" w:after="15" w:line="230" w:lineRule="auto"/>
+        <w:shd w:val="clear" w:color="auto" w:fill="F2F2F2"/>
+      </w:pPr>
+      <w:r>
+        <w:rPr>
+          <w:rFonts w:ascii="Consolas" w:hAnsi="Consolas" w:cs="Consolas"/>
+          <w:color w:val="3B3B3B"/>
+          <w:sz w:val="17"/>
+          <w:szCs w:val="17"/>
+        </w:rPr>
+        <w:t xml:space="preserve">                "must be positive")</w:t>
+      </w:r>
+    </w:p>
+    <w:p>
+      <w:pPr>
+        <w:ind w:left="260" w:hanging="0"/>
+        <w:spacing w:before="0" w:after="15" w:line="230" w:lineRule="auto"/>
+        <w:shd w:val="clear" w:color="auto" w:fill="F2F2F2"/>
+      </w:pPr>
+      <w:r>
+        <w:rPr>
+          <w:rFonts w:ascii="Consolas" w:hAnsi="Consolas" w:cs="Consolas"/>
+          <w:color w:val="3B3B3B"/>
+          <w:sz w:val="17"/>
+          <w:szCs w:val="17"/>
+        </w:rPr>
+        <w:t xml:space="preserve">        return value</w:t>
+      </w:r>
+    </w:p>
+    <w:p>
+      <w:pPr>
+        <w:ind w:left="120" w:hanging="0"/>
+        <w:spacing w:before="50" w:after="110" w:line="230" w:lineRule="auto"/>
+        <w:pBdr>
+          <w:left w:val="single" w:sz="12" w:space="4" w:color="2E5E1F"/>
+        </w:pBdr>
+      </w:pPr>
+      <w:r>
+        <w:rPr>
+          <w:b/>
+          <w:color w:val="2E5E1F"/>
+          <w:sz w:val="18"/>
+          <w:szCs w:val="18"/>
+        </w:rPr>
+        <w:t xml:space="preserve">Interview answer:  </w:t>
+      </w:r>
+      <w:r>
+        <w:rPr>
+          <w:i/>
+          <w:sz w:val="18"/>
+          <w:szCs w:val="18"/>
+        </w:rPr>
+        <w:t xml:space="preserve">Serializers convert models to JSON and validate incoming data back into objects - field rules first, then validate_&lt;field&gt;, then cross-field validate(), with create/update mapping validated data to rows. I use source= and SerializerMethodField for shaped output, know writable nested serializers need custom create/update, and pair nested output with prefetching to avoid N+1.</w:t>
+      </w:r>
+    </w:p>
+    <w:p>
+      <w:pPr>
+        <w:spacing w:before="140" w:after="40" w:line="230" w:lineRule="auto"/>
+      </w:pPr>
+      <w:r>
+        <w:rPr>
+          <w:b/>
+          <w:sz w:val="21"/>
+          <w:szCs w:val="21"/>
+        </w:rPr>
+        <w:t xml:space="preserve">D4.3  APIView vs Generics vs ViewSet + Routers</w:t>
+      </w:r>
+    </w:p>
+    <w:p>
+      <w:pPr>
+        <w:spacing w:before="0" w:after="40" w:line="230" w:lineRule="auto"/>
+      </w:pPr>
+      <w:r>
+        <w:rPr>
+          <w:b/>
+          <w:sz w:val="18"/>
+          <w:szCs w:val="18"/>
+        </w:rPr>
+        <w:t xml:space="preserve">What it is:  </w:t>
+      </w:r>
+      <w:r>
+        <w:rPr>
+          <w:sz w:val="18"/>
+          <w:szCs w:val="18"/>
+        </w:rPr>
+        <w:t xml:space="preserve">Three abstraction levels for DRF views: APIView is manual, generics give standard CRUD pieces, ViewSets bundle CRUD and let routers generate the URLs.</w:t>
+      </w:r>
+    </w:p>
+    <w:p>
+      <w:pPr>
+        <w:ind w:left="260" w:hanging="200"/>
+        <w:spacing w:before="0" w:after="25" w:line="230" w:lineRule="auto"/>
+      </w:pPr>
+      <w:r>
+        <w:rPr>
+          <w:sz w:val="18"/>
+          <w:szCs w:val="18"/>
+        </w:rPr>
+        <w:t xml:space="preserve">•   </w:t>
+      </w:r>
+      <w:r>
+        <w:rPr>
+          <w:sz w:val="18"/>
+          <w:szCs w:val="18"/>
+        </w:rPr>
+        <w:t xml:space="preserve">APIView: def get/post/put/delete by hand - full control, most code. For endpoints that are not CRUD-shaped (reports, webhooks, actions).</w:t>
+      </w:r>
+    </w:p>
+    <w:p>
+      <w:pPr>
+        <w:ind w:left="260" w:hanging="200"/>
+        <w:spacing w:before="0" w:after="25" w:line="230" w:lineRule="auto"/>
+      </w:pPr>
+      <w:r>
+        <w:rPr>
+          <w:sz w:val="18"/>
+          <w:szCs w:val="18"/>
+        </w:rPr>
+        <w:t xml:space="preserve">•   </w:t>
+      </w:r>
+      <w:r>
+        <w:rPr>
+          <w:sz w:val="18"/>
+          <w:szCs w:val="18"/>
+        </w:rPr>
+        <w:t xml:space="preserve">Generics (ListCreateAPIView, RetrieveUpdateDestroyAPIView): declare queryset + serializer_class, CRUD comes free; override get_queryset() for per-user filtering.</w:t>
+      </w:r>
+    </w:p>
+    <w:p>
+      <w:pPr>
+        <w:ind w:left="260" w:hanging="200"/>
+        <w:spacing w:before="0" w:after="25" w:line="230" w:lineRule="auto"/>
+      </w:pPr>
+      <w:r>
+        <w:rPr>
+          <w:sz w:val="18"/>
+          <w:szCs w:val="18"/>
+        </w:rPr>
+        <w:t xml:space="preserve">•   </w:t>
+      </w:r>
+      <w:r>
+        <w:rPr>
+          <w:sz w:val="18"/>
+          <w:szCs w:val="18"/>
+        </w:rPr>
+        <w:t xml:space="preserve">ModelViewSet: all CRUD in one class; ReadOnlyModelViewSet for list+retrieve only.</w:t>
+      </w:r>
+    </w:p>
+    <w:p>
+      <w:pPr>
+        <w:ind w:left="260" w:hanging="200"/>
+        <w:spacing w:before="0" w:after="25" w:line="230" w:lineRule="auto"/>
+      </w:pPr>
+      <w:r>
+        <w:rPr>
+          <w:sz w:val="18"/>
+          <w:szCs w:val="18"/>
+        </w:rPr>
+        <w:t xml:space="preserve">•   </w:t>
+      </w:r>
+      <w:r>
+        <w:rPr>
+          <w:sz w:val="18"/>
+          <w:szCs w:val="18"/>
+        </w:rPr>
+        <w:t xml:space="preserve">Routers map ViewSets to URLs automatically: router.register("orders", OrderViewSet) - consistent /orders/ and /orders/{id}/ with no manual paths.</w:t>
+      </w:r>
+    </w:p>
+    <w:p>
+      <w:pPr>
+        <w:ind w:left="260" w:hanging="200"/>
+        <w:spacing w:before="0" w:after="25" w:line="230" w:lineRule="auto"/>
+      </w:pPr>
+      <w:r>
+        <w:rPr>
+          <w:sz w:val="18"/>
+          <w:szCs w:val="18"/>
+        </w:rPr>
+        <w:t xml:space="preserve">•   </w:t>
+      </w:r>
+      <w:r>
+        <w:rPr>
+          <w:sz w:val="18"/>
+          <w:szCs w:val="18"/>
+        </w:rPr>
+        <w:t xml:space="preserve">@action(detail=True, methods=["post"]) adds custom endpoints (orders/5/refund/) inside a ViewSet - CRUD plus custom actions together.</w:t>
+      </w:r>
+    </w:p>
+    <w:p>
+      <w:pPr>
+        <w:ind w:left="260" w:hanging="200"/>
+        <w:spacing w:before="0" w:after="25" w:line="230" w:lineRule="auto"/>
+      </w:pPr>
+      <w:r>
+        <w:rPr>
+          <w:sz w:val="18"/>
+          <w:szCs w:val="18"/>
+        </w:rPr>
+        <w:t xml:space="preserve">•   </w:t>
+      </w:r>
+      <w:r>
+        <w:rPr>
+          <w:sz w:val="18"/>
+          <w:szCs w:val="18"/>
+        </w:rPr>
+        <w:t xml:space="preserve">Choosing rule: standard resource -&gt; ViewSet + router; slight variation -&gt; generics; anything odd -&gt; APIView. Same trade-off as FBV vs CBV.</w:t>
+      </w:r>
+    </w:p>
+    <w:p>
+      <w:pPr>
+        <w:ind w:left="260" w:hanging="0"/>
+        <w:spacing w:before="0" w:after="15" w:line="230" w:lineRule="auto"/>
+        <w:shd w:val="clear" w:color="auto" w:fill="F2F2F2"/>
+      </w:pPr>
+      <w:r>
+        <w:rPr>
+          <w:b/>
+          <w:sz w:val="17"/>
+          <w:szCs w:val="17"/>
+        </w:rPr>
+        <w:t xml:space="preserve">Example:  </w:t>
+      </w:r>
+      <w:r>
+        <w:rPr>
+          <w:rFonts w:ascii="Consolas" w:hAnsi="Consolas" w:cs="Consolas"/>
+          <w:color w:val="3B3B3B"/>
+          <w:sz w:val="17"/>
+          <w:szCs w:val="17"/>
+        </w:rPr>
+        <w:t xml:space="preserve">router = DefaultRouter()</w:t>
+      </w:r>
+    </w:p>
+    <w:p>
+      <w:pPr>
+        <w:ind w:left="260" w:hanging="0"/>
+        <w:spacing w:before="0" w:after="15" w:line="230" w:lineRule="auto"/>
+        <w:shd w:val="clear" w:color="auto" w:fill="F2F2F2"/>
+      </w:pPr>
+      <w:r>
+        <w:rPr>
+          <w:rFonts w:ascii="Consolas" w:hAnsi="Consolas" w:cs="Consolas"/>
+          <w:color w:val="3B3B3B"/>
+          <w:sz w:val="17"/>
+          <w:szCs w:val="17"/>
+        </w:rPr>
+        <w:t xml:space="preserve">router.register(r"orders", OrderViewSet)</w:t>
+      </w:r>
+    </w:p>
+    <w:p>
+      <w:pPr>
+        <w:ind w:left="260" w:hanging="0"/>
+        <w:spacing w:before="0" w:after="15" w:line="230" w:lineRule="auto"/>
+        <w:shd w:val="clear" w:color="auto" w:fill="F2F2F2"/>
+      </w:pPr>
+      <w:r>
+        <w:rPr>
+          <w:rFonts w:ascii="Consolas" w:hAnsi="Consolas" w:cs="Consolas"/>
+          <w:color w:val="3B3B3B"/>
+          <w:sz w:val="17"/>
+          <w:szCs w:val="17"/>
+        </w:rPr>
+        <w:t xml:space="preserve"/>
+      </w:r>
+    </w:p>
+    <w:p>
+      <w:pPr>
+        <w:ind w:left="260" w:hanging="0"/>
+        <w:spacing w:before="0" w:after="15" w:line="230" w:lineRule="auto"/>
+        <w:shd w:val="clear" w:color="auto" w:fill="F2F2F2"/>
+      </w:pPr>
+      <w:r>
+        <w:rPr>
+          <w:rFonts w:ascii="Consolas" w:hAnsi="Consolas" w:cs="Consolas"/>
+          <w:color w:val="3B3B3B"/>
+          <w:sz w:val="17"/>
+          <w:szCs w:val="17"/>
+        </w:rPr>
+        <w:t xml:space="preserve">class OrderViewSet(viewsets.ModelViewSet):</w:t>
+      </w:r>
+    </w:p>
+    <w:p>
+      <w:pPr>
+        <w:ind w:left="260" w:hanging="0"/>
+        <w:spacing w:before="0" w:after="15" w:line="230" w:lineRule="auto"/>
+        <w:shd w:val="clear" w:color="auto" w:fill="F2F2F2"/>
+      </w:pPr>
+      <w:r>
+        <w:rPr>
+          <w:rFonts w:ascii="Consolas" w:hAnsi="Consolas" w:cs="Consolas"/>
+          <w:color w:val="3B3B3B"/>
+          <w:sz w:val="17"/>
+          <w:szCs w:val="17"/>
+        </w:rPr>
+        <w:t xml:space="preserve">    ...</w:t>
+      </w:r>
+    </w:p>
+    <w:p>
+      <w:pPr>
+        <w:ind w:left="260" w:hanging="0"/>
+        <w:spacing w:before="0" w:after="15" w:line="230" w:lineRule="auto"/>
+        <w:shd w:val="clear" w:color="auto" w:fill="F2F2F2"/>
+      </w:pPr>
+      <w:r>
+        <w:rPr>
+          <w:rFonts w:ascii="Consolas" w:hAnsi="Consolas" w:cs="Consolas"/>
+          <w:color w:val="3B3B3B"/>
+          <w:sz w:val="17"/>
+          <w:szCs w:val="17"/>
+        </w:rPr>
+        <w:t xml:space="preserve">    @action(detail=True, methods=["post"])</w:t>
+      </w:r>
+    </w:p>
+    <w:p>
+      <w:pPr>
+        <w:ind w:left="260" w:hanging="0"/>
+        <w:spacing w:before="0" w:after="15" w:line="230" w:lineRule="auto"/>
+        <w:shd w:val="clear" w:color="auto" w:fill="F2F2F2"/>
+      </w:pPr>
+      <w:r>
+        <w:rPr>
+          <w:rFonts w:ascii="Consolas" w:hAnsi="Consolas" w:cs="Consolas"/>
+          <w:color w:val="3B3B3B"/>
+          <w:sz w:val="17"/>
+          <w:szCs w:val="17"/>
+        </w:rPr>
+        <w:t xml:space="preserve">    def refund(self, request, pk=None):</w:t>
+      </w:r>
+    </w:p>
+    <w:p>
+      <w:pPr>
+        <w:ind w:left="260" w:hanging="0"/>
+        <w:spacing w:before="0" w:after="15" w:line="230" w:lineRule="auto"/>
+        <w:shd w:val="clear" w:color="auto" w:fill="F2F2F2"/>
+      </w:pPr>
+      <w:r>
+        <w:rPr>
+          <w:rFonts w:ascii="Consolas" w:hAnsi="Consolas" w:cs="Consolas"/>
+          <w:color w:val="3B3B3B"/>
+          <w:sz w:val="17"/>
+          <w:szCs w:val="17"/>
+        </w:rPr>
+        <w:t xml:space="preserve">        ...</w:t>
+      </w:r>
+    </w:p>
+    <w:p>
+      <w:pPr>
+        <w:ind w:left="120" w:hanging="0"/>
+        <w:spacing w:before="50" w:after="110" w:line="230" w:lineRule="auto"/>
+        <w:pBdr>
+          <w:left w:val="single" w:sz="12" w:space="4" w:color="2E5E1F"/>
+        </w:pBdr>
+      </w:pPr>
+      <w:r>
+        <w:rPr>
+          <w:b/>
+          <w:color w:val="2E5E1F"/>
+          <w:sz w:val="18"/>
+          <w:szCs w:val="18"/>
+        </w:rPr>
+        <w:t xml:space="preserve">Interview answer:  </w:t>
+      </w:r>
+      <w:r>
+        <w:rPr>
+          <w:i/>
+          <w:sz w:val="18"/>
+          <w:szCs w:val="18"/>
+        </w:rPr>
+        <w:t xml:space="preserve">APIView gives manual per-verb methods for non-CRUD endpoints; generics wire queryset + serializer into ready CRUD views; ModelViewSet bundles full CRUD and a router generates its URLs, with @action for custom endpoints like /orders/5/refund/. I default to ViewSets for resources and drop to APIView when the endpoint is not resource-shaped.</w:t>
+      </w:r>
+    </w:p>
+    <w:p>
+      <w:pPr>
+        <w:spacing w:before="140" w:after="40" w:line="230" w:lineRule="auto"/>
+      </w:pPr>
+      <w:r>
+        <w:rPr>
+          <w:b/>
+          <w:sz w:val="21"/>
+          <w:szCs w:val="21"/>
+        </w:rPr>
+        <w:t xml:space="preserve">D4.4  API Authentication - Session, Token, JWT</w:t>
+      </w:r>
+    </w:p>
+    <w:p>
+      <w:pPr>
+        <w:spacing w:before="0" w:after="40" w:line="230" w:lineRule="auto"/>
+      </w:pPr>
+      <w:r>
+        <w:rPr>
+          <w:b/>
+          <w:sz w:val="18"/>
+          <w:szCs w:val="18"/>
+        </w:rPr>
+        <w:t xml:space="preserve">What it is:  </w:t>
+      </w:r>
+      <w:r>
+        <w:rPr>
+          <w:sz w:val="18"/>
+          <w:szCs w:val="18"/>
+        </w:rPr>
+        <w:t xml:space="preserve">DRF authentication classes identify who is calling; session, token and JWT are the three standard schemes.</w:t>
+      </w:r>
+    </w:p>
+    <w:p>
+      <w:pPr>
+        <w:ind w:left="260" w:hanging="200"/>
+        <w:spacing w:before="0" w:after="25" w:line="230" w:lineRule="auto"/>
+      </w:pPr>
+      <w:r>
+        <w:rPr>
+          <w:sz w:val="18"/>
+          <w:szCs w:val="18"/>
+        </w:rPr>
+        <w:t xml:space="preserve">•   </w:t>
+      </w:r>
+      <w:r>
+        <w:rPr>
+          <w:sz w:val="18"/>
+          <w:szCs w:val="18"/>
+        </w:rPr>
+        <w:t xml:space="preserve">SessionAuthentication: cookie-based, fits same-domain frontends and the browsable API; needs CSRF handling.</w:t>
+      </w:r>
+    </w:p>
+    <w:p>
+      <w:pPr>
+        <w:ind w:left="260" w:hanging="200"/>
+        <w:spacing w:before="0" w:after="25" w:line="230" w:lineRule="auto"/>
+      </w:pPr>
+      <w:r>
+        <w:rPr>
+          <w:sz w:val="18"/>
+          <w:szCs w:val="18"/>
+        </w:rPr>
+        <w:t xml:space="preserve">•   </w:t>
+      </w:r>
+      <w:r>
+        <w:rPr>
+          <w:sz w:val="18"/>
+          <w:szCs w:val="18"/>
+        </w:rPr>
+        <w:t xml:space="preserve">TokenAuthentication (DRF built-in): one permanent token per user in the DB, sent as Authorization: Token xyz. Simple, but no expiry by default and a DB hit per request.</w:t>
+      </w:r>
+    </w:p>
+    <w:p>
+      <w:pPr>
+        <w:ind w:left="260" w:hanging="200"/>
+        <w:spacing w:before="0" w:after="25" w:line="230" w:lineRule="auto"/>
+      </w:pPr>
+      <w:r>
+        <w:rPr>
+          <w:sz w:val="18"/>
+          <w:szCs w:val="18"/>
+        </w:rPr>
+        <w:t xml:space="preserve">•   </w:t>
+      </w:r>
+      <w:r>
+        <w:rPr>
+          <w:sz w:val="18"/>
+          <w:szCs w:val="18"/>
+        </w:rPr>
+        <w:t xml:space="preserve">JWT (djangorestframework-simplejwt): signed, self-contained tokens - short-lived access token + refresh token. Stateless: no DB lookup to verify, easy horizontal scaling.</w:t>
+      </w:r>
+    </w:p>
+    <w:p>
+      <w:pPr>
+        <w:ind w:left="260" w:hanging="200"/>
+        <w:spacing w:before="0" w:after="25" w:line="230" w:lineRule="auto"/>
+      </w:pPr>
+      <w:r>
+        <w:rPr>
+          <w:sz w:val="18"/>
+          <w:szCs w:val="18"/>
+        </w:rPr>
+        <w:t xml:space="preserve">•   </w:t>
+      </w:r>
+      <w:r>
+        <w:rPr>
+          <w:sz w:val="18"/>
+          <w:szCs w:val="18"/>
+        </w:rPr>
+        <w:t xml:space="preserve">JWT trade-off: hard to revoke before expiry (blacklist app exists but reintroduces state); payload is only base64-encoded, so nothing secret inside; always HTTPS.</w:t>
+      </w:r>
+    </w:p>
+    <w:p>
+      <w:pPr>
+        <w:ind w:left="260" w:hanging="200"/>
+        <w:spacing w:before="0" w:after="25" w:line="230" w:lineRule="auto"/>
+      </w:pPr>
+      <w:r>
+        <w:rPr>
+          <w:sz w:val="18"/>
+          <w:szCs w:val="18"/>
+        </w:rPr>
+        <w:t xml:space="preserve">•   </w:t>
+      </w:r>
+      <w:r>
+        <w:rPr>
+          <w:sz w:val="18"/>
+          <w:szCs w:val="18"/>
+        </w:rPr>
+        <w:t xml:space="preserve">Flow: POST credentials -&gt; access + refresh; client sends Authorization: Bearer &lt;access&gt;; on 401, refresh; short access lifetime limits stolen-token damage.</w:t>
+      </w:r>
+    </w:p>
+    <w:p>
+      <w:pPr>
+        <w:ind w:left="260" w:hanging="200"/>
+        <w:spacing w:before="0" w:after="25" w:line="230" w:lineRule="auto"/>
+      </w:pPr>
+      <w:r>
+        <w:rPr>
+          <w:sz w:val="18"/>
+          <w:szCs w:val="18"/>
+        </w:rPr>
+        <w:t xml:space="preserve">•   </w:t>
+      </w:r>
+      <w:r>
+        <w:rPr>
+          <w:sz w:val="18"/>
+          <w:szCs w:val="18"/>
+        </w:rPr>
+        <w:t xml:space="preserve">Config: DEFAULT_AUTHENTICATION_CLASSES globally, authentication_classes per view. request.user lands the same way regardless of scheme.</w:t>
+      </w:r>
+    </w:p>
+    <w:p>
+      <w:pPr>
+        <w:ind w:left="260" w:hanging="200"/>
+        <w:spacing w:before="0" w:after="25" w:line="230" w:lineRule="auto"/>
+      </w:pPr>
+      <w:r>
+        <w:rPr>
+          <w:sz w:val="18"/>
+          <w:szCs w:val="18"/>
+        </w:rPr>
+        <w:t xml:space="preserve">•   </w:t>
+      </w:r>
+      <w:r>
+        <w:rPr>
+          <w:sz w:val="18"/>
+          <w:szCs w:val="18"/>
+        </w:rPr>
+        <w:t xml:space="preserve">Mobile/SPA + microservices -&gt; JWT; internal same-domain tools -&gt; sessions.</w:t>
+      </w:r>
+    </w:p>
+    <w:p>
+      <w:pPr>
+        <w:ind w:left="260" w:hanging="0"/>
+        <w:spacing w:before="0" w:after="15" w:line="230" w:lineRule="auto"/>
+        <w:shd w:val="clear" w:color="auto" w:fill="F2F2F2"/>
+      </w:pPr>
+      <w:r>
+        <w:rPr>
+          <w:b/>
+          <w:sz w:val="17"/>
+          <w:szCs w:val="17"/>
+        </w:rPr>
+        <w:t xml:space="preserve">Example:  </w:t>
+      </w:r>
+      <w:r>
+        <w:rPr>
+          <w:rFonts w:ascii="Consolas" w:hAnsi="Consolas" w:cs="Consolas"/>
+          <w:color w:val="3B3B3B"/>
+          <w:sz w:val="17"/>
+          <w:szCs w:val="17"/>
+        </w:rPr>
+        <w:t xml:space="preserve"># settings</w:t>
+      </w:r>
+    </w:p>
+    <w:p>
+      <w:pPr>
+        <w:ind w:left="260" w:hanging="0"/>
+        <w:spacing w:before="0" w:after="15" w:line="230" w:lineRule="auto"/>
+        <w:shd w:val="clear" w:color="auto" w:fill="F2F2F2"/>
+      </w:pPr>
+      <w:r>
+        <w:rPr>
+          <w:rFonts w:ascii="Consolas" w:hAnsi="Consolas" w:cs="Consolas"/>
+          <w:color w:val="3B3B3B"/>
+          <w:sz w:val="17"/>
+          <w:szCs w:val="17"/>
+        </w:rPr>
+        <w:t xml:space="preserve">REST_FRAMEWORK = {</w:t>
+      </w:r>
+    </w:p>
+    <w:p>
+      <w:pPr>
+        <w:ind w:left="260" w:hanging="0"/>
+        <w:spacing w:before="0" w:after="15" w:line="230" w:lineRule="auto"/>
+        <w:shd w:val="clear" w:color="auto" w:fill="F2F2F2"/>
+      </w:pPr>
+      <w:r>
+        <w:rPr>
+          <w:rFonts w:ascii="Consolas" w:hAnsi="Consolas" w:cs="Consolas"/>
+          <w:color w:val="3B3B3B"/>
+          <w:sz w:val="17"/>
+          <w:szCs w:val="17"/>
+        </w:rPr>
+        <w:t xml:space="preserve"> "DEFAULT_AUTHENTICATION_CLASSES": (</w:t>
+      </w:r>
+    </w:p>
+    <w:p>
+      <w:pPr>
+        <w:ind w:left="260" w:hanging="0"/>
+        <w:spacing w:before="0" w:after="15" w:line="230" w:lineRule="auto"/>
+        <w:shd w:val="clear" w:color="auto" w:fill="F2F2F2"/>
+      </w:pPr>
+      <w:r>
+        <w:rPr>
+          <w:rFonts w:ascii="Consolas" w:hAnsi="Consolas" w:cs="Consolas"/>
+          <w:color w:val="3B3B3B"/>
+          <w:sz w:val="17"/>
+          <w:szCs w:val="17"/>
+        </w:rPr>
+        <w:t xml:space="preserve">  "rest_framework_simplejwt.authentication"</w:t>
+      </w:r>
+    </w:p>
+    <w:p>
+      <w:pPr>
+        <w:ind w:left="260" w:hanging="0"/>
+        <w:spacing w:before="0" w:after="15" w:line="230" w:lineRule="auto"/>
+        <w:shd w:val="clear" w:color="auto" w:fill="F2F2F2"/>
+      </w:pPr>
+      <w:r>
+        <w:rPr>
+          <w:rFonts w:ascii="Consolas" w:hAnsi="Consolas" w:cs="Consolas"/>
+          <w:color w:val="3B3B3B"/>
+          <w:sz w:val="17"/>
+          <w:szCs w:val="17"/>
+        </w:rPr>
+        <w:t xml:space="preserve">  ".JWTAuthentication",)}</w:t>
+      </w:r>
+    </w:p>
+    <w:p>
+      <w:pPr>
+        <w:ind w:left="260" w:hanging="0"/>
+        <w:spacing w:before="0" w:after="15" w:line="230" w:lineRule="auto"/>
+        <w:shd w:val="clear" w:color="auto" w:fill="F2F2F2"/>
+      </w:pPr>
+      <w:r>
+        <w:rPr>
+          <w:rFonts w:ascii="Consolas" w:hAnsi="Consolas" w:cs="Consolas"/>
+          <w:color w:val="3B3B3B"/>
+          <w:sz w:val="17"/>
+          <w:szCs w:val="17"/>
+        </w:rPr>
+        <w:t xml:space="preserve"># client</w:t>
+      </w:r>
+    </w:p>
+    <w:p>
+      <w:pPr>
+        <w:ind w:left="260" w:hanging="0"/>
+        <w:spacing w:before="0" w:after="15" w:line="230" w:lineRule="auto"/>
+        <w:shd w:val="clear" w:color="auto" w:fill="F2F2F2"/>
+      </w:pPr>
+      <w:r>
+        <w:rPr>
+          <w:rFonts w:ascii="Consolas" w:hAnsi="Consolas" w:cs="Consolas"/>
+          <w:color w:val="3B3B3B"/>
+          <w:sz w:val="17"/>
+          <w:szCs w:val="17"/>
+        </w:rPr>
+        <w:t xml:space="preserve">Authorization: Bearer eyJhbGciOi...</w:t>
+      </w:r>
+    </w:p>
+    <w:p>
+      <w:pPr>
+        <w:ind w:left="120" w:hanging="0"/>
+        <w:spacing w:before="50" w:after="110" w:line="230" w:lineRule="auto"/>
+        <w:pBdr>
+          <w:left w:val="single" w:sz="12" w:space="4" w:color="2E5E1F"/>
+        </w:pBdr>
+      </w:pPr>
+      <w:r>
+        <w:rPr>
+          <w:b/>
+          <w:color w:val="2E5E1F"/>
+          <w:sz w:val="18"/>
+          <w:szCs w:val="18"/>
+        </w:rPr>
+        <w:t xml:space="preserve">Interview answer:  </w:t>
+      </w:r>
+      <w:r>
+        <w:rPr>
+          <w:i/>
+          <w:sz w:val="18"/>
+          <w:szCs w:val="18"/>
+        </w:rPr>
+        <w:t xml:space="preserve">Sessions suit same-domain apps, DRF tokens are simple but permanent and hit the DB, and JWT - my default for SPAs and mobile - is stateless with short-lived access plus refresh tokens, scaling without server session state. The trade-offs to mention: JWT revocation needs a blacklist, and the payload is readable, so no secrets inside and HTTPS always.</w:t>
+      </w:r>
+    </w:p>
+    <w:p>
+      <w:pPr>
+        <w:spacing w:before="140" w:after="40" w:line="230" w:lineRule="auto"/>
+      </w:pPr>
+      <w:r>
+        <w:rPr>
+          <w:b/>
+          <w:sz w:val="21"/>
+          <w:szCs w:val="21"/>
+        </w:rPr>
+        <w:t xml:space="preserve">D4.5  Permissions and Throttling</w:t>
+      </w:r>
+    </w:p>
+    <w:p>
+      <w:pPr>
+        <w:spacing w:before="0" w:after="40" w:line="230" w:lineRule="auto"/>
+      </w:pPr>
+      <w:r>
+        <w:rPr>
+          <w:b/>
+          <w:sz w:val="18"/>
+          <w:szCs w:val="18"/>
+        </w:rPr>
+        <w:t xml:space="preserve">What it is:  </w:t>
+      </w:r>
+      <w:r>
+        <w:rPr>
+          <w:sz w:val="18"/>
+          <w:szCs w:val="18"/>
+        </w:rPr>
+        <w:t xml:space="preserve">Permission classes decide whether the authenticated caller MAY do this; throttle classes cap how often they may call.</w:t>
+      </w:r>
+    </w:p>
+    <w:p>
+      <w:pPr>
+        <w:ind w:left="260" w:hanging="200"/>
+        <w:spacing w:before="0" w:after="25" w:line="230" w:lineRule="auto"/>
+      </w:pPr>
+      <w:r>
+        <w:rPr>
+          <w:sz w:val="18"/>
+          <w:szCs w:val="18"/>
+        </w:rPr>
+        <w:t xml:space="preserve">•   </w:t>
+      </w:r>
+      <w:r>
+        <w:rPr>
+          <w:sz w:val="18"/>
+          <w:szCs w:val="18"/>
+        </w:rPr>
+        <w:t xml:space="preserve">Built-ins: IsAuthenticated, AllowAny, IsAdminUser, IsAuthenticatedOrReadOnly (read for all, write for logged-in).</w:t>
+      </w:r>
+    </w:p>
+    <w:p>
+      <w:pPr>
+        <w:ind w:left="260" w:hanging="200"/>
+        <w:spacing w:before="0" w:after="25" w:line="230" w:lineRule="auto"/>
+      </w:pPr>
+      <w:r>
+        <w:rPr>
+          <w:sz w:val="18"/>
+          <w:szCs w:val="18"/>
+        </w:rPr>
+        <w:t xml:space="preserve">•   </w:t>
+      </w:r>
+      <w:r>
+        <w:rPr>
+          <w:sz w:val="18"/>
+          <w:szCs w:val="18"/>
+        </w:rPr>
+        <w:t xml:space="preserve">has_permission runs per request; has_object_permission runs per object on detail routes - the hook for ownership rules.</w:t>
+      </w:r>
+    </w:p>
+    <w:p>
+      <w:pPr>
+        <w:ind w:left="260" w:hanging="200"/>
+        <w:spacing w:before="0" w:after="25" w:line="230" w:lineRule="auto"/>
+      </w:pPr>
+      <w:r>
+        <w:rPr>
+          <w:sz w:val="18"/>
+          <w:szCs w:val="18"/>
+        </w:rPr>
+        <w:t xml:space="preserve">•   </w:t>
+      </w:r>
+      <w:r>
+        <w:rPr>
+          <w:sz w:val="18"/>
+          <w:szCs w:val="18"/>
+        </w:rPr>
+        <w:t xml:space="preserve">Custom class: IsOwner - return obj.user == request.user in has_object_permission. Standard answer for "users edit only their own data", together with get_queryset filtering (defense in both places).</w:t>
+      </w:r>
+    </w:p>
+    <w:p>
+      <w:pPr>
+        <w:ind w:left="260" w:hanging="200"/>
+        <w:spacing w:before="0" w:after="25" w:line="230" w:lineRule="auto"/>
+      </w:pPr>
+      <w:r>
+        <w:rPr>
+          <w:sz w:val="18"/>
+          <w:szCs w:val="18"/>
+        </w:rPr>
+        <w:t xml:space="preserve">•   </w:t>
+      </w:r>
+      <w:r>
+        <w:rPr>
+          <w:sz w:val="18"/>
+          <w:szCs w:val="18"/>
+        </w:rPr>
+        <w:t xml:space="preserve">Multiple classes AND together; SAFE_METHODS (GET/HEAD/OPTIONS) enables read-write splits.</w:t>
+      </w:r>
+    </w:p>
+    <w:p>
+      <w:pPr>
+        <w:ind w:left="260" w:hanging="200"/>
+        <w:spacing w:before="0" w:after="25" w:line="230" w:lineRule="auto"/>
+      </w:pPr>
+      <w:r>
+        <w:rPr>
+          <w:sz w:val="18"/>
+          <w:szCs w:val="18"/>
+        </w:rPr>
+        <w:t xml:space="preserve">•   </w:t>
+      </w:r>
+      <w:r>
+        <w:rPr>
+          <w:sz w:val="18"/>
+          <w:szCs w:val="18"/>
+        </w:rPr>
+        <w:t xml:space="preserve">Failure shape: 401 when unauthenticated, 403 when authenticated but not allowed.</w:t>
+      </w:r>
+    </w:p>
+    <w:p>
+      <w:pPr>
+        <w:ind w:left="260" w:hanging="200"/>
+        <w:spacing w:before="0" w:after="25" w:line="230" w:lineRule="auto"/>
+      </w:pPr>
+      <w:r>
+        <w:rPr>
+          <w:sz w:val="18"/>
+          <w:szCs w:val="18"/>
+        </w:rPr>
+        <w:t xml:space="preserve">•   </w:t>
+      </w:r>
+      <w:r>
+        <w:rPr>
+          <w:sz w:val="18"/>
+          <w:szCs w:val="18"/>
+        </w:rPr>
+        <w:t xml:space="preserve">Throttling: AnonRateThrottle / UserRateThrottle with rates like "100/hour" in settings; ScopedRateThrottle gives per-endpoint budgets (tight on login/OTP). Over limit -&gt; 429.</w:t>
+      </w:r>
+    </w:p>
+    <w:p>
+      <w:pPr>
+        <w:ind w:left="260" w:hanging="200"/>
+        <w:spacing w:before="0" w:after="25" w:line="230" w:lineRule="auto"/>
+      </w:pPr>
+      <w:r>
+        <w:rPr>
+          <w:sz w:val="18"/>
+          <w:szCs w:val="18"/>
+        </w:rPr>
+        <w:t xml:space="preserve">•   </w:t>
+      </w:r>
+      <w:r>
+        <w:rPr>
+          <w:sz w:val="18"/>
+          <w:szCs w:val="18"/>
+        </w:rPr>
+        <w:t xml:space="preserve">DRF throttling uses the cache backend - it is per-process unless a shared cache (Redis) backs it; serious rate limiting also lives at nginx/gateway.</w:t>
+      </w:r>
+    </w:p>
+    <w:p>
+      <w:pPr>
+        <w:ind w:left="260" w:hanging="0"/>
+        <w:spacing w:before="0" w:after="15" w:line="230" w:lineRule="auto"/>
+        <w:shd w:val="clear" w:color="auto" w:fill="F2F2F2"/>
+      </w:pPr>
+      <w:r>
+        <w:rPr>
+          <w:b/>
+          <w:sz w:val="17"/>
+          <w:szCs w:val="17"/>
+        </w:rPr>
+        <w:t xml:space="preserve">Example:  </w:t>
+      </w:r>
+      <w:r>
+        <w:rPr>
+          <w:rFonts w:ascii="Consolas" w:hAnsi="Consolas" w:cs="Consolas"/>
+          <w:color w:val="3B3B3B"/>
+          <w:sz w:val="17"/>
+          <w:szCs w:val="17"/>
+        </w:rPr>
+        <w:t xml:space="preserve">class IsOwner(permissions.BasePermission):</w:t>
+      </w:r>
+    </w:p>
+    <w:p>
+      <w:pPr>
+        <w:ind w:left="260" w:hanging="0"/>
+        <w:spacing w:before="0" w:after="15" w:line="230" w:lineRule="auto"/>
+        <w:shd w:val="clear" w:color="auto" w:fill="F2F2F2"/>
+      </w:pPr>
+      <w:r>
+        <w:rPr>
+          <w:rFonts w:ascii="Consolas" w:hAnsi="Consolas" w:cs="Consolas"/>
+          <w:color w:val="3B3B3B"/>
+          <w:sz w:val="17"/>
+          <w:szCs w:val="17"/>
+        </w:rPr>
+        <w:t xml:space="preserve">    def has_object_permission(self, request,</w:t>
+      </w:r>
+    </w:p>
+    <w:p>
+      <w:pPr>
+        <w:ind w:left="260" w:hanging="0"/>
+        <w:spacing w:before="0" w:after="15" w:line="230" w:lineRule="auto"/>
+        <w:shd w:val="clear" w:color="auto" w:fill="F2F2F2"/>
+      </w:pPr>
+      <w:r>
+        <w:rPr>
+          <w:rFonts w:ascii="Consolas" w:hAnsi="Consolas" w:cs="Consolas"/>
+          <w:color w:val="3B3B3B"/>
+          <w:sz w:val="17"/>
+          <w:szCs w:val="17"/>
+        </w:rPr>
+        <w:t xml:space="preserve">                              view, obj):</w:t>
+      </w:r>
+    </w:p>
+    <w:p>
+      <w:pPr>
+        <w:ind w:left="260" w:hanging="0"/>
+        <w:spacing w:before="0" w:after="15" w:line="230" w:lineRule="auto"/>
+        <w:shd w:val="clear" w:color="auto" w:fill="F2F2F2"/>
+      </w:pPr>
+      <w:r>
+        <w:rPr>
+          <w:rFonts w:ascii="Consolas" w:hAnsi="Consolas" w:cs="Consolas"/>
+          <w:color w:val="3B3B3B"/>
+          <w:sz w:val="17"/>
+          <w:szCs w:val="17"/>
+        </w:rPr>
+        <w:t xml:space="preserve">        return obj.user == request.user</w:t>
+      </w:r>
+    </w:p>
+    <w:p>
+      <w:pPr>
+        <w:ind w:left="260" w:hanging="0"/>
+        <w:spacing w:before="0" w:after="15" w:line="230" w:lineRule="auto"/>
+        <w:shd w:val="clear" w:color="auto" w:fill="F2F2F2"/>
+      </w:pPr>
+      <w:r>
+        <w:rPr>
+          <w:rFonts w:ascii="Consolas" w:hAnsi="Consolas" w:cs="Consolas"/>
+          <w:color w:val="3B3B3B"/>
+          <w:sz w:val="17"/>
+          <w:szCs w:val="17"/>
+        </w:rPr>
+        <w:t xml:space="preserve"/>
+      </w:r>
+    </w:p>
+    <w:p>
+      <w:pPr>
+        <w:ind w:left="260" w:hanging="0"/>
+        <w:spacing w:before="0" w:after="15" w:line="230" w:lineRule="auto"/>
+        <w:shd w:val="clear" w:color="auto" w:fill="F2F2F2"/>
+      </w:pPr>
+      <w:r>
+        <w:rPr>
+          <w:rFonts w:ascii="Consolas" w:hAnsi="Consolas" w:cs="Consolas"/>
+          <w:color w:val="3B3B3B"/>
+          <w:sz w:val="17"/>
+          <w:szCs w:val="17"/>
+        </w:rPr>
+        <w:t xml:space="preserve">class OrderViewSet(viewsets.ModelViewSet):</w:t>
+      </w:r>
+    </w:p>
+    <w:p>
+      <w:pPr>
+        <w:ind w:left="260" w:hanging="0"/>
+        <w:spacing w:before="0" w:after="15" w:line="230" w:lineRule="auto"/>
+        <w:shd w:val="clear" w:color="auto" w:fill="F2F2F2"/>
+      </w:pPr>
+      <w:r>
+        <w:rPr>
+          <w:rFonts w:ascii="Consolas" w:hAnsi="Consolas" w:cs="Consolas"/>
+          <w:color w:val="3B3B3B"/>
+          <w:sz w:val="17"/>
+          <w:szCs w:val="17"/>
+        </w:rPr>
+        <w:t xml:space="preserve">    permission_classes = [IsAuthenticated,</w:t>
+      </w:r>
+    </w:p>
+    <w:p>
+      <w:pPr>
+        <w:ind w:left="260" w:hanging="0"/>
+        <w:spacing w:before="0" w:after="15" w:line="230" w:lineRule="auto"/>
+        <w:shd w:val="clear" w:color="auto" w:fill="F2F2F2"/>
+      </w:pPr>
+      <w:r>
+        <w:rPr>
+          <w:rFonts w:ascii="Consolas" w:hAnsi="Consolas" w:cs="Consolas"/>
+          <w:color w:val="3B3B3B"/>
+          <w:sz w:val="17"/>
+          <w:szCs w:val="17"/>
+        </w:rPr>
+        <w:t xml:space="preserve">                          IsOwner]</w:t>
+      </w:r>
+    </w:p>
+    <w:p>
+      <w:pPr>
+        <w:ind w:left="260" w:hanging="0"/>
+        <w:spacing w:before="0" w:after="15" w:line="230" w:lineRule="auto"/>
+        <w:shd w:val="clear" w:color="auto" w:fill="F2F2F2"/>
+      </w:pPr>
+      <w:r>
+        <w:rPr>
+          <w:rFonts w:ascii="Consolas" w:hAnsi="Consolas" w:cs="Consolas"/>
+          <w:color w:val="3B3B3B"/>
+          <w:sz w:val="17"/>
+          <w:szCs w:val="17"/>
+        </w:rPr>
+        <w:t xml:space="preserve">    def get_queryset(self):</w:t>
+      </w:r>
+    </w:p>
+    <w:p>
+      <w:pPr>
+        <w:ind w:left="260" w:hanging="0"/>
+        <w:spacing w:before="0" w:after="15" w:line="230" w:lineRule="auto"/>
+        <w:shd w:val="clear" w:color="auto" w:fill="F2F2F2"/>
+      </w:pPr>
+      <w:r>
+        <w:rPr>
+          <w:rFonts w:ascii="Consolas" w:hAnsi="Consolas" w:cs="Consolas"/>
+          <w:color w:val="3B3B3B"/>
+          <w:sz w:val="17"/>
+          <w:szCs w:val="17"/>
+        </w:rPr>
+        <w:t xml:space="preserve">        return Order.objects.filter(</w:t>
+      </w:r>
+    </w:p>
+    <w:p>
+      <w:pPr>
+        <w:ind w:left="260" w:hanging="0"/>
+        <w:spacing w:before="0" w:after="15" w:line="230" w:lineRule="auto"/>
+        <w:shd w:val="clear" w:color="auto" w:fill="F2F2F2"/>
+      </w:pPr>
+      <w:r>
+        <w:rPr>
+          <w:rFonts w:ascii="Consolas" w:hAnsi="Consolas" w:cs="Consolas"/>
+          <w:color w:val="3B3B3B"/>
+          <w:sz w:val="17"/>
+          <w:szCs w:val="17"/>
+        </w:rPr>
+        <w:t xml:space="preserve">            user=self.request.user)</w:t>
+      </w:r>
+    </w:p>
+    <w:p>
+      <w:pPr>
+        <w:ind w:left="120" w:hanging="0"/>
+        <w:spacing w:before="50" w:after="110" w:line="230" w:lineRule="auto"/>
+        <w:pBdr>
+          <w:left w:val="single" w:sz="12" w:space="4" w:color="2E5E1F"/>
+        </w:pBdr>
+      </w:pPr>
+      <w:r>
+        <w:rPr>
+          <w:b/>
+          <w:color w:val="2E5E1F"/>
+          <w:sz w:val="18"/>
+          <w:szCs w:val="18"/>
+        </w:rPr>
+        <w:t xml:space="preserve">Interview answer:  </w:t>
+      </w:r>
+      <w:r>
+        <w:rPr>
+          <w:i/>
+          <w:sz w:val="18"/>
+          <w:szCs w:val="18"/>
+        </w:rPr>
+        <w:t xml:space="preserve">Permissions gate the action: has_permission per request, has_object_permission per object - a custom IsOwner plus queryset filtering is the standard ownership pattern; 401 vs 403 separates unauthenticated from unauthorized. Throttles cap request rates per user/anon/scope returning 429, ride the cache backend so they need Redis to be global, and heavy lifting belongs at the gateway too.</w:t>
+      </w:r>
+    </w:p>
+    <w:p>
+      <w:pPr>
+        <w:spacing w:before="140" w:after="40" w:line="230" w:lineRule="auto"/>
+      </w:pPr>
+      <w:r>
+        <w:rPr>
+          <w:b/>
+          <w:sz w:val="21"/>
+          <w:szCs w:val="21"/>
+        </w:rPr>
+        <w:t xml:space="preserve">D4.6  Pagination, Filtering, Searching</w:t>
+      </w:r>
+    </w:p>
+    <w:p>
+      <w:pPr>
+        <w:spacing w:before="0" w:after="40" w:line="230" w:lineRule="auto"/>
+      </w:pPr>
+      <w:r>
+        <w:rPr>
+          <w:b/>
+          <w:sz w:val="18"/>
+          <w:szCs w:val="18"/>
+        </w:rPr>
+        <w:t xml:space="preserve">What it is:  </w:t>
+      </w:r>
+      <w:r>
+        <w:rPr>
+          <w:sz w:val="18"/>
+          <w:szCs w:val="18"/>
+        </w:rPr>
+        <w:t xml:space="preserve">List endpoints must page, filter and search server-side - DRF provides all three as pluggable classes.</w:t>
+      </w:r>
+    </w:p>
+    <w:p>
+      <w:pPr>
+        <w:ind w:left="260" w:hanging="200"/>
+        <w:spacing w:before="0" w:after="25" w:line="230" w:lineRule="auto"/>
+      </w:pPr>
+      <w:r>
+        <w:rPr>
+          <w:sz w:val="18"/>
+          <w:szCs w:val="18"/>
+        </w:rPr>
+        <w:t xml:space="preserve">•   </w:t>
+      </w:r>
+      <w:r>
+        <w:rPr>
+          <w:sz w:val="18"/>
+          <w:szCs w:val="18"/>
+        </w:rPr>
+        <w:t xml:space="preserve">PageNumberPagination: ?page=2 - simple, but deep pages get slow (OFFSET cost).</w:t>
+      </w:r>
+    </w:p>
+    <w:p>
+      <w:pPr>
+        <w:ind w:left="260" w:hanging="200"/>
+        <w:spacing w:before="0" w:after="25" w:line="230" w:lineRule="auto"/>
+      </w:pPr>
+      <w:r>
+        <w:rPr>
+          <w:sz w:val="18"/>
+          <w:szCs w:val="18"/>
+        </w:rPr>
+        <w:t xml:space="preserve">•   </w:t>
+      </w:r>
+      <w:r>
+        <w:rPr>
+          <w:sz w:val="18"/>
+          <w:szCs w:val="18"/>
+        </w:rPr>
+        <w:t xml:space="preserve">LimitOffsetPagination: ?limit=20&amp;offset=40 - client-controlled slices.</w:t>
+      </w:r>
+    </w:p>
+    <w:p>
+      <w:pPr>
+        <w:ind w:left="260" w:hanging="200"/>
+        <w:spacing w:before="0" w:after="25" w:line="230" w:lineRule="auto"/>
+      </w:pPr>
+      <w:r>
+        <w:rPr>
+          <w:sz w:val="18"/>
+          <w:szCs w:val="18"/>
+        </w:rPr>
+        <w:t xml:space="preserve">•   </w:t>
+      </w:r>
+      <w:r>
+        <w:rPr>
+          <w:sz w:val="18"/>
+          <w:szCs w:val="18"/>
+        </w:rPr>
+        <w:t xml:space="preserve">CursorPagination: opaque cursor over an ordered unique field - stable under inserts and fast at depth; the right choice for infinite scroll feeds.</w:t>
+      </w:r>
+    </w:p>
+    <w:p>
+      <w:pPr>
+        <w:ind w:left="260" w:hanging="200"/>
+        <w:spacing w:before="0" w:after="25" w:line="230" w:lineRule="auto"/>
+      </w:pPr>
+      <w:r>
+        <w:rPr>
+          <w:sz w:val="18"/>
+          <w:szCs w:val="18"/>
+        </w:rPr>
+        <w:t xml:space="preserve">•   </w:t>
+      </w:r>
+      <w:r>
+        <w:rPr>
+          <w:sz w:val="18"/>
+          <w:szCs w:val="18"/>
+        </w:rPr>
+        <w:t xml:space="preserve">Set DEFAULT_PAGINATION_CLASS + PAGE_SIZE globally; override per view. Response carries count/next/previous links.</w:t>
+      </w:r>
+    </w:p>
+    <w:p>
+      <w:pPr>
+        <w:ind w:left="260" w:hanging="200"/>
+        <w:spacing w:before="0" w:after="25" w:line="230" w:lineRule="auto"/>
+      </w:pPr>
+      <w:r>
+        <w:rPr>
+          <w:sz w:val="18"/>
+          <w:szCs w:val="18"/>
+        </w:rPr>
+        <w:t xml:space="preserve">•   </w:t>
+      </w:r>
+      <w:r>
+        <w:rPr>
+          <w:sz w:val="18"/>
+          <w:szCs w:val="18"/>
+        </w:rPr>
+        <w:t xml:space="preserve">django-filter integration: filterset_fields = ["status", "city"] -&gt; ?status=paid&amp;city=Surat, with FilterSet classes for ranges and custom logic.</w:t>
+      </w:r>
+    </w:p>
+    <w:p>
+      <w:pPr>
+        <w:ind w:left="260" w:hanging="200"/>
+        <w:spacing w:before="0" w:after="25" w:line="230" w:lineRule="auto"/>
+      </w:pPr>
+      <w:r>
+        <w:rPr>
+          <w:sz w:val="18"/>
+          <w:szCs w:val="18"/>
+        </w:rPr>
+        <w:t xml:space="preserve">•   </w:t>
+      </w:r>
+      <w:r>
+        <w:rPr>
+          <w:sz w:val="18"/>
+          <w:szCs w:val="18"/>
+        </w:rPr>
+        <w:t xml:space="preserve">SearchFilter: ?search=cotton across search_fields (icontains); OrderingFilter: ?ordering=-created with an allowlist via ordering_fields.</w:t>
+      </w:r>
+    </w:p>
+    <w:p>
+      <w:pPr>
+        <w:ind w:left="260" w:hanging="200"/>
+        <w:spacing w:before="0" w:after="25" w:line="230" w:lineRule="auto"/>
+      </w:pPr>
+      <w:r>
+        <w:rPr>
+          <w:sz w:val="18"/>
+          <w:szCs w:val="18"/>
+        </w:rPr>
+        <w:t xml:space="preserve">•   </w:t>
+      </w:r>
+      <w:r>
+        <w:rPr>
+          <w:sz w:val="18"/>
+          <w:szCs w:val="18"/>
+        </w:rPr>
+        <w:t xml:space="preserve">Always cap and validate what clients can request - unbounded lists and arbitrary ordering are performance holes.</w:t>
+      </w:r>
+    </w:p>
+    <w:p>
+      <w:pPr>
+        <w:ind w:left="260" w:hanging="0"/>
+        <w:spacing w:before="0" w:after="15" w:line="230" w:lineRule="auto"/>
+        <w:shd w:val="clear" w:color="auto" w:fill="F2F2F2"/>
+      </w:pPr>
+      <w:r>
+        <w:rPr>
+          <w:b/>
+          <w:sz w:val="17"/>
+          <w:szCs w:val="17"/>
+        </w:rPr>
+        <w:t xml:space="preserve">Example:  </w:t>
+      </w:r>
+      <w:r>
+        <w:rPr>
+          <w:rFonts w:ascii="Consolas" w:hAnsi="Consolas" w:cs="Consolas"/>
+          <w:color w:val="3B3B3B"/>
+          <w:sz w:val="17"/>
+          <w:szCs w:val="17"/>
+        </w:rPr>
+        <w:t xml:space="preserve">class OrderViewSet(viewsets.ModelViewSet):</w:t>
+      </w:r>
+    </w:p>
+    <w:p>
+      <w:pPr>
+        <w:ind w:left="260" w:hanging="0"/>
+        <w:spacing w:before="0" w:after="15" w:line="230" w:lineRule="auto"/>
+        <w:shd w:val="clear" w:color="auto" w:fill="F2F2F2"/>
+      </w:pPr>
+      <w:r>
+        <w:rPr>
+          <w:rFonts w:ascii="Consolas" w:hAnsi="Consolas" w:cs="Consolas"/>
+          <w:color w:val="3B3B3B"/>
+          <w:sz w:val="17"/>
+          <w:szCs w:val="17"/>
+        </w:rPr>
+        <w:t xml:space="preserve">    filter_backends = [</w:t>
+      </w:r>
+    </w:p>
+    <w:p>
+      <w:pPr>
+        <w:ind w:left="260" w:hanging="0"/>
+        <w:spacing w:before="0" w:after="15" w:line="230" w:lineRule="auto"/>
+        <w:shd w:val="clear" w:color="auto" w:fill="F2F2F2"/>
+      </w:pPr>
+      <w:r>
+        <w:rPr>
+          <w:rFonts w:ascii="Consolas" w:hAnsi="Consolas" w:cs="Consolas"/>
+          <w:color w:val="3B3B3B"/>
+          <w:sz w:val="17"/>
+          <w:szCs w:val="17"/>
+        </w:rPr>
+        <w:t xml:space="preserve">        DjangoFilterBackend,</w:t>
+      </w:r>
+    </w:p>
+    <w:p>
+      <w:pPr>
+        <w:ind w:left="260" w:hanging="0"/>
+        <w:spacing w:before="0" w:after="15" w:line="230" w:lineRule="auto"/>
+        <w:shd w:val="clear" w:color="auto" w:fill="F2F2F2"/>
+      </w:pPr>
+      <w:r>
+        <w:rPr>
+          <w:rFonts w:ascii="Consolas" w:hAnsi="Consolas" w:cs="Consolas"/>
+          <w:color w:val="3B3B3B"/>
+          <w:sz w:val="17"/>
+          <w:szCs w:val="17"/>
+        </w:rPr>
+        <w:t xml:space="preserve">        filters.SearchFilter,</w:t>
+      </w:r>
+    </w:p>
+    <w:p>
+      <w:pPr>
+        <w:ind w:left="260" w:hanging="0"/>
+        <w:spacing w:before="0" w:after="15" w:line="230" w:lineRule="auto"/>
+        <w:shd w:val="clear" w:color="auto" w:fill="F2F2F2"/>
+      </w:pPr>
+      <w:r>
+        <w:rPr>
+          <w:rFonts w:ascii="Consolas" w:hAnsi="Consolas" w:cs="Consolas"/>
+          <w:color w:val="3B3B3B"/>
+          <w:sz w:val="17"/>
+          <w:szCs w:val="17"/>
+        </w:rPr>
+        <w:t xml:space="preserve">        filters.OrderingFilter]</w:t>
+      </w:r>
+    </w:p>
+    <w:p>
+      <w:pPr>
+        <w:ind w:left="260" w:hanging="0"/>
+        <w:spacing w:before="0" w:after="15" w:line="230" w:lineRule="auto"/>
+        <w:shd w:val="clear" w:color="auto" w:fill="F2F2F2"/>
+      </w:pPr>
+      <w:r>
+        <w:rPr>
+          <w:rFonts w:ascii="Consolas" w:hAnsi="Consolas" w:cs="Consolas"/>
+          <w:color w:val="3B3B3B"/>
+          <w:sz w:val="17"/>
+          <w:szCs w:val="17"/>
+        </w:rPr>
+        <w:t xml:space="preserve">    filterset_fields = ["status"]</w:t>
+      </w:r>
+    </w:p>
+    <w:p>
+      <w:pPr>
+        <w:ind w:left="260" w:hanging="0"/>
+        <w:spacing w:before="0" w:after="15" w:line="230" w:lineRule="auto"/>
+        <w:shd w:val="clear" w:color="auto" w:fill="F2F2F2"/>
+      </w:pPr>
+      <w:r>
+        <w:rPr>
+          <w:rFonts w:ascii="Consolas" w:hAnsi="Consolas" w:cs="Consolas"/>
+          <w:color w:val="3B3B3B"/>
+          <w:sz w:val="17"/>
+          <w:szCs w:val="17"/>
+        </w:rPr>
+        <w:t xml:space="preserve">    search_fields = ["customer__name"]</w:t>
+      </w:r>
+    </w:p>
+    <w:p>
+      <w:pPr>
+        <w:ind w:left="260" w:hanging="0"/>
+        <w:spacing w:before="0" w:after="15" w:line="230" w:lineRule="auto"/>
+        <w:shd w:val="clear" w:color="auto" w:fill="F2F2F2"/>
+      </w:pPr>
+      <w:r>
+        <w:rPr>
+          <w:rFonts w:ascii="Consolas" w:hAnsi="Consolas" w:cs="Consolas"/>
+          <w:color w:val="3B3B3B"/>
+          <w:sz w:val="17"/>
+          <w:szCs w:val="17"/>
+        </w:rPr>
+        <w:t xml:space="preserve">    ordering_fields = ["created", "amount"]</w:t>
+      </w:r>
+    </w:p>
+    <w:p>
+      <w:pPr>
+        <w:ind w:left="260" w:hanging="0"/>
+        <w:spacing w:before="0" w:after="15" w:line="230" w:lineRule="auto"/>
+        <w:shd w:val="clear" w:color="auto" w:fill="F2F2F2"/>
+      </w:pPr>
+      <w:r>
+        <w:rPr>
+          <w:rFonts w:ascii="Consolas" w:hAnsi="Consolas" w:cs="Consolas"/>
+          <w:color w:val="3B3B3B"/>
+          <w:sz w:val="17"/>
+          <w:szCs w:val="17"/>
+        </w:rPr>
+        <w:t xml:space="preserve"># /orders/?status=paid&amp;search=ravi&amp;ordering=-amount</w:t>
+      </w:r>
+    </w:p>
+    <w:p>
+      <w:pPr>
+        <w:ind w:left="120" w:hanging="0"/>
+        <w:spacing w:before="50" w:after="110" w:line="230" w:lineRule="auto"/>
+        <w:pBdr>
+          <w:left w:val="single" w:sz="12" w:space="4" w:color="2E5E1F"/>
+        </w:pBdr>
+      </w:pPr>
+      <w:r>
+        <w:rPr>
+          <w:b/>
+          <w:color w:val="2E5E1F"/>
+          <w:sz w:val="18"/>
+          <w:szCs w:val="18"/>
+        </w:rPr>
+        <w:t xml:space="preserve">Interview answer:  </w:t>
+      </w:r>
+      <w:r>
+        <w:rPr>
+          <w:i/>
+          <w:sz w:val="18"/>
+          <w:szCs w:val="18"/>
+        </w:rPr>
+        <w:t xml:space="preserve">I page every list endpoint - page-number for simple UIs, cursor pagination for feeds since it stays fast and stable at depth - and wire django-filter, SearchFilter and OrderingFilter for ?status=, ?search=, ?ordering= queries, always with allowlisted fields and a capped page size so clients cannot turn a list endpoint into a full table scan.</w:t>
+      </w:r>
+    </w:p>
+    <w:p>
+      <w:pPr>
+        <w:spacing w:before="140" w:after="40" w:line="230" w:lineRule="auto"/>
+      </w:pPr>
+      <w:r>
+        <w:rPr>
+          <w:b/>
+          <w:sz w:val="21"/>
+          <w:szCs w:val="21"/>
+        </w:rPr>
+        <w:t xml:space="preserve">D4.7  Testing DRF APIs</w:t>
+      </w:r>
+    </w:p>
+    <w:p>
+      <w:pPr>
+        <w:spacing w:before="0" w:after="40" w:line="230" w:lineRule="auto"/>
+      </w:pPr>
+      <w:r>
+        <w:rPr>
+          <w:b/>
+          <w:sz w:val="18"/>
+          <w:szCs w:val="18"/>
+        </w:rPr>
+        <w:t xml:space="preserve">What it is:  </w:t>
+      </w:r>
+      <w:r>
+        <w:rPr>
+          <w:sz w:val="18"/>
+          <w:szCs w:val="18"/>
+        </w:rPr>
+        <w:t xml:space="preserve">DRF tests use APIClient/APITestCase to call endpoints like a client and assert on status codes and payloads.</w:t>
+      </w:r>
+    </w:p>
+    <w:p>
+      <w:pPr>
+        <w:ind w:left="260" w:hanging="200"/>
+        <w:spacing w:before="0" w:after="25" w:line="230" w:lineRule="auto"/>
+      </w:pPr>
+      <w:r>
+        <w:rPr>
+          <w:sz w:val="18"/>
+          <w:szCs w:val="18"/>
+        </w:rPr>
+        <w:t xml:space="preserve">•   </w:t>
+      </w:r>
+      <w:r>
+        <w:rPr>
+          <w:sz w:val="18"/>
+          <w:szCs w:val="18"/>
+        </w:rPr>
+        <w:t xml:space="preserve">APITestCase wraps each test in a transaction rolled back at the end - tests stay isolated.</w:t>
+      </w:r>
+    </w:p>
+    <w:p>
+      <w:pPr>
+        <w:ind w:left="260" w:hanging="200"/>
+        <w:spacing w:before="0" w:after="25" w:line="230" w:lineRule="auto"/>
+      </w:pPr>
+      <w:r>
+        <w:rPr>
+          <w:sz w:val="18"/>
+          <w:szCs w:val="18"/>
+        </w:rPr>
+        <w:t xml:space="preserve">•   </w:t>
+      </w:r>
+      <w:r>
+        <w:rPr>
+          <w:sz w:val="18"/>
+          <w:szCs w:val="18"/>
+        </w:rPr>
+        <w:t xml:space="preserve">client.get/post/put/delete with format="json"; assert response.status_code and response.data.</w:t>
+      </w:r>
+    </w:p>
+    <w:p>
+      <w:pPr>
+        <w:ind w:left="260" w:hanging="200"/>
+        <w:spacing w:before="0" w:after="25" w:line="230" w:lineRule="auto"/>
+      </w:pPr>
+      <w:r>
+        <w:rPr>
+          <w:sz w:val="18"/>
+          <w:szCs w:val="18"/>
+        </w:rPr>
+        <w:t xml:space="preserve">•   </w:t>
+      </w:r>
+      <w:r>
+        <w:rPr>
+          <w:sz w:val="18"/>
+          <w:szCs w:val="18"/>
+        </w:rPr>
+        <w:t xml:space="preserve">Auth in tests: client.force_authenticate(user=user) skips the login dance and tests the endpoint itself.</w:t>
+      </w:r>
+    </w:p>
+    <w:p>
+      <w:pPr>
+        <w:ind w:left="260" w:hanging="200"/>
+        <w:spacing w:before="0" w:after="25" w:line="230" w:lineRule="auto"/>
+      </w:pPr>
+      <w:r>
+        <w:rPr>
+          <w:sz w:val="18"/>
+          <w:szCs w:val="18"/>
+        </w:rPr>
+        <w:t xml:space="preserve">•   </w:t>
+      </w:r>
+      <w:r>
+        <w:rPr>
+          <w:sz w:val="18"/>
+          <w:szCs w:val="18"/>
+        </w:rPr>
+        <w:t xml:space="preserve">The permission matrix is the real value: anonymous -&gt; 401, wrong user -&gt; 403/404, owner -&gt; 200. Most API security bugs die here.</w:t>
+      </w:r>
+    </w:p>
+    <w:p>
+      <w:pPr>
+        <w:ind w:left="260" w:hanging="200"/>
+        <w:spacing w:before="0" w:after="25" w:line="230" w:lineRule="auto"/>
+      </w:pPr>
+      <w:r>
+        <w:rPr>
+          <w:sz w:val="18"/>
+          <w:szCs w:val="18"/>
+        </w:rPr>
+        <w:t xml:space="preserve">•   </w:t>
+      </w:r>
+      <w:r>
+        <w:rPr>
+          <w:sz w:val="18"/>
+          <w:szCs w:val="18"/>
+        </w:rPr>
+        <w:t xml:space="preserve">Factories (factory_boy) beat fixtures for test data - readable and maintainable.</w:t>
+      </w:r>
+    </w:p>
+    <w:p>
+      <w:pPr>
+        <w:ind w:left="260" w:hanging="200"/>
+        <w:spacing w:before="0" w:after="25" w:line="230" w:lineRule="auto"/>
+      </w:pPr>
+      <w:r>
+        <w:rPr>
+          <w:sz w:val="18"/>
+          <w:szCs w:val="18"/>
+        </w:rPr>
+        <w:t xml:space="preserve">•   </w:t>
+      </w:r>
+      <w:r>
+        <w:rPr>
+          <w:sz w:val="18"/>
+          <w:szCs w:val="18"/>
+        </w:rPr>
+        <w:t xml:space="preserve">Serializers can be unit-tested directly: feed data, assert is_valid and errors.</w:t>
+      </w:r>
+    </w:p>
+    <w:p>
+      <w:pPr>
+        <w:ind w:left="260" w:hanging="200"/>
+        <w:spacing w:before="0" w:after="25" w:line="230" w:lineRule="auto"/>
+      </w:pPr>
+      <w:r>
+        <w:rPr>
+          <w:sz w:val="18"/>
+          <w:szCs w:val="18"/>
+        </w:rPr>
+        <w:t xml:space="preserve">•   </w:t>
+      </w:r>
+      <w:r>
+        <w:rPr>
+          <w:sz w:val="18"/>
+          <w:szCs w:val="18"/>
+        </w:rPr>
+        <w:t xml:space="preserve">assertNumQueries pins the query count - the automated N+1 alarm for list endpoints.</w:t>
+      </w:r>
+    </w:p>
+    <w:p>
+      <w:pPr>
+        <w:ind w:left="260" w:hanging="0"/>
+        <w:spacing w:before="0" w:after="15" w:line="230" w:lineRule="auto"/>
+        <w:shd w:val="clear" w:color="auto" w:fill="F2F2F2"/>
+      </w:pPr>
+      <w:r>
+        <w:rPr>
+          <w:b/>
+          <w:sz w:val="17"/>
+          <w:szCs w:val="17"/>
+        </w:rPr>
+        <w:t xml:space="preserve">Example:  </w:t>
+      </w:r>
+      <w:r>
+        <w:rPr>
+          <w:rFonts w:ascii="Consolas" w:hAnsi="Consolas" w:cs="Consolas"/>
+          <w:color w:val="3B3B3B"/>
+          <w:sz w:val="17"/>
+          <w:szCs w:val="17"/>
+        </w:rPr>
+        <w:t xml:space="preserve">class OrderAPITest(APITestCase):</w:t>
+      </w:r>
+    </w:p>
+    <w:p>
+      <w:pPr>
+        <w:ind w:left="260" w:hanging="0"/>
+        <w:spacing w:before="0" w:after="15" w:line="230" w:lineRule="auto"/>
+        <w:shd w:val="clear" w:color="auto" w:fill="F2F2F2"/>
+      </w:pPr>
+      <w:r>
+        <w:rPr>
+          <w:rFonts w:ascii="Consolas" w:hAnsi="Consolas" w:cs="Consolas"/>
+          <w:color w:val="3B3B3B"/>
+          <w:sz w:val="17"/>
+          <w:szCs w:val="17"/>
+        </w:rPr>
+        <w:t xml:space="preserve">    def test_owner_only(self):</w:t>
+      </w:r>
+    </w:p>
+    <w:p>
+      <w:pPr>
+        <w:ind w:left="260" w:hanging="0"/>
+        <w:spacing w:before="0" w:after="15" w:line="230" w:lineRule="auto"/>
+        <w:shd w:val="clear" w:color="auto" w:fill="F2F2F2"/>
+      </w:pPr>
+      <w:r>
+        <w:rPr>
+          <w:rFonts w:ascii="Consolas" w:hAnsi="Consolas" w:cs="Consolas"/>
+          <w:color w:val="3B3B3B"/>
+          <w:sz w:val="17"/>
+          <w:szCs w:val="17"/>
+        </w:rPr>
+        <w:t xml:space="preserve">        self.client.force_authenticate(self.user)</w:t>
+      </w:r>
+    </w:p>
+    <w:p>
+      <w:pPr>
+        <w:ind w:left="260" w:hanging="0"/>
+        <w:spacing w:before="0" w:after="15" w:line="230" w:lineRule="auto"/>
+        <w:shd w:val="clear" w:color="auto" w:fill="F2F2F2"/>
+      </w:pPr>
+      <w:r>
+        <w:rPr>
+          <w:rFonts w:ascii="Consolas" w:hAnsi="Consolas" w:cs="Consolas"/>
+          <w:color w:val="3B3B3B"/>
+          <w:sz w:val="17"/>
+          <w:szCs w:val="17"/>
+        </w:rPr>
+        <w:t xml:space="preserve">        r = self.client.get(f"/api/orders/{self.other_users_order.id}/")</w:t>
+      </w:r>
+    </w:p>
+    <w:p>
+      <w:pPr>
+        <w:ind w:left="260" w:hanging="0"/>
+        <w:spacing w:before="0" w:after="15" w:line="230" w:lineRule="auto"/>
+        <w:shd w:val="clear" w:color="auto" w:fill="F2F2F2"/>
+      </w:pPr>
+      <w:r>
+        <w:rPr>
+          <w:rFonts w:ascii="Consolas" w:hAnsi="Consolas" w:cs="Consolas"/>
+          <w:color w:val="3B3B3B"/>
+          <w:sz w:val="17"/>
+          <w:szCs w:val="17"/>
+        </w:rPr>
+        <w:t xml:space="preserve">        self.assertEqual(r.status_code, 404)</w:t>
+      </w:r>
+    </w:p>
+    <w:p>
+      <w:pPr>
+        <w:ind w:left="260" w:hanging="0"/>
+        <w:spacing w:before="0" w:after="15" w:line="230" w:lineRule="auto"/>
+        <w:shd w:val="clear" w:color="auto" w:fill="F2F2F2"/>
+      </w:pPr>
+      <w:r>
+        <w:rPr>
+          <w:rFonts w:ascii="Consolas" w:hAnsi="Consolas" w:cs="Consolas"/>
+          <w:color w:val="3B3B3B"/>
+          <w:sz w:val="17"/>
+          <w:szCs w:val="17"/>
+        </w:rPr>
+        <w:t xml:space="preserve">    def test_list_query_count(self):</w:t>
+      </w:r>
+    </w:p>
+    <w:p>
+      <w:pPr>
+        <w:ind w:left="260" w:hanging="0"/>
+        <w:spacing w:before="0" w:after="15" w:line="230" w:lineRule="auto"/>
+        <w:shd w:val="clear" w:color="auto" w:fill="F2F2F2"/>
+      </w:pPr>
+      <w:r>
+        <w:rPr>
+          <w:rFonts w:ascii="Consolas" w:hAnsi="Consolas" w:cs="Consolas"/>
+          <w:color w:val="3B3B3B"/>
+          <w:sz w:val="17"/>
+          <w:szCs w:val="17"/>
+        </w:rPr>
+        <w:t xml:space="preserve">        with self.assertNumQueries(3):</w:t>
+      </w:r>
+    </w:p>
+    <w:p>
+      <w:pPr>
+        <w:ind w:left="260" w:hanging="0"/>
+        <w:spacing w:before="0" w:after="15" w:line="230" w:lineRule="auto"/>
+        <w:shd w:val="clear" w:color="auto" w:fill="F2F2F2"/>
+      </w:pPr>
+      <w:r>
+        <w:rPr>
+          <w:rFonts w:ascii="Consolas" w:hAnsi="Consolas" w:cs="Consolas"/>
+          <w:color w:val="3B3B3B"/>
+          <w:sz w:val="17"/>
+          <w:szCs w:val="17"/>
+        </w:rPr>
+        <w:t xml:space="preserve">            self.client.get("/api/orders/")</w:t>
+      </w:r>
+    </w:p>
+    <w:p>
+      <w:pPr>
+        <w:ind w:left="120" w:hanging="0"/>
+        <w:spacing w:before="50" w:after="110" w:line="230" w:lineRule="auto"/>
+        <w:pBdr>
+          <w:left w:val="single" w:sz="12" w:space="4" w:color="2E5E1F"/>
+        </w:pBdr>
+      </w:pPr>
+      <w:r>
+        <w:rPr>
+          <w:b/>
+          <w:color w:val="2E5E1F"/>
+          <w:sz w:val="18"/>
+          <w:szCs w:val="18"/>
+        </w:rPr>
+        <w:t xml:space="preserve">Interview answer:  </w:t>
+      </w:r>
+      <w:r>
+        <w:rPr>
+          <w:i/>
+          <w:sz w:val="18"/>
+          <w:szCs w:val="18"/>
+        </w:rPr>
+        <w:t xml:space="preserve">I test through APIClient - force_authenticate, hit the endpoint, assert status and payload - always covering the permission matrix: 401 anonymous, 403/404 wrong user, 200 owner. factory_boy builds data, serializers get direct unit tests, and assertNumQueries on list endpoints catches N+1 regressions automatically.</w:t>
       </w:r>
     </w:p>
     <w:sectPr>

</xml_diff>

<commit_message>
Django Phase 5: Production & Interview Favourites (7 topics) - Django complete, 34/34
Django vs Flask vs FastAPI, N+1 debugging, static/media, gunicorn/nginx
deployment, performance checklist, Celery, async views

Co-Authored-By: Claude Fable 5 <noreply@anthropic.com>
Claude-Session: https://claude.ai/code/session_01Vm8nqoCZNTvUn3BNmW1Tgz
</commit_message>
<xml_diff>
--- a/Django_Interview_Theory.docx
+++ b/Django_Interview_Theory.docx
@@ -8486,6 +8486,2017 @@
           <w:szCs w:val="18"/>
         </w:rPr>
         <w:t xml:space="preserve">I test through APIClient - force_authenticate, hit the endpoint, assert status and payload - always covering the permission matrix: 401 anonymous, 403/404 wrong user, 200 owner. factory_boy builds data, serializers get direct unit tests, and assertNumQueries on list endpoints catches N+1 regressions automatically.</w:t>
+      </w:r>
+    </w:p>
+    <w:p>
+      <w:pPr>
+        <w:spacing w:before="200" w:after="60" w:line="230" w:lineRule="auto"/>
+      </w:pPr>
+      <w:r>
+        <w:rPr>
+          <w:b/>
+          <w:color w:val="1F4E79"/>
+          <w:sz w:val="26"/>
+          <w:szCs w:val="26"/>
+        </w:rPr>
+        <w:t xml:space="preserve">Django Phase 5 - Production and Interview Favourites</w:t>
+      </w:r>
+    </w:p>
+    <w:p>
+      <w:pPr>
+        <w:spacing w:before="140" w:after="40" w:line="230" w:lineRule="auto"/>
+      </w:pPr>
+      <w:r>
+        <w:rPr>
+          <w:b/>
+          <w:sz w:val="21"/>
+          <w:szCs w:val="21"/>
+        </w:rPr>
+        <w:t xml:space="preserve">D5.1  Django vs Flask vs FastAPI</w:t>
+      </w:r>
+    </w:p>
+    <w:p>
+      <w:pPr>
+        <w:spacing w:before="0" w:after="40" w:line="230" w:lineRule="auto"/>
+      </w:pPr>
+      <w:r>
+        <w:rPr>
+          <w:b/>
+          <w:sz w:val="18"/>
+          <w:szCs w:val="18"/>
+        </w:rPr>
+        <w:t xml:space="preserve">What it is:  </w:t>
+      </w:r>
+      <w:r>
+        <w:rPr>
+          <w:sz w:val="18"/>
+          <w:szCs w:val="18"/>
+        </w:rPr>
+        <w:t xml:space="preserve">Django is the full-featured monolith framework, Flask the minimal classic, FastAPI the modern async-first micro-framework - the answer is trade-offs, not a winner.</w:t>
+      </w:r>
+    </w:p>
+    <w:p>
+      <w:pPr>
+        <w:ind w:left="260" w:hanging="200"/>
+        <w:spacing w:before="0" w:after="25" w:line="230" w:lineRule="auto"/>
+      </w:pPr>
+      <w:r>
+        <w:rPr>
+          <w:sz w:val="18"/>
+          <w:szCs w:val="18"/>
+        </w:rPr>
+        <w:t xml:space="preserve">•   </w:t>
+      </w:r>
+      <w:r>
+        <w:rPr>
+          <w:sz w:val="18"/>
+          <w:szCs w:val="18"/>
+        </w:rPr>
+        <w:t xml:space="preserve">Django: ORM, admin, auth, migrations built in - fastest to a serious product; opinionated structure keeps teams consistent. Sync-first (async support growing).</w:t>
+      </w:r>
+    </w:p>
+    <w:p>
+      <w:pPr>
+        <w:ind w:left="260" w:hanging="200"/>
+        <w:spacing w:before="0" w:after="25" w:line="230" w:lineRule="auto"/>
+      </w:pPr>
+      <w:r>
+        <w:rPr>
+          <w:sz w:val="18"/>
+          <w:szCs w:val="18"/>
+        </w:rPr>
+        <w:t xml:space="preserve">•   </w:t>
+      </w:r>
+      <w:r>
+        <w:rPr>
+          <w:sz w:val="18"/>
+          <w:szCs w:val="18"/>
+        </w:rPr>
+        <w:t xml:space="preserve">Flask: tiny core, everything chosen by us (SQLAlchemy, marshmallow...) - total freedom, more assembly and more decisions to maintain.</w:t>
+      </w:r>
+    </w:p>
+    <w:p>
+      <w:pPr>
+        <w:ind w:left="260" w:hanging="200"/>
+        <w:spacing w:before="0" w:after="25" w:line="230" w:lineRule="auto"/>
+      </w:pPr>
+      <w:r>
+        <w:rPr>
+          <w:sz w:val="18"/>
+          <w:szCs w:val="18"/>
+        </w:rPr>
+        <w:t xml:space="preserve">•   </w:t>
+      </w:r>
+      <w:r>
+        <w:rPr>
+          <w:sz w:val="18"/>
+          <w:szCs w:val="18"/>
+        </w:rPr>
+        <w:t xml:space="preserve">FastAPI: async-first on Starlette + Pydantic - type-hint-driven validation, auto OpenAPI docs, top raw throughput for I/O-heavy APIs. No ORM/admin/migrations of its own.</w:t>
+      </w:r>
+    </w:p>
+    <w:p>
+      <w:pPr>
+        <w:ind w:left="260" w:hanging="200"/>
+        <w:spacing w:before="0" w:after="25" w:line="230" w:lineRule="auto"/>
+      </w:pPr>
+      <w:r>
+        <w:rPr>
+          <w:sz w:val="18"/>
+          <w:szCs w:val="18"/>
+        </w:rPr>
+        <w:t xml:space="preserve">•   </w:t>
+      </w:r>
+      <w:r>
+        <w:rPr>
+          <w:sz w:val="18"/>
+          <w:szCs w:val="18"/>
+        </w:rPr>
+        <w:t xml:space="preserve">Performance nuance worth saying: the DB is usually the bottleneck, framework speed differences matter mostly on high-concurrency I/O.</w:t>
+      </w:r>
+    </w:p>
+    <w:p>
+      <w:pPr>
+        <w:ind w:left="260" w:hanging="200"/>
+        <w:spacing w:before="0" w:after="25" w:line="230" w:lineRule="auto"/>
+      </w:pPr>
+      <w:r>
+        <w:rPr>
+          <w:sz w:val="18"/>
+          <w:szCs w:val="18"/>
+        </w:rPr>
+        <w:t xml:space="preserve">•   </w:t>
+      </w:r>
+      <w:r>
+        <w:rPr>
+          <w:sz w:val="18"/>
+          <w:szCs w:val="18"/>
+        </w:rPr>
+        <w:t xml:space="preserve">Choose Django for products needing admin/auth/ORM as one unit; FastAPI for async microservices and ML model serving; Flask for small services or full control.</w:t>
+      </w:r>
+    </w:p>
+    <w:p>
+      <w:pPr>
+        <w:ind w:left="260" w:hanging="200"/>
+        <w:spacing w:before="0" w:after="25" w:line="230" w:lineRule="auto"/>
+      </w:pPr>
+      <w:r>
+        <w:rPr>
+          <w:sz w:val="18"/>
+          <w:szCs w:val="18"/>
+        </w:rPr>
+        <w:t xml:space="preserve">•   </w:t>
+      </w:r>
+      <w:r>
+        <w:rPr>
+          <w:sz w:val="18"/>
+          <w:szCs w:val="18"/>
+        </w:rPr>
+        <w:t xml:space="preserve">From my own work: Django/DRF for the main backends, FastAPI for lightweight AI-serving APIs (RAG endpoints, model inference).</w:t>
+      </w:r>
+    </w:p>
+    <w:p>
+      <w:pPr>
+        <w:ind w:left="260" w:hanging="0"/>
+        <w:spacing w:before="0" w:after="15" w:line="230" w:lineRule="auto"/>
+        <w:shd w:val="clear" w:color="auto" w:fill="F2F2F2"/>
+      </w:pPr>
+      <w:r>
+        <w:rPr>
+          <w:b/>
+          <w:sz w:val="17"/>
+          <w:szCs w:val="17"/>
+        </w:rPr>
+        <w:t xml:space="preserve">Example:  </w:t>
+      </w:r>
+      <w:r>
+        <w:rPr>
+          <w:rFonts w:ascii="Consolas" w:hAnsi="Consolas" w:cs="Consolas"/>
+          <w:color w:val="3B3B3B"/>
+          <w:sz w:val="17"/>
+          <w:szCs w:val="17"/>
+        </w:rPr>
+        <w:t xml:space="preserve">Django  -&gt; full product, admin, ORM, team scale</w:t>
+      </w:r>
+    </w:p>
+    <w:p>
+      <w:pPr>
+        <w:ind w:left="260" w:hanging="0"/>
+        <w:spacing w:before="0" w:after="15" w:line="230" w:lineRule="auto"/>
+        <w:shd w:val="clear" w:color="auto" w:fill="F2F2F2"/>
+      </w:pPr>
+      <w:r>
+        <w:rPr>
+          <w:rFonts w:ascii="Consolas" w:hAnsi="Consolas" w:cs="Consolas"/>
+          <w:color w:val="3B3B3B"/>
+          <w:sz w:val="17"/>
+          <w:szCs w:val="17"/>
+        </w:rPr>
+        <w:t xml:space="preserve">Flask   -&gt; small service, pick-your-own parts</w:t>
+      </w:r>
+    </w:p>
+    <w:p>
+      <w:pPr>
+        <w:ind w:left="260" w:hanging="0"/>
+        <w:spacing w:before="0" w:after="15" w:line="230" w:lineRule="auto"/>
+        <w:shd w:val="clear" w:color="auto" w:fill="F2F2F2"/>
+      </w:pPr>
+      <w:r>
+        <w:rPr>
+          <w:rFonts w:ascii="Consolas" w:hAnsi="Consolas" w:cs="Consolas"/>
+          <w:color w:val="3B3B3B"/>
+          <w:sz w:val="17"/>
+          <w:szCs w:val="17"/>
+        </w:rPr>
+        <w:t xml:space="preserve">FastAPI -&gt; async APIs, Pydantic, auto docs,</w:t>
+      </w:r>
+    </w:p>
+    <w:p>
+      <w:pPr>
+        <w:ind w:left="260" w:hanging="0"/>
+        <w:spacing w:before="0" w:after="15" w:line="230" w:lineRule="auto"/>
+        <w:shd w:val="clear" w:color="auto" w:fill="F2F2F2"/>
+      </w:pPr>
+      <w:r>
+        <w:rPr>
+          <w:rFonts w:ascii="Consolas" w:hAnsi="Consolas" w:cs="Consolas"/>
+          <w:color w:val="3B3B3B"/>
+          <w:sz w:val="17"/>
+          <w:szCs w:val="17"/>
+        </w:rPr>
+        <w:t xml:space="preserve">           ML/AI model serving</w:t>
+      </w:r>
+    </w:p>
+    <w:p>
+      <w:pPr>
+        <w:ind w:left="120" w:hanging="0"/>
+        <w:spacing w:before="50" w:after="110" w:line="230" w:lineRule="auto"/>
+        <w:pBdr>
+          <w:left w:val="single" w:sz="12" w:space="4" w:color="2E5E1F"/>
+        </w:pBdr>
+      </w:pPr>
+      <w:r>
+        <w:rPr>
+          <w:b/>
+          <w:color w:val="2E5E1F"/>
+          <w:sz w:val="18"/>
+          <w:szCs w:val="18"/>
+        </w:rPr>
+        <w:t xml:space="preserve">Interview answer:  </w:t>
+      </w:r>
+      <w:r>
+        <w:rPr>
+          <w:i/>
+          <w:sz w:val="18"/>
+          <w:szCs w:val="18"/>
+        </w:rPr>
+        <w:t xml:space="preserve">Django ships the whole product toolkit - ORM, admin, auth, migrations - ideal for full backends; Flask is a minimal core where we assemble everything; FastAPI is async-first with Pydantic validation and auto-docs, best for high-concurrency APIs and ML serving. I use Django/DRF for product backends and FastAPI for AI endpoints - and note the DB, not the framework, is usually the real bottleneck.</w:t>
+      </w:r>
+    </w:p>
+    <w:p>
+      <w:pPr>
+        <w:spacing w:before="140" w:after="40" w:line="230" w:lineRule="auto"/>
+      </w:pPr>
+      <w:r>
+        <w:rPr>
+          <w:b/>
+          <w:sz w:val="21"/>
+          <w:szCs w:val="21"/>
+        </w:rPr>
+        <w:t xml:space="preserve">D5.2  Detecting N+1 and Query Debugging</w:t>
+      </w:r>
+    </w:p>
+    <w:p>
+      <w:pPr>
+        <w:spacing w:before="0" w:after="40" w:line="230" w:lineRule="auto"/>
+      </w:pPr>
+      <w:r>
+        <w:rPr>
+          <w:b/>
+          <w:sz w:val="18"/>
+          <w:szCs w:val="18"/>
+        </w:rPr>
+        <w:t xml:space="preserve">What it is:  </w:t>
+      </w:r>
+      <w:r>
+        <w:rPr>
+          <w:sz w:val="18"/>
+          <w:szCs w:val="18"/>
+        </w:rPr>
+        <w:t xml:space="preserve">Slow list endpoints are usually N+1 - the tools are debug toolbar, query logging, and query-count assertions in tests.</w:t>
+      </w:r>
+    </w:p>
+    <w:p>
+      <w:pPr>
+        <w:ind w:left="260" w:hanging="200"/>
+        <w:spacing w:before="0" w:after="25" w:line="230" w:lineRule="auto"/>
+      </w:pPr>
+      <w:r>
+        <w:rPr>
+          <w:sz w:val="18"/>
+          <w:szCs w:val="18"/>
+        </w:rPr>
+        <w:t xml:space="preserve">•   </w:t>
+      </w:r>
+      <w:r>
+        <w:rPr>
+          <w:sz w:val="18"/>
+          <w:szCs w:val="18"/>
+        </w:rPr>
+        <w:t xml:space="preserve">django-debug-toolbar (dev): per-page SQL panel - count, time, duplicates flagged. A list page with 150 similar SELECTs is the smoking gun.</w:t>
+      </w:r>
+    </w:p>
+    <w:p>
+      <w:pPr>
+        <w:ind w:left="260" w:hanging="200"/>
+        <w:spacing w:before="0" w:after="25" w:line="230" w:lineRule="auto"/>
+      </w:pPr>
+      <w:r>
+        <w:rPr>
+          <w:sz w:val="18"/>
+          <w:szCs w:val="18"/>
+        </w:rPr>
+        <w:t xml:space="preserve">•   </w:t>
+      </w:r>
+      <w:r>
+        <w:rPr>
+          <w:sz w:val="18"/>
+          <w:szCs w:val="18"/>
+        </w:rPr>
+        <w:t xml:space="preserve">connection.queries in the shell (DEBUG=True) or logging django.db.backends shows every query with timing.</w:t>
+      </w:r>
+    </w:p>
+    <w:p>
+      <w:pPr>
+        <w:ind w:left="260" w:hanging="200"/>
+        <w:spacing w:before="0" w:after="25" w:line="230" w:lineRule="auto"/>
+      </w:pPr>
+      <w:r>
+        <w:rPr>
+          <w:sz w:val="18"/>
+          <w:szCs w:val="18"/>
+        </w:rPr>
+        <w:t xml:space="preserve">•   </w:t>
+      </w:r>
+      <w:r>
+        <w:rPr>
+          <w:sz w:val="18"/>
+          <w:szCs w:val="18"/>
+        </w:rPr>
+        <w:t xml:space="preserve">assertNumQueries in tests locks the count - a regression that adds queries fails CI. The proactive tool.</w:t>
+      </w:r>
+    </w:p>
+    <w:p>
+      <w:pPr>
+        <w:ind w:left="260" w:hanging="200"/>
+        <w:spacing w:before="0" w:after="25" w:line="230" w:lineRule="auto"/>
+      </w:pPr>
+      <w:r>
+        <w:rPr>
+          <w:sz w:val="18"/>
+          <w:szCs w:val="18"/>
+        </w:rPr>
+        <w:t xml:space="preserve">•   </w:t>
+      </w:r>
+      <w:r>
+        <w:rPr>
+          <w:sz w:val="18"/>
+          <w:szCs w:val="18"/>
+        </w:rPr>
+        <w:t xml:space="preserve">silk or APM tools (Sentry performance, New Relic) find slow endpoints in production.</w:t>
+      </w:r>
+    </w:p>
+    <w:p>
+      <w:pPr>
+        <w:ind w:left="260" w:hanging="200"/>
+        <w:spacing w:before="0" w:after="25" w:line="230" w:lineRule="auto"/>
+      </w:pPr>
+      <w:r>
+        <w:rPr>
+          <w:sz w:val="18"/>
+          <w:szCs w:val="18"/>
+        </w:rPr>
+        <w:t xml:space="preserve">•   </w:t>
+      </w:r>
+      <w:r>
+        <w:rPr>
+          <w:sz w:val="18"/>
+          <w:szCs w:val="18"/>
+        </w:rPr>
+        <w:t xml:space="preserve">Fix set, in order: select_related/prefetch_related for relations; values()/only() for width; annotate for per-row computed data instead of Python loops; caching last.</w:t>
+      </w:r>
+    </w:p>
+    <w:p>
+      <w:pPr>
+        <w:ind w:left="260" w:hanging="200"/>
+        <w:spacing w:before="0" w:after="25" w:line="230" w:lineRule="auto"/>
+      </w:pPr>
+      <w:r>
+        <w:rPr>
+          <w:sz w:val="18"/>
+          <w:szCs w:val="18"/>
+        </w:rPr>
+        <w:t xml:space="preserve">•   </w:t>
+      </w:r>
+      <w:r>
+        <w:rPr>
+          <w:sz w:val="18"/>
+          <w:szCs w:val="18"/>
+        </w:rPr>
+        <w:t xml:space="preserve">Also watch: queries inside template loops and inside serializer method fields - the hidden classics.</w:t>
+      </w:r>
+    </w:p>
+    <w:p>
+      <w:pPr>
+        <w:ind w:left="260" w:hanging="0"/>
+        <w:spacing w:before="0" w:after="15" w:line="230" w:lineRule="auto"/>
+        <w:shd w:val="clear" w:color="auto" w:fill="F2F2F2"/>
+      </w:pPr>
+      <w:r>
+        <w:rPr>
+          <w:b/>
+          <w:sz w:val="17"/>
+          <w:szCs w:val="17"/>
+        </w:rPr>
+        <w:t xml:space="preserve">Example:  </w:t>
+      </w:r>
+      <w:r>
+        <w:rPr>
+          <w:rFonts w:ascii="Consolas" w:hAnsi="Consolas" w:cs="Consolas"/>
+          <w:color w:val="3B3B3B"/>
+          <w:sz w:val="17"/>
+          <w:szCs w:val="17"/>
+        </w:rPr>
+        <w:t xml:space="preserve"># settings (dev)</w:t>
+      </w:r>
+    </w:p>
+    <w:p>
+      <w:pPr>
+        <w:ind w:left="260" w:hanging="0"/>
+        <w:spacing w:before="0" w:after="15" w:line="230" w:lineRule="auto"/>
+        <w:shd w:val="clear" w:color="auto" w:fill="F2F2F2"/>
+      </w:pPr>
+      <w:r>
+        <w:rPr>
+          <w:rFonts w:ascii="Consolas" w:hAnsi="Consolas" w:cs="Consolas"/>
+          <w:color w:val="3B3B3B"/>
+          <w:sz w:val="17"/>
+          <w:szCs w:val="17"/>
+        </w:rPr>
+        <w:t xml:space="preserve">LOGGING = {"loggers": {"django.db.backends":</w:t>
+      </w:r>
+    </w:p>
+    <w:p>
+      <w:pPr>
+        <w:ind w:left="260" w:hanging="0"/>
+        <w:spacing w:before="0" w:after="15" w:line="230" w:lineRule="auto"/>
+        <w:shd w:val="clear" w:color="auto" w:fill="F2F2F2"/>
+      </w:pPr>
+      <w:r>
+        <w:rPr>
+          <w:rFonts w:ascii="Consolas" w:hAnsi="Consolas" w:cs="Consolas"/>
+          <w:color w:val="3B3B3B"/>
+          <w:sz w:val="17"/>
+          <w:szCs w:val="17"/>
+        </w:rPr>
+        <w:t xml:space="preserve">  {"level": "DEBUG", "handlers": ["console"]}}}</w:t>
+      </w:r>
+    </w:p>
+    <w:p>
+      <w:pPr>
+        <w:ind w:left="260" w:hanging="0"/>
+        <w:spacing w:before="0" w:after="15" w:line="230" w:lineRule="auto"/>
+        <w:shd w:val="clear" w:color="auto" w:fill="F2F2F2"/>
+      </w:pPr>
+      <w:r>
+        <w:rPr>
+          <w:rFonts w:ascii="Consolas" w:hAnsi="Consolas" w:cs="Consolas"/>
+          <w:color w:val="3B3B3B"/>
+          <w:sz w:val="17"/>
+          <w:szCs w:val="17"/>
+        </w:rPr>
+        <w:t xml:space="preserve"># test</w:t>
+      </w:r>
+    </w:p>
+    <w:p>
+      <w:pPr>
+        <w:ind w:left="260" w:hanging="0"/>
+        <w:spacing w:before="0" w:after="15" w:line="230" w:lineRule="auto"/>
+        <w:shd w:val="clear" w:color="auto" w:fill="F2F2F2"/>
+      </w:pPr>
+      <w:r>
+        <w:rPr>
+          <w:rFonts w:ascii="Consolas" w:hAnsi="Consolas" w:cs="Consolas"/>
+          <w:color w:val="3B3B3B"/>
+          <w:sz w:val="17"/>
+          <w:szCs w:val="17"/>
+        </w:rPr>
+        <w:t xml:space="preserve">with self.assertNumQueries(3):</w:t>
+      </w:r>
+    </w:p>
+    <w:p>
+      <w:pPr>
+        <w:ind w:left="260" w:hanging="0"/>
+        <w:spacing w:before="0" w:after="15" w:line="230" w:lineRule="auto"/>
+        <w:shd w:val="clear" w:color="auto" w:fill="F2F2F2"/>
+      </w:pPr>
+      <w:r>
+        <w:rPr>
+          <w:rFonts w:ascii="Consolas" w:hAnsi="Consolas" w:cs="Consolas"/>
+          <w:color w:val="3B3B3B"/>
+          <w:sz w:val="17"/>
+          <w:szCs w:val="17"/>
+        </w:rPr>
+        <w:t xml:space="preserve">    self.client.get("/api/orders/")</w:t>
+      </w:r>
+    </w:p>
+    <w:p>
+      <w:pPr>
+        <w:ind w:left="120" w:hanging="0"/>
+        <w:spacing w:before="50" w:after="110" w:line="230" w:lineRule="auto"/>
+        <w:pBdr>
+          <w:left w:val="single" w:sz="12" w:space="4" w:color="2E5E1F"/>
+        </w:pBdr>
+      </w:pPr>
+      <w:r>
+        <w:rPr>
+          <w:b/>
+          <w:color w:val="2E5E1F"/>
+          <w:sz w:val="18"/>
+          <w:szCs w:val="18"/>
+        </w:rPr>
+        <w:t xml:space="preserve">Interview answer:  </w:t>
+      </w:r>
+      <w:r>
+        <w:rPr>
+          <w:i/>
+          <w:sz w:val="18"/>
+          <w:szCs w:val="18"/>
+        </w:rPr>
+        <w:t xml:space="preserve">I use debug toolbar's SQL panel in dev to spot duplicate query storms, log django.db.backends when needed, and pin endpoints with assertNumQueries in tests so N+1 regressions fail CI. Fixes go select_related/prefetch_related first, then column trimming with only/values, annotations instead of Python loops, and caching last. Hidden N+1s love template loops and serializer method fields.</w:t>
+      </w:r>
+    </w:p>
+    <w:p>
+      <w:pPr>
+        <w:spacing w:before="140" w:after="40" w:line="230" w:lineRule="auto"/>
+      </w:pPr>
+      <w:r>
+        <w:rPr>
+          <w:b/>
+          <w:sz w:val="21"/>
+          <w:szCs w:val="21"/>
+        </w:rPr>
+        <w:t xml:space="preserve">D5.3  Static vs Media Files</w:t>
+      </w:r>
+    </w:p>
+    <w:p>
+      <w:pPr>
+        <w:spacing w:before="0" w:after="40" w:line="230" w:lineRule="auto"/>
+      </w:pPr>
+      <w:r>
+        <w:rPr>
+          <w:b/>
+          <w:sz w:val="18"/>
+          <w:szCs w:val="18"/>
+        </w:rPr>
+        <w:t xml:space="preserve">What it is:  </w:t>
+      </w:r>
+      <w:r>
+        <w:rPr>
+          <w:sz w:val="18"/>
+          <w:szCs w:val="18"/>
+        </w:rPr>
+        <w:t xml:space="preserve">Static files are the app's own assets (CSS, JS); media files are user uploads - different settings, storage and risk profile.</w:t>
+      </w:r>
+    </w:p>
+    <w:p>
+      <w:pPr>
+        <w:ind w:left="260" w:hanging="200"/>
+        <w:spacing w:before="0" w:after="25" w:line="230" w:lineRule="auto"/>
+      </w:pPr>
+      <w:r>
+        <w:rPr>
+          <w:sz w:val="18"/>
+          <w:szCs w:val="18"/>
+        </w:rPr>
+        <w:t xml:space="preserve">•   </w:t>
+      </w:r>
+      <w:r>
+        <w:rPr>
+          <w:sz w:val="18"/>
+          <w:szCs w:val="18"/>
+        </w:rPr>
+        <w:t xml:space="preserve">Static: STATIC_URL/STATIC_ROOT; collectstatic gathers all app assets into STATIC_ROOT for deployment.</w:t>
+      </w:r>
+    </w:p>
+    <w:p>
+      <w:pPr>
+        <w:ind w:left="260" w:hanging="200"/>
+        <w:spacing w:before="0" w:after="25" w:line="230" w:lineRule="auto"/>
+      </w:pPr>
+      <w:r>
+        <w:rPr>
+          <w:sz w:val="18"/>
+          <w:szCs w:val="18"/>
+        </w:rPr>
+        <w:t xml:space="preserve">•   </w:t>
+      </w:r>
+      <w:r>
+        <w:rPr>
+          <w:sz w:val="18"/>
+          <w:szCs w:val="18"/>
+        </w:rPr>
+        <w:t xml:space="preserve">Media: MEDIA_URL/MEDIA_ROOT; FileField/ImageField store the file there and keep only the path in the DB.</w:t>
+      </w:r>
+    </w:p>
+    <w:p>
+      <w:pPr>
+        <w:ind w:left="260" w:hanging="200"/>
+        <w:spacing w:before="0" w:after="25" w:line="230" w:lineRule="auto"/>
+      </w:pPr>
+      <w:r>
+        <w:rPr>
+          <w:sz w:val="18"/>
+          <w:szCs w:val="18"/>
+        </w:rPr>
+        <w:t xml:space="preserve">•   </w:t>
+      </w:r>
+      <w:r>
+        <w:rPr>
+          <w:sz w:val="18"/>
+          <w:szCs w:val="18"/>
+        </w:rPr>
+        <w:t xml:space="preserve">Django does not serve either in production - DEBUG static serving is dev-only. nginx serves them directly, or a CDN.</w:t>
+      </w:r>
+    </w:p>
+    <w:p>
+      <w:pPr>
+        <w:ind w:left="260" w:hanging="200"/>
+        <w:spacing w:before="0" w:after="25" w:line="230" w:lineRule="auto"/>
+      </w:pPr>
+      <w:r>
+        <w:rPr>
+          <w:sz w:val="18"/>
+          <w:szCs w:val="18"/>
+        </w:rPr>
+        <w:t xml:space="preserve">•   </w:t>
+      </w:r>
+      <w:r>
+        <w:rPr>
+          <w:sz w:val="18"/>
+          <w:szCs w:val="18"/>
+        </w:rPr>
+        <w:t xml:space="preserve">WhiteNoise is the middle path: Django serves static files efficiently with caching headers - standard on PaaS (Heroku-style) deploys.</w:t>
+      </w:r>
+    </w:p>
+    <w:p>
+      <w:pPr>
+        <w:ind w:left="260" w:hanging="200"/>
+        <w:spacing w:before="0" w:after="25" w:line="230" w:lineRule="auto"/>
+      </w:pPr>
+      <w:r>
+        <w:rPr>
+          <w:sz w:val="18"/>
+          <w:szCs w:val="18"/>
+        </w:rPr>
+        <w:t xml:space="preserve">•   </w:t>
+      </w:r>
+      <w:r>
+        <w:rPr>
+          <w:sz w:val="18"/>
+          <w:szCs w:val="18"/>
+        </w:rPr>
+        <w:t xml:space="preserve">Scale/multi-server answer: django-storages + S3 for media - local disk does not survive multiple app servers or redeploys.</w:t>
+      </w:r>
+    </w:p>
+    <w:p>
+      <w:pPr>
+        <w:ind w:left="260" w:hanging="200"/>
+        <w:spacing w:before="0" w:after="25" w:line="230" w:lineRule="auto"/>
+      </w:pPr>
+      <w:r>
+        <w:rPr>
+          <w:sz w:val="18"/>
+          <w:szCs w:val="18"/>
+        </w:rPr>
+        <w:t xml:space="preserve">•   </w:t>
+      </w:r>
+      <w:r>
+        <w:rPr>
+          <w:sz w:val="18"/>
+          <w:szCs w:val="18"/>
+        </w:rPr>
+        <w:t xml:space="preserve">Media is untrusted user input: validate type/size, never execute, serve from a separate domain/bucket when possible.</w:t>
+      </w:r>
+    </w:p>
+    <w:p>
+      <w:pPr>
+        <w:ind w:left="260" w:hanging="200"/>
+        <w:spacing w:before="0" w:after="25" w:line="230" w:lineRule="auto"/>
+      </w:pPr>
+      <w:r>
+        <w:rPr>
+          <w:sz w:val="18"/>
+          <w:szCs w:val="18"/>
+        </w:rPr>
+        <w:t xml:space="preserve">•   </w:t>
+      </w:r>
+      <w:r>
+        <w:rPr>
+          <w:sz w:val="18"/>
+          <w:szCs w:val="18"/>
+        </w:rPr>
+        <w:t xml:space="preserve">ManifestStaticFilesStorage adds content hashes to static names - cache-busting on deploys.</w:t>
+      </w:r>
+    </w:p>
+    <w:p>
+      <w:pPr>
+        <w:ind w:left="260" w:hanging="0"/>
+        <w:spacing w:before="0" w:after="15" w:line="230" w:lineRule="auto"/>
+        <w:shd w:val="clear" w:color="auto" w:fill="F2F2F2"/>
+      </w:pPr>
+      <w:r>
+        <w:rPr>
+          <w:b/>
+          <w:sz w:val="17"/>
+          <w:szCs w:val="17"/>
+        </w:rPr>
+        <w:t xml:space="preserve">Example:  </w:t>
+      </w:r>
+      <w:r>
+        <w:rPr>
+          <w:rFonts w:ascii="Consolas" w:hAnsi="Consolas" w:cs="Consolas"/>
+          <w:color w:val="3B3B3B"/>
+          <w:sz w:val="17"/>
+          <w:szCs w:val="17"/>
+        </w:rPr>
+        <w:t xml:space="preserve">STATIC_ROOT = BASE_DIR / "staticfiles"</w:t>
+      </w:r>
+    </w:p>
+    <w:p>
+      <w:pPr>
+        <w:ind w:left="260" w:hanging="0"/>
+        <w:spacing w:before="0" w:after="15" w:line="230" w:lineRule="auto"/>
+        <w:shd w:val="clear" w:color="auto" w:fill="F2F2F2"/>
+      </w:pPr>
+      <w:r>
+        <w:rPr>
+          <w:rFonts w:ascii="Consolas" w:hAnsi="Consolas" w:cs="Consolas"/>
+          <w:color w:val="3B3B3B"/>
+          <w:sz w:val="17"/>
+          <w:szCs w:val="17"/>
+        </w:rPr>
+        <w:t xml:space="preserve">MEDIA_ROOT = BASE_DIR / "media"</w:t>
+      </w:r>
+    </w:p>
+    <w:p>
+      <w:pPr>
+        <w:ind w:left="260" w:hanging="0"/>
+        <w:spacing w:before="0" w:after="15" w:line="230" w:lineRule="auto"/>
+        <w:shd w:val="clear" w:color="auto" w:fill="F2F2F2"/>
+      </w:pPr>
+      <w:r>
+        <w:rPr>
+          <w:rFonts w:ascii="Consolas" w:hAnsi="Consolas" w:cs="Consolas"/>
+          <w:color w:val="3B3B3B"/>
+          <w:sz w:val="17"/>
+          <w:szCs w:val="17"/>
+        </w:rPr>
+        <w:t xml:space="preserve"># prod media on S3:</w:t>
+      </w:r>
+    </w:p>
+    <w:p>
+      <w:pPr>
+        <w:ind w:left="260" w:hanging="0"/>
+        <w:spacing w:before="0" w:after="15" w:line="230" w:lineRule="auto"/>
+        <w:shd w:val="clear" w:color="auto" w:fill="F2F2F2"/>
+      </w:pPr>
+      <w:r>
+        <w:rPr>
+          <w:rFonts w:ascii="Consolas" w:hAnsi="Consolas" w:cs="Consolas"/>
+          <w:color w:val="3B3B3B"/>
+          <w:sz w:val="17"/>
+          <w:szCs w:val="17"/>
+        </w:rPr>
+        <w:t xml:space="preserve">DEFAULT_FILE_STORAGE = (</w:t>
+      </w:r>
+    </w:p>
+    <w:p>
+      <w:pPr>
+        <w:ind w:left="260" w:hanging="0"/>
+        <w:spacing w:before="0" w:after="15" w:line="230" w:lineRule="auto"/>
+        <w:shd w:val="clear" w:color="auto" w:fill="F2F2F2"/>
+      </w:pPr>
+      <w:r>
+        <w:rPr>
+          <w:rFonts w:ascii="Consolas" w:hAnsi="Consolas" w:cs="Consolas"/>
+          <w:color w:val="3B3B3B"/>
+          <w:sz w:val="17"/>
+          <w:szCs w:val="17"/>
+        </w:rPr>
+        <w:t xml:space="preserve">  "storages.backends.s3boto3.S3Boto3Storage")</w:t>
+      </w:r>
+    </w:p>
+    <w:p>
+      <w:pPr>
+        <w:ind w:left="120" w:hanging="0"/>
+        <w:spacing w:before="50" w:after="110" w:line="230" w:lineRule="auto"/>
+        <w:pBdr>
+          <w:left w:val="single" w:sz="12" w:space="4" w:color="2E5E1F"/>
+        </w:pBdr>
+      </w:pPr>
+      <w:r>
+        <w:rPr>
+          <w:b/>
+          <w:color w:val="2E5E1F"/>
+          <w:sz w:val="18"/>
+          <w:szCs w:val="18"/>
+        </w:rPr>
+        <w:t xml:space="preserve">Interview answer:  </w:t>
+      </w:r>
+      <w:r>
+        <w:rPr>
+          <w:i/>
+          <w:sz w:val="18"/>
+          <w:szCs w:val="18"/>
+        </w:rPr>
+        <w:t xml:space="preserve">Static files are deploy-time app assets collected by collectstatic and served by nginx, WhiteNoise or a CDN with hashed names for cache busting; media files are user uploads under MEDIA_ROOT, moved to S3 via django-storages once there is more than one server. Django itself serves neither in production, and uploads are untrusted input to validate.</w:t>
+      </w:r>
+    </w:p>
+    <w:p>
+      <w:pPr>
+        <w:spacing w:before="140" w:after="40" w:line="230" w:lineRule="auto"/>
+      </w:pPr>
+      <w:r>
+        <w:rPr>
+          <w:b/>
+          <w:sz w:val="21"/>
+          <w:szCs w:val="21"/>
+        </w:rPr>
+        <w:t xml:space="preserve">D5.4  Deployment - gunicorn, nginx, WSGI/ASGI</w:t>
+      </w:r>
+    </w:p>
+    <w:p>
+      <w:pPr>
+        <w:spacing w:before="0" w:after="40" w:line="230" w:lineRule="auto"/>
+      </w:pPr>
+      <w:r>
+        <w:rPr>
+          <w:b/>
+          <w:sz w:val="18"/>
+          <w:szCs w:val="18"/>
+        </w:rPr>
+        <w:t xml:space="preserve">What it is:  </w:t>
+      </w:r>
+      <w:r>
+        <w:rPr>
+          <w:sz w:val="18"/>
+          <w:szCs w:val="18"/>
+        </w:rPr>
+        <w:t xml:space="preserve">The standard stack is nginx in front, gunicorn running Django workers behind it, managed by systemd or a container - ASGI/uvicorn when async matters.</w:t>
+      </w:r>
+    </w:p>
+    <w:p>
+      <w:pPr>
+        <w:ind w:left="260" w:hanging="200"/>
+        <w:spacing w:before="0" w:after="25" w:line="230" w:lineRule="auto"/>
+      </w:pPr>
+      <w:r>
+        <w:rPr>
+          <w:sz w:val="18"/>
+          <w:szCs w:val="18"/>
+        </w:rPr>
+        <w:t xml:space="preserve">•   </w:t>
+      </w:r>
+      <w:r>
+        <w:rPr>
+          <w:sz w:val="18"/>
+          <w:szCs w:val="18"/>
+        </w:rPr>
+        <w:t xml:space="preserve">nginx: TLS termination, serves /static and /media from disk, buffers slow clients, proxies app requests to gunicorn.</w:t>
+      </w:r>
+    </w:p>
+    <w:p>
+      <w:pPr>
+        <w:ind w:left="260" w:hanging="200"/>
+        <w:spacing w:before="0" w:after="25" w:line="230" w:lineRule="auto"/>
+      </w:pPr>
+      <w:r>
+        <w:rPr>
+          <w:sz w:val="18"/>
+          <w:szCs w:val="18"/>
+        </w:rPr>
+        <w:t xml:space="preserve">•   </w:t>
+      </w:r>
+      <w:r>
+        <w:rPr>
+          <w:sz w:val="18"/>
+          <w:szCs w:val="18"/>
+        </w:rPr>
+        <w:t xml:space="preserve">gunicorn: process manager running N WSGI workers (rule of thumb 2-4 x CPU cores); a hung worker is recycled, max-requests recycles them periodically against leaks.</w:t>
+      </w:r>
+    </w:p>
+    <w:p>
+      <w:pPr>
+        <w:ind w:left="260" w:hanging="200"/>
+        <w:spacing w:before="0" w:after="25" w:line="230" w:lineRule="auto"/>
+      </w:pPr>
+      <w:r>
+        <w:rPr>
+          <w:sz w:val="18"/>
+          <w:szCs w:val="18"/>
+        </w:rPr>
+        <w:t xml:space="preserve">•   </w:t>
+      </w:r>
+      <w:r>
+        <w:rPr>
+          <w:sz w:val="18"/>
+          <w:szCs w:val="18"/>
+        </w:rPr>
+        <w:t xml:space="preserve">WSGI = sync Python web interface (gunicorn/uwsgi); ASGI = async successor (uvicorn/daphne) - needed for async views, websockets/Channels.</w:t>
+      </w:r>
+    </w:p>
+    <w:p>
+      <w:pPr>
+        <w:ind w:left="260" w:hanging="200"/>
+        <w:spacing w:before="0" w:after="25" w:line="230" w:lineRule="auto"/>
+      </w:pPr>
+      <w:r>
+        <w:rPr>
+          <w:sz w:val="18"/>
+          <w:szCs w:val="18"/>
+        </w:rPr>
+        <w:t xml:space="preserve">•   </w:t>
+      </w:r>
+      <w:r>
+        <w:rPr>
+          <w:sz w:val="18"/>
+          <w:szCs w:val="18"/>
+        </w:rPr>
+        <w:t xml:space="preserve">runserver is a dev tool only - single-threaded, no security hardening.</w:t>
+      </w:r>
+    </w:p>
+    <w:p>
+      <w:pPr>
+        <w:ind w:left="260" w:hanging="200"/>
+        <w:spacing w:before="0" w:after="25" w:line="230" w:lineRule="auto"/>
+      </w:pPr>
+      <w:r>
+        <w:rPr>
+          <w:sz w:val="18"/>
+          <w:szCs w:val="18"/>
+        </w:rPr>
+        <w:t xml:space="preserve">•   </w:t>
+      </w:r>
+      <w:r>
+        <w:rPr>
+          <w:sz w:val="18"/>
+          <w:szCs w:val="18"/>
+        </w:rPr>
+        <w:t xml:space="preserve">Deploy checklist: DEBUG=False, ALLOWED_HOSTS set, secrets in env, migrate, collectstatic, check --deploy.</w:t>
+      </w:r>
+    </w:p>
+    <w:p>
+      <w:pPr>
+        <w:ind w:left="260" w:hanging="200"/>
+        <w:spacing w:before="0" w:after="25" w:line="230" w:lineRule="auto"/>
+      </w:pPr>
+      <w:r>
+        <w:rPr>
+          <w:sz w:val="18"/>
+          <w:szCs w:val="18"/>
+        </w:rPr>
+        <w:t xml:space="preserve">•   </w:t>
+      </w:r>
+      <w:r>
+        <w:rPr>
+          <w:sz w:val="18"/>
+          <w:szCs w:val="18"/>
+        </w:rPr>
+        <w:t xml:space="preserve">Containers: Dockerfile runs gunicorn; compose/k8s adds Postgres, Redis, Celery workers - my projects ship this way with CI/CD.</w:t>
+      </w:r>
+    </w:p>
+    <w:p>
+      <w:pPr>
+        <w:ind w:left="260" w:hanging="200"/>
+        <w:spacing w:before="0" w:after="25" w:line="230" w:lineRule="auto"/>
+      </w:pPr>
+      <w:r>
+        <w:rPr>
+          <w:sz w:val="18"/>
+          <w:szCs w:val="18"/>
+        </w:rPr>
+        <w:t xml:space="preserve">•   </w:t>
+      </w:r>
+      <w:r>
+        <w:rPr>
+          <w:sz w:val="18"/>
+          <w:szCs w:val="18"/>
+        </w:rPr>
+        <w:t xml:space="preserve">Zero-downtime basics: run migrations before switching traffic, keep migrations backward-compatible one release.</w:t>
+      </w:r>
+    </w:p>
+    <w:p>
+      <w:pPr>
+        <w:ind w:left="260" w:hanging="0"/>
+        <w:spacing w:before="0" w:after="15" w:line="230" w:lineRule="auto"/>
+        <w:shd w:val="clear" w:color="auto" w:fill="F2F2F2"/>
+      </w:pPr>
+      <w:r>
+        <w:rPr>
+          <w:b/>
+          <w:sz w:val="17"/>
+          <w:szCs w:val="17"/>
+        </w:rPr>
+        <w:t xml:space="preserve">Example:  </w:t>
+      </w:r>
+      <w:r>
+        <w:rPr>
+          <w:rFonts w:ascii="Consolas" w:hAnsi="Consolas" w:cs="Consolas"/>
+          <w:color w:val="3B3B3B"/>
+          <w:sz w:val="17"/>
+          <w:szCs w:val="17"/>
+        </w:rPr>
+        <w:t xml:space="preserve">gunicorn shop.wsgi:application \</w:t>
+      </w:r>
+    </w:p>
+    <w:p>
+      <w:pPr>
+        <w:ind w:left="260" w:hanging="0"/>
+        <w:spacing w:before="0" w:after="15" w:line="230" w:lineRule="auto"/>
+        <w:shd w:val="clear" w:color="auto" w:fill="F2F2F2"/>
+      </w:pPr>
+      <w:r>
+        <w:rPr>
+          <w:rFonts w:ascii="Consolas" w:hAnsi="Consolas" w:cs="Consolas"/>
+          <w:color w:val="3B3B3B"/>
+          <w:sz w:val="17"/>
+          <w:szCs w:val="17"/>
+        </w:rPr>
+        <w:t xml:space="preserve">  --workers 4 --bind 127.0.0.1:8000 \</w:t>
+      </w:r>
+    </w:p>
+    <w:p>
+      <w:pPr>
+        <w:ind w:left="260" w:hanging="0"/>
+        <w:spacing w:before="0" w:after="15" w:line="230" w:lineRule="auto"/>
+        <w:shd w:val="clear" w:color="auto" w:fill="F2F2F2"/>
+      </w:pPr>
+      <w:r>
+        <w:rPr>
+          <w:rFonts w:ascii="Consolas" w:hAnsi="Consolas" w:cs="Consolas"/>
+          <w:color w:val="3B3B3B"/>
+          <w:sz w:val="17"/>
+          <w:szCs w:val="17"/>
+        </w:rPr>
+        <w:t xml:space="preserve">  --max-requests 1000</w:t>
+      </w:r>
+    </w:p>
+    <w:p>
+      <w:pPr>
+        <w:ind w:left="260" w:hanging="0"/>
+        <w:spacing w:before="0" w:after="15" w:line="230" w:lineRule="auto"/>
+        <w:shd w:val="clear" w:color="auto" w:fill="F2F2F2"/>
+      </w:pPr>
+      <w:r>
+        <w:rPr>
+          <w:rFonts w:ascii="Consolas" w:hAnsi="Consolas" w:cs="Consolas"/>
+          <w:color w:val="3B3B3B"/>
+          <w:sz w:val="17"/>
+          <w:szCs w:val="17"/>
+        </w:rPr>
+        <w:t xml:space="preserve"># nginx: location /static/ { alias ...; }</w:t>
+      </w:r>
+    </w:p>
+    <w:p>
+      <w:pPr>
+        <w:ind w:left="260" w:hanging="0"/>
+        <w:spacing w:before="0" w:after="15" w:line="230" w:lineRule="auto"/>
+        <w:shd w:val="clear" w:color="auto" w:fill="F2F2F2"/>
+      </w:pPr>
+      <w:r>
+        <w:rPr>
+          <w:rFonts w:ascii="Consolas" w:hAnsi="Consolas" w:cs="Consolas"/>
+          <w:color w:val="3B3B3B"/>
+          <w:sz w:val="17"/>
+          <w:szCs w:val="17"/>
+        </w:rPr>
+        <w:t xml:space="preserve">#        location / { proxy_pass http://127.0.0.1:8000; }</w:t>
+      </w:r>
+    </w:p>
+    <w:p>
+      <w:pPr>
+        <w:ind w:left="120" w:hanging="0"/>
+        <w:spacing w:before="50" w:after="110" w:line="230" w:lineRule="auto"/>
+        <w:pBdr>
+          <w:left w:val="single" w:sz="12" w:space="4" w:color="2E5E1F"/>
+        </w:pBdr>
+      </w:pPr>
+      <w:r>
+        <w:rPr>
+          <w:b/>
+          <w:color w:val="2E5E1F"/>
+          <w:sz w:val="18"/>
+          <w:szCs w:val="18"/>
+        </w:rPr>
+        <w:t xml:space="preserve">Interview answer:  </w:t>
+      </w:r>
+      <w:r>
+        <w:rPr>
+          <w:i/>
+          <w:sz w:val="18"/>
+          <w:szCs w:val="18"/>
+        </w:rPr>
+        <w:t xml:space="preserve">nginx terminates TLS, serves static/media and proxies to gunicorn, which runs multiple WSGI workers sized to CPU cores; ASGI with uvicorn replaces it when async or websockets are needed. Production flips DEBUG off, loads secrets from env, runs migrate + collectstatic, and in my projects this is containerized with Docker and rolled out via CI/CD with backward-compatible migrations.</w:t>
+      </w:r>
+    </w:p>
+    <w:p>
+      <w:pPr>
+        <w:spacing w:before="140" w:after="40" w:line="230" w:lineRule="auto"/>
+      </w:pPr>
+      <w:r>
+        <w:rPr>
+          <w:b/>
+          <w:sz w:val="21"/>
+          <w:szCs w:val="21"/>
+        </w:rPr>
+        <w:t xml:space="preserve">D5.5  Performance Checklist</w:t>
+      </w:r>
+    </w:p>
+    <w:p>
+      <w:pPr>
+        <w:spacing w:before="0" w:after="40" w:line="230" w:lineRule="auto"/>
+      </w:pPr>
+      <w:r>
+        <w:rPr>
+          <w:b/>
+          <w:sz w:val="18"/>
+          <w:szCs w:val="18"/>
+        </w:rPr>
+        <w:t xml:space="preserve">What it is:  </w:t>
+      </w:r>
+      <w:r>
+        <w:rPr>
+          <w:sz w:val="18"/>
+          <w:szCs w:val="18"/>
+        </w:rPr>
+        <w:t xml:space="preserve">Django performance work, in priority order: fix queries, trim data, cache, then offload - measured before and after.</w:t>
+      </w:r>
+    </w:p>
+    <w:p>
+      <w:pPr>
+        <w:ind w:left="260" w:hanging="200"/>
+        <w:spacing w:before="0" w:after="25" w:line="230" w:lineRule="auto"/>
+      </w:pPr>
+      <w:r>
+        <w:rPr>
+          <w:sz w:val="18"/>
+          <w:szCs w:val="18"/>
+        </w:rPr>
+        <w:t xml:space="preserve">•   </w:t>
+      </w:r>
+      <w:r>
+        <w:rPr>
+          <w:sz w:val="18"/>
+          <w:szCs w:val="18"/>
+        </w:rPr>
+        <w:t xml:space="preserve">1. Queries first: kill N+1 (select_related/prefetch_related), add DB indexes (db_index, Meta.indexes) matching real filters, EXPLAIN slow ones.</w:t>
+      </w:r>
+    </w:p>
+    <w:p>
+      <w:pPr>
+        <w:ind w:left="260" w:hanging="200"/>
+        <w:spacing w:before="0" w:after="25" w:line="230" w:lineRule="auto"/>
+      </w:pPr>
+      <w:r>
+        <w:rPr>
+          <w:sz w:val="18"/>
+          <w:szCs w:val="18"/>
+        </w:rPr>
+        <w:t xml:space="preserve">•   </w:t>
+      </w:r>
+      <w:r>
+        <w:rPr>
+          <w:sz w:val="18"/>
+          <w:szCs w:val="18"/>
+        </w:rPr>
+        <w:t xml:space="preserve">2. Fetch less: only()/defer()/values() for wide tables, paginate everything, count() and exists() instead of loading rows.</w:t>
+      </w:r>
+    </w:p>
+    <w:p>
+      <w:pPr>
+        <w:ind w:left="260" w:hanging="200"/>
+        <w:spacing w:before="0" w:after="25" w:line="230" w:lineRule="auto"/>
+      </w:pPr>
+      <w:r>
+        <w:rPr>
+          <w:sz w:val="18"/>
+          <w:szCs w:val="18"/>
+        </w:rPr>
+        <w:t xml:space="preserve">•   </w:t>
+      </w:r>
+      <w:r>
+        <w:rPr>
+          <w:sz w:val="18"/>
+          <w:szCs w:val="18"/>
+        </w:rPr>
+        <w:t xml:space="preserve">3. Push work to the DB: annotate/aggregate/F-updates instead of Python loops; bulk_create/bulk_update for mass writes.</w:t>
+      </w:r>
+    </w:p>
+    <w:p>
+      <w:pPr>
+        <w:ind w:left="260" w:hanging="200"/>
+        <w:spacing w:before="0" w:after="25" w:line="230" w:lineRule="auto"/>
+      </w:pPr>
+      <w:r>
+        <w:rPr>
+          <w:sz w:val="18"/>
+          <w:szCs w:val="18"/>
+        </w:rPr>
+        <w:t xml:space="preserve">•   </w:t>
+      </w:r>
+      <w:r>
+        <w:rPr>
+          <w:sz w:val="18"/>
+          <w:szCs w:val="18"/>
+        </w:rPr>
+        <w:t xml:space="preserve">4. Cache: Redis via get_or_set on hot expensive reads, cache_page on read-heavy endpoints, cached_property in objects.</w:t>
+      </w:r>
+    </w:p>
+    <w:p>
+      <w:pPr>
+        <w:ind w:left="260" w:hanging="200"/>
+        <w:spacing w:before="0" w:after="25" w:line="230" w:lineRule="auto"/>
+      </w:pPr>
+      <w:r>
+        <w:rPr>
+          <w:sz w:val="18"/>
+          <w:szCs w:val="18"/>
+        </w:rPr>
+        <w:t xml:space="preserve">•   </w:t>
+      </w:r>
+      <w:r>
+        <w:rPr>
+          <w:sz w:val="18"/>
+          <w:szCs w:val="18"/>
+        </w:rPr>
+        <w:t xml:space="preserve">5. Offload: Celery for anything slow or external (emails, PDFs, API calls) - web workers must stay fast.</w:t>
+      </w:r>
+    </w:p>
+    <w:p>
+      <w:pPr>
+        <w:ind w:left="260" w:hanging="200"/>
+        <w:spacing w:before="0" w:after="25" w:line="230" w:lineRule="auto"/>
+      </w:pPr>
+      <w:r>
+        <w:rPr>
+          <w:sz w:val="18"/>
+          <w:szCs w:val="18"/>
+        </w:rPr>
+        <w:t xml:space="preserve">•   </w:t>
+      </w:r>
+      <w:r>
+        <w:rPr>
+          <w:sz w:val="18"/>
+          <w:szCs w:val="18"/>
+        </w:rPr>
+        <w:t xml:space="preserve">6. Infra: connection pooling (CONN_MAX_AGE/pgbouncer), gunicorn worker tuning, CDN for assets.</w:t>
+      </w:r>
+    </w:p>
+    <w:p>
+      <w:pPr>
+        <w:ind w:left="260" w:hanging="200"/>
+        <w:spacing w:before="0" w:after="25" w:line="230" w:lineRule="auto"/>
+      </w:pPr>
+      <w:r>
+        <w:rPr>
+          <w:sz w:val="18"/>
+          <w:szCs w:val="18"/>
+        </w:rPr>
+        <w:t xml:space="preserve">•   </w:t>
+      </w:r>
+      <w:r>
+        <w:rPr>
+          <w:sz w:val="18"/>
+          <w:szCs w:val="18"/>
+        </w:rPr>
+        <w:t xml:space="preserve">Always measure - debug toolbar/silk/APM before and after; optimizing without numbers is guessing.</w:t>
+      </w:r>
+    </w:p>
+    <w:p>
+      <w:pPr>
+        <w:ind w:left="260" w:hanging="0"/>
+        <w:spacing w:before="0" w:after="15" w:line="230" w:lineRule="auto"/>
+        <w:shd w:val="clear" w:color="auto" w:fill="F2F2F2"/>
+      </w:pPr>
+      <w:r>
+        <w:rPr>
+          <w:b/>
+          <w:sz w:val="17"/>
+          <w:szCs w:val="17"/>
+        </w:rPr>
+        <w:t xml:space="preserve">Example:  </w:t>
+      </w:r>
+      <w:r>
+        <w:rPr>
+          <w:rFonts w:ascii="Consolas" w:hAnsi="Consolas" w:cs="Consolas"/>
+          <w:color w:val="3B3B3B"/>
+          <w:sz w:val="17"/>
+          <w:szCs w:val="17"/>
+        </w:rPr>
+        <w:t xml:space="preserve">Order.objects.bulk_create(rows, batch_size=1000)</w:t>
+      </w:r>
+    </w:p>
+    <w:p>
+      <w:pPr>
+        <w:ind w:left="260" w:hanging="0"/>
+        <w:spacing w:before="0" w:after="15" w:line="230" w:lineRule="auto"/>
+        <w:shd w:val="clear" w:color="auto" w:fill="F2F2F2"/>
+      </w:pPr>
+      <w:r>
+        <w:rPr>
+          <w:rFonts w:ascii="Consolas" w:hAnsi="Consolas" w:cs="Consolas"/>
+          <w:color w:val="3B3B3B"/>
+          <w:sz w:val="17"/>
+          <w:szCs w:val="17"/>
+        </w:rPr>
+        <w:t xml:space="preserve">Product.objects.filter(pk=i).update(</w:t>
+      </w:r>
+    </w:p>
+    <w:p>
+      <w:pPr>
+        <w:ind w:left="260" w:hanging="0"/>
+        <w:spacing w:before="0" w:after="15" w:line="230" w:lineRule="auto"/>
+        <w:shd w:val="clear" w:color="auto" w:fill="F2F2F2"/>
+      </w:pPr>
+      <w:r>
+        <w:rPr>
+          <w:rFonts w:ascii="Consolas" w:hAnsi="Consolas" w:cs="Consolas"/>
+          <w:color w:val="3B3B3B"/>
+          <w:sz w:val="17"/>
+          <w:szCs w:val="17"/>
+        </w:rPr>
+        <w:t xml:space="preserve">    views=F("views") + 1)</w:t>
+      </w:r>
+    </w:p>
+    <w:p>
+      <w:pPr>
+        <w:ind w:left="260" w:hanging="0"/>
+        <w:spacing w:before="0" w:after="15" w:line="230" w:lineRule="auto"/>
+        <w:shd w:val="clear" w:color="auto" w:fill="F2F2F2"/>
+      </w:pPr>
+      <w:r>
+        <w:rPr>
+          <w:rFonts w:ascii="Consolas" w:hAnsi="Consolas" w:cs="Consolas"/>
+          <w:color w:val="3B3B3B"/>
+          <w:sz w:val="17"/>
+          <w:szCs w:val="17"/>
+        </w:rPr>
+        <w:t xml:space="preserve">cache.get_or_set("stats", compute, 300)</w:t>
+      </w:r>
+    </w:p>
+    <w:p>
+      <w:pPr>
+        <w:ind w:left="120" w:hanging="0"/>
+        <w:spacing w:before="50" w:after="110" w:line="230" w:lineRule="auto"/>
+        <w:pBdr>
+          <w:left w:val="single" w:sz="12" w:space="4" w:color="2E5E1F"/>
+        </w:pBdr>
+      </w:pPr>
+      <w:r>
+        <w:rPr>
+          <w:b/>
+          <w:color w:val="2E5E1F"/>
+          <w:sz w:val="18"/>
+          <w:szCs w:val="18"/>
+        </w:rPr>
+        <w:t xml:space="preserve">Interview answer:  </w:t>
+      </w:r>
+      <w:r>
+        <w:rPr>
+          <w:i/>
+          <w:sz w:val="18"/>
+          <w:szCs w:val="18"/>
+        </w:rPr>
+        <w:t xml:space="preserve">My order: fix N+1 and add matching indexes, fetch less with only/values and pagination, push computation into the DB with annotate and bulk operations, cache hot reads in Redis, offload slow work to Celery, then tune pooling and workers - measuring with debug toolbar or APM before and after each step.</w:t>
+      </w:r>
+    </w:p>
+    <w:p>
+      <w:pPr>
+        <w:spacing w:before="140" w:after="40" w:line="230" w:lineRule="auto"/>
+      </w:pPr>
+      <w:r>
+        <w:rPr>
+          <w:b/>
+          <w:sz w:val="21"/>
+          <w:szCs w:val="21"/>
+        </w:rPr>
+        <w:t xml:space="preserve">D5.6  Celery - Background Tasks</w:t>
+      </w:r>
+    </w:p>
+    <w:p>
+      <w:pPr>
+        <w:spacing w:before="0" w:after="40" w:line="230" w:lineRule="auto"/>
+      </w:pPr>
+      <w:r>
+        <w:rPr>
+          <w:b/>
+          <w:sz w:val="18"/>
+          <w:szCs w:val="18"/>
+        </w:rPr>
+        <w:t xml:space="preserve">What it is:  </w:t>
+      </w:r>
+      <w:r>
+        <w:rPr>
+          <w:sz w:val="18"/>
+          <w:szCs w:val="18"/>
+        </w:rPr>
+        <w:t xml:space="preserve">Celery runs work outside the request cycle - separate worker processes consume tasks from a broker like Redis - so slow jobs never block API responses.</w:t>
+      </w:r>
+    </w:p>
+    <w:p>
+      <w:pPr>
+        <w:ind w:left="260" w:hanging="200"/>
+        <w:spacing w:before="0" w:after="25" w:line="230" w:lineRule="auto"/>
+      </w:pPr>
+      <w:r>
+        <w:rPr>
+          <w:sz w:val="18"/>
+          <w:szCs w:val="18"/>
+        </w:rPr>
+        <w:t xml:space="preserve">•   </w:t>
+      </w:r>
+      <w:r>
+        <w:rPr>
+          <w:sz w:val="18"/>
+          <w:szCs w:val="18"/>
+        </w:rPr>
+        <w:t xml:space="preserve">Flow: view calls task.delay(args) -&gt; task message goes to the broker (Redis/RabbitMQ) -&gt; a worker process picks it up and runs it -&gt; optional result backend stores the outcome.</w:t>
+      </w:r>
+    </w:p>
+    <w:p>
+      <w:pPr>
+        <w:ind w:left="260" w:hanging="200"/>
+        <w:spacing w:before="0" w:after="25" w:line="230" w:lineRule="auto"/>
+      </w:pPr>
+      <w:r>
+        <w:rPr>
+          <w:sz w:val="18"/>
+          <w:szCs w:val="18"/>
+        </w:rPr>
+        <w:t xml:space="preserve">•   </w:t>
+      </w:r>
+      <w:r>
+        <w:rPr>
+          <w:sz w:val="18"/>
+          <w:szCs w:val="18"/>
+        </w:rPr>
+        <w:t xml:space="preserve">Belongs in Celery: emails/SMS, report and PDF generation, third-party API calls, image processing, scheduled jobs (celery beat as cron).</w:t>
+      </w:r>
+    </w:p>
+    <w:p>
+      <w:pPr>
+        <w:ind w:left="260" w:hanging="200"/>
+        <w:spacing w:before="0" w:after="25" w:line="230" w:lineRule="auto"/>
+      </w:pPr>
+      <w:r>
+        <w:rPr>
+          <w:sz w:val="18"/>
+          <w:szCs w:val="18"/>
+        </w:rPr>
+        <w:t xml:space="preserve">•   </w:t>
+      </w:r>
+      <w:r>
+        <w:rPr>
+          <w:sz w:val="18"/>
+          <w:szCs w:val="18"/>
+        </w:rPr>
+        <w:t xml:space="preserve">Pass IDs, not objects: the row may change between enqueue and execution - refetch inside the task.</w:t>
+      </w:r>
+    </w:p>
+    <w:p>
+      <w:pPr>
+        <w:ind w:left="260" w:hanging="200"/>
+        <w:spacing w:before="0" w:after="25" w:line="230" w:lineRule="auto"/>
+      </w:pPr>
+      <w:r>
+        <w:rPr>
+          <w:sz w:val="18"/>
+          <w:szCs w:val="18"/>
+        </w:rPr>
+        <w:t xml:space="preserve">•   </w:t>
+      </w:r>
+      <w:r>
+        <w:rPr>
+          <w:sz w:val="18"/>
+          <w:szCs w:val="18"/>
+        </w:rPr>
+        <w:t xml:space="preserve">Idempotency + retries: tasks can run twice (crash after work, before ack) - design them re-runnable; autoretry_for with retry_backoff handles flaky externals.</w:t>
+      </w:r>
+    </w:p>
+    <w:p>
+      <w:pPr>
+        <w:ind w:left="260" w:hanging="200"/>
+        <w:spacing w:before="0" w:after="25" w:line="230" w:lineRule="auto"/>
+      </w:pPr>
+      <w:r>
+        <w:rPr>
+          <w:sz w:val="18"/>
+          <w:szCs w:val="18"/>
+        </w:rPr>
+        <w:t xml:space="preserve">•   </w:t>
+      </w:r>
+      <w:r>
+        <w:rPr>
+          <w:sz w:val="18"/>
+          <w:szCs w:val="18"/>
+        </w:rPr>
+        <w:t xml:space="preserve">transaction.on_commit(lambda: task.delay(id)) - otherwise the worker can start before the row is committed and hit DoesNotExist: THE classic Celery bug.</w:t>
+      </w:r>
+    </w:p>
+    <w:p>
+      <w:pPr>
+        <w:ind w:left="260" w:hanging="200"/>
+        <w:spacing w:before="0" w:after="25" w:line="230" w:lineRule="auto"/>
+      </w:pPr>
+      <w:r>
+        <w:rPr>
+          <w:sz w:val="18"/>
+          <w:szCs w:val="18"/>
+        </w:rPr>
+        <w:t xml:space="preserve">•   </w:t>
+      </w:r>
+      <w:r>
+        <w:rPr>
+          <w:sz w:val="18"/>
+          <w:szCs w:val="18"/>
+        </w:rPr>
+        <w:t xml:space="preserve">Operations: workers deploy separately from web, monitored with Flower; queues can be split (fast/slow) with dedicated workers.</w:t>
+      </w:r>
+    </w:p>
+    <w:p>
+      <w:pPr>
+        <w:ind w:left="260" w:hanging="0"/>
+        <w:spacing w:before="0" w:after="15" w:line="230" w:lineRule="auto"/>
+        <w:shd w:val="clear" w:color="auto" w:fill="F2F2F2"/>
+      </w:pPr>
+      <w:r>
+        <w:rPr>
+          <w:b/>
+          <w:sz w:val="17"/>
+          <w:szCs w:val="17"/>
+        </w:rPr>
+        <w:t xml:space="preserve">Example:  </w:t>
+      </w:r>
+      <w:r>
+        <w:rPr>
+          <w:rFonts w:ascii="Consolas" w:hAnsi="Consolas" w:cs="Consolas"/>
+          <w:color w:val="3B3B3B"/>
+          <w:sz w:val="17"/>
+          <w:szCs w:val="17"/>
+        </w:rPr>
+        <w:t xml:space="preserve">@shared_task(autoretry_for=(RequestException,),</w:t>
+      </w:r>
+    </w:p>
+    <w:p>
+      <w:pPr>
+        <w:ind w:left="260" w:hanging="0"/>
+        <w:spacing w:before="0" w:after="15" w:line="230" w:lineRule="auto"/>
+        <w:shd w:val="clear" w:color="auto" w:fill="F2F2F2"/>
+      </w:pPr>
+      <w:r>
+        <w:rPr>
+          <w:rFonts w:ascii="Consolas" w:hAnsi="Consolas" w:cs="Consolas"/>
+          <w:color w:val="3B3B3B"/>
+          <w:sz w:val="17"/>
+          <w:szCs w:val="17"/>
+        </w:rPr>
+        <w:t xml:space="preserve">             retry_backoff=True, max_retries=5)</w:t>
+      </w:r>
+    </w:p>
+    <w:p>
+      <w:pPr>
+        <w:ind w:left="260" w:hanging="0"/>
+        <w:spacing w:before="0" w:after="15" w:line="230" w:lineRule="auto"/>
+        <w:shd w:val="clear" w:color="auto" w:fill="F2F2F2"/>
+      </w:pPr>
+      <w:r>
+        <w:rPr>
+          <w:rFonts w:ascii="Consolas" w:hAnsi="Consolas" w:cs="Consolas"/>
+          <w:color w:val="3B3B3B"/>
+          <w:sz w:val="17"/>
+          <w:szCs w:val="17"/>
+        </w:rPr>
+        <w:t xml:space="preserve">def send_invoice(order_id):</w:t>
+      </w:r>
+    </w:p>
+    <w:p>
+      <w:pPr>
+        <w:ind w:left="260" w:hanging="0"/>
+        <w:spacing w:before="0" w:after="15" w:line="230" w:lineRule="auto"/>
+        <w:shd w:val="clear" w:color="auto" w:fill="F2F2F2"/>
+      </w:pPr>
+      <w:r>
+        <w:rPr>
+          <w:rFonts w:ascii="Consolas" w:hAnsi="Consolas" w:cs="Consolas"/>
+          <w:color w:val="3B3B3B"/>
+          <w:sz w:val="17"/>
+          <w:szCs w:val="17"/>
+        </w:rPr>
+        <w:t xml:space="preserve">    order = Order.objects.get(pk=order_id)</w:t>
+      </w:r>
+    </w:p>
+    <w:p>
+      <w:pPr>
+        <w:ind w:left="260" w:hanging="0"/>
+        <w:spacing w:before="0" w:after="15" w:line="230" w:lineRule="auto"/>
+        <w:shd w:val="clear" w:color="auto" w:fill="F2F2F2"/>
+      </w:pPr>
+      <w:r>
+        <w:rPr>
+          <w:rFonts w:ascii="Consolas" w:hAnsi="Consolas" w:cs="Consolas"/>
+          <w:color w:val="3B3B3B"/>
+          <w:sz w:val="17"/>
+          <w:szCs w:val="17"/>
+        </w:rPr>
+        <w:t xml:space="preserve">    ...</w:t>
+      </w:r>
+    </w:p>
+    <w:p>
+      <w:pPr>
+        <w:ind w:left="260" w:hanging="0"/>
+        <w:spacing w:before="0" w:after="15" w:line="230" w:lineRule="auto"/>
+        <w:shd w:val="clear" w:color="auto" w:fill="F2F2F2"/>
+      </w:pPr>
+      <w:r>
+        <w:rPr>
+          <w:rFonts w:ascii="Consolas" w:hAnsi="Consolas" w:cs="Consolas"/>
+          <w:color w:val="3B3B3B"/>
+          <w:sz w:val="17"/>
+          <w:szCs w:val="17"/>
+        </w:rPr>
+        <w:t xml:space="preserve"># in view, race-safe:</w:t>
+      </w:r>
+    </w:p>
+    <w:p>
+      <w:pPr>
+        <w:ind w:left="260" w:hanging="0"/>
+        <w:spacing w:before="0" w:after="15" w:line="230" w:lineRule="auto"/>
+        <w:shd w:val="clear" w:color="auto" w:fill="F2F2F2"/>
+      </w:pPr>
+      <w:r>
+        <w:rPr>
+          <w:rFonts w:ascii="Consolas" w:hAnsi="Consolas" w:cs="Consolas"/>
+          <w:color w:val="3B3B3B"/>
+          <w:sz w:val="17"/>
+          <w:szCs w:val="17"/>
+        </w:rPr>
+        <w:t xml:space="preserve">transaction.on_commit(</w:t>
+      </w:r>
+    </w:p>
+    <w:p>
+      <w:pPr>
+        <w:ind w:left="260" w:hanging="0"/>
+        <w:spacing w:before="0" w:after="15" w:line="230" w:lineRule="auto"/>
+        <w:shd w:val="clear" w:color="auto" w:fill="F2F2F2"/>
+      </w:pPr>
+      <w:r>
+        <w:rPr>
+          <w:rFonts w:ascii="Consolas" w:hAnsi="Consolas" w:cs="Consolas"/>
+          <w:color w:val="3B3B3B"/>
+          <w:sz w:val="17"/>
+          <w:szCs w:val="17"/>
+        </w:rPr>
+        <w:t xml:space="preserve">    lambda: send_invoice.delay(order.pk))</w:t>
+      </w:r>
+    </w:p>
+    <w:p>
+      <w:pPr>
+        <w:ind w:left="120" w:hanging="0"/>
+        <w:spacing w:before="50" w:after="110" w:line="230" w:lineRule="auto"/>
+        <w:pBdr>
+          <w:left w:val="single" w:sz="12" w:space="4" w:color="2E5E1F"/>
+        </w:pBdr>
+      </w:pPr>
+      <w:r>
+        <w:rPr>
+          <w:b/>
+          <w:color w:val="2E5E1F"/>
+          <w:sz w:val="18"/>
+          <w:szCs w:val="18"/>
+        </w:rPr>
+        <w:t xml:space="preserve">Interview answer:  </w:t>
+      </w:r>
+      <w:r>
+        <w:rPr>
+          <w:i/>
+          <w:sz w:val="18"/>
+          <w:szCs w:val="18"/>
+        </w:rPr>
+        <w:t xml:space="preserve">Celery moves slow work - emails, reports, external APIs - to worker processes fed by a Redis/RabbitMQ broker, keeping requests fast; beat handles scheduling. The experienced details: pass IDs not objects, make tasks idempotent with retry backoff since delivery can duplicate, and enqueue via transaction.on_commit so workers never race an uncommitted row.</w:t>
+      </w:r>
+    </w:p>
+    <w:p>
+      <w:pPr>
+        <w:spacing w:before="140" w:after="40" w:line="230" w:lineRule="auto"/>
+      </w:pPr>
+      <w:r>
+        <w:rPr>
+          <w:b/>
+          <w:sz w:val="21"/>
+          <w:szCs w:val="21"/>
+        </w:rPr>
+        <w:t xml:space="preserve">D5.7  Async Views in Django</w:t>
+      </w:r>
+    </w:p>
+    <w:p>
+      <w:pPr>
+        <w:spacing w:before="0" w:after="40" w:line="230" w:lineRule="auto"/>
+      </w:pPr>
+      <w:r>
+        <w:rPr>
+          <w:b/>
+          <w:sz w:val="18"/>
+          <w:szCs w:val="18"/>
+        </w:rPr>
+        <w:t xml:space="preserve">What it is:  </w:t>
+      </w:r>
+      <w:r>
+        <w:rPr>
+          <w:sz w:val="18"/>
+          <w:szCs w:val="18"/>
+        </w:rPr>
+        <w:t xml:space="preserve">Django supports async def views over ASGI - valuable for I/O-heavy views calling external services, but the ORM story keeps it nuanced.</w:t>
+      </w:r>
+    </w:p>
+    <w:p>
+      <w:pPr>
+        <w:ind w:left="260" w:hanging="200"/>
+        <w:spacing w:before="0" w:after="25" w:line="230" w:lineRule="auto"/>
+      </w:pPr>
+      <w:r>
+        <w:rPr>
+          <w:sz w:val="18"/>
+          <w:szCs w:val="18"/>
+        </w:rPr>
+        <w:t xml:space="preserve">•   </w:t>
+      </w:r>
+      <w:r>
+        <w:rPr>
+          <w:sz w:val="18"/>
+          <w:szCs w:val="18"/>
+        </w:rPr>
+        <w:t xml:space="preserve">async def view + ASGI server (uvicorn/daphne) = the event loop interleaves views during awaits - many concurrent slow-API calls stop eating worker processes.</w:t>
+      </w:r>
+    </w:p>
+    <w:p>
+      <w:pPr>
+        <w:ind w:left="260" w:hanging="200"/>
+        <w:spacing w:before="0" w:after="25" w:line="230" w:lineRule="auto"/>
+      </w:pPr>
+      <w:r>
+        <w:rPr>
+          <w:sz w:val="18"/>
+          <w:szCs w:val="18"/>
+        </w:rPr>
+        <w:t xml:space="preserve">•   </w:t>
+      </w:r>
+      <w:r>
+        <w:rPr>
+          <w:sz w:val="18"/>
+          <w:szCs w:val="18"/>
+        </w:rPr>
+        <w:t xml:space="preserve">Best fit: views that fan out to external HTTP services (httpx), webhooks, streaming - the same asyncio logic as FastAPI.</w:t>
+      </w:r>
+    </w:p>
+    <w:p>
+      <w:pPr>
+        <w:ind w:left="260" w:hanging="200"/>
+        <w:spacing w:before="0" w:after="25" w:line="230" w:lineRule="auto"/>
+      </w:pPr>
+      <w:r>
+        <w:rPr>
+          <w:sz w:val="18"/>
+          <w:szCs w:val="18"/>
+        </w:rPr>
+        <w:t xml:space="preserve">•   </w:t>
+      </w:r>
+      <w:r>
+        <w:rPr>
+          <w:sz w:val="18"/>
+          <w:szCs w:val="18"/>
+        </w:rPr>
+        <w:t xml:space="preserve">ORM nuance: historically sync-only; async ORM interfaces (aget, async iteration) have been arriving version by version, but parts still hop through threads (sync_to_async) - know your version.</w:t>
+      </w:r>
+    </w:p>
+    <w:p>
+      <w:pPr>
+        <w:ind w:left="260" w:hanging="200"/>
+        <w:spacing w:before="0" w:after="25" w:line="230" w:lineRule="auto"/>
+      </w:pPr>
+      <w:r>
+        <w:rPr>
+          <w:sz w:val="18"/>
+          <w:szCs w:val="18"/>
+        </w:rPr>
+        <w:t xml:space="preserve">•   </w:t>
+      </w:r>
+      <w:r>
+        <w:rPr>
+          <w:sz w:val="18"/>
+          <w:szCs w:val="18"/>
+        </w:rPr>
+        <w:t xml:space="preserve">sync_to_async wraps sync code (ORM, libraries) for async views; async_to_sync goes the other way. Mixing without them raises SynchronousOnlyOperation.</w:t>
+      </w:r>
+    </w:p>
+    <w:p>
+      <w:pPr>
+        <w:ind w:left="260" w:hanging="200"/>
+        <w:spacing w:before="0" w:after="25" w:line="230" w:lineRule="auto"/>
+      </w:pPr>
+      <w:r>
+        <w:rPr>
+          <w:sz w:val="18"/>
+          <w:szCs w:val="18"/>
+        </w:rPr>
+        <w:t xml:space="preserve">•   </w:t>
+      </w:r>
+      <w:r>
+        <w:rPr>
+          <w:sz w:val="18"/>
+          <w:szCs w:val="18"/>
+        </w:rPr>
+        <w:t xml:space="preserve">Blocking calls (requests, time.sleep) inside an async view stall the whole event loop - async libraries only.</w:t>
+      </w:r>
+    </w:p>
+    <w:p>
+      <w:pPr>
+        <w:ind w:left="260" w:hanging="200"/>
+        <w:spacing w:before="0" w:after="25" w:line="230" w:lineRule="auto"/>
+      </w:pPr>
+      <w:r>
+        <w:rPr>
+          <w:sz w:val="18"/>
+          <w:szCs w:val="18"/>
+        </w:rPr>
+        <w:t xml:space="preserve">•   </w:t>
+      </w:r>
+      <w:r>
+        <w:rPr>
+          <w:sz w:val="18"/>
+          <w:szCs w:val="18"/>
+        </w:rPr>
+        <w:t xml:space="preserve">Honest guidance: CPU-bound or ORM-heavy views gain nothing - Celery or more workers may be the simpler win; async shines on external-I/O fan-out.</w:t>
+      </w:r>
+    </w:p>
+    <w:p>
+      <w:pPr>
+        <w:ind w:left="260" w:hanging="200"/>
+        <w:spacing w:before="0" w:after="25" w:line="230" w:lineRule="auto"/>
+      </w:pPr>
+      <w:r>
+        <w:rPr>
+          <w:sz w:val="18"/>
+          <w:szCs w:val="18"/>
+        </w:rPr>
+        <w:t xml:space="preserve">•   </w:t>
+      </w:r>
+      <w:r>
+        <w:rPr>
+          <w:sz w:val="18"/>
+          <w:szCs w:val="18"/>
+        </w:rPr>
+        <w:t xml:space="preserve">Channels extends ASGI to websockets - live dashboards, notifications, chat.</w:t>
+      </w:r>
+    </w:p>
+    <w:p>
+      <w:pPr>
+        <w:ind w:left="260" w:hanging="0"/>
+        <w:spacing w:before="0" w:after="15" w:line="230" w:lineRule="auto"/>
+        <w:shd w:val="clear" w:color="auto" w:fill="F2F2F2"/>
+      </w:pPr>
+      <w:r>
+        <w:rPr>
+          <w:b/>
+          <w:sz w:val="17"/>
+          <w:szCs w:val="17"/>
+        </w:rPr>
+        <w:t xml:space="preserve">Example:  </w:t>
+      </w:r>
+      <w:r>
+        <w:rPr>
+          <w:rFonts w:ascii="Consolas" w:hAnsi="Consolas" w:cs="Consolas"/>
+          <w:color w:val="3B3B3B"/>
+          <w:sz w:val="17"/>
+          <w:szCs w:val="17"/>
+        </w:rPr>
+        <w:t xml:space="preserve">import httpx</w:t>
+      </w:r>
+    </w:p>
+    <w:p>
+      <w:pPr>
+        <w:ind w:left="260" w:hanging="0"/>
+        <w:spacing w:before="0" w:after="15" w:line="230" w:lineRule="auto"/>
+        <w:shd w:val="clear" w:color="auto" w:fill="F2F2F2"/>
+      </w:pPr>
+      <w:r>
+        <w:rPr>
+          <w:rFonts w:ascii="Consolas" w:hAnsi="Consolas" w:cs="Consolas"/>
+          <w:color w:val="3B3B3B"/>
+          <w:sz w:val="17"/>
+          <w:szCs w:val="17"/>
+        </w:rPr>
+        <w:t xml:space="preserve">async def prices(request):</w:t>
+      </w:r>
+    </w:p>
+    <w:p>
+      <w:pPr>
+        <w:ind w:left="260" w:hanging="0"/>
+        <w:spacing w:before="0" w:after="15" w:line="230" w:lineRule="auto"/>
+        <w:shd w:val="clear" w:color="auto" w:fill="F2F2F2"/>
+      </w:pPr>
+      <w:r>
+        <w:rPr>
+          <w:rFonts w:ascii="Consolas" w:hAnsi="Consolas" w:cs="Consolas"/>
+          <w:color w:val="3B3B3B"/>
+          <w:sz w:val="17"/>
+          <w:szCs w:val="17"/>
+        </w:rPr>
+        <w:t xml:space="preserve">    async with httpx.AsyncClient() as c:</w:t>
+      </w:r>
+    </w:p>
+    <w:p>
+      <w:pPr>
+        <w:ind w:left="260" w:hanging="0"/>
+        <w:spacing w:before="0" w:after="15" w:line="230" w:lineRule="auto"/>
+        <w:shd w:val="clear" w:color="auto" w:fill="F2F2F2"/>
+      </w:pPr>
+      <w:r>
+        <w:rPr>
+          <w:rFonts w:ascii="Consolas" w:hAnsi="Consolas" w:cs="Consolas"/>
+          <w:color w:val="3B3B3B"/>
+          <w:sz w:val="17"/>
+          <w:szCs w:val="17"/>
+        </w:rPr>
+        <w:t xml:space="preserve">        r1, r2 = await asyncio.gather(</w:t>
+      </w:r>
+    </w:p>
+    <w:p>
+      <w:pPr>
+        <w:ind w:left="260" w:hanging="0"/>
+        <w:spacing w:before="0" w:after="15" w:line="230" w:lineRule="auto"/>
+        <w:shd w:val="clear" w:color="auto" w:fill="F2F2F2"/>
+      </w:pPr>
+      <w:r>
+        <w:rPr>
+          <w:rFonts w:ascii="Consolas" w:hAnsi="Consolas" w:cs="Consolas"/>
+          <w:color w:val="3B3B3B"/>
+          <w:sz w:val="17"/>
+          <w:szCs w:val="17"/>
+        </w:rPr>
+        <w:t xml:space="preserve">            c.get(API_1), c.get(API_2))</w:t>
+      </w:r>
+    </w:p>
+    <w:p>
+      <w:pPr>
+        <w:ind w:left="260" w:hanging="0"/>
+        <w:spacing w:before="0" w:after="15" w:line="230" w:lineRule="auto"/>
+        <w:shd w:val="clear" w:color="auto" w:fill="F2F2F2"/>
+      </w:pPr>
+      <w:r>
+        <w:rPr>
+          <w:rFonts w:ascii="Consolas" w:hAnsi="Consolas" w:cs="Consolas"/>
+          <w:color w:val="3B3B3B"/>
+          <w:sz w:val="17"/>
+          <w:szCs w:val="17"/>
+        </w:rPr>
+        <w:t xml:space="preserve">    return JsonResponse({...})</w:t>
+      </w:r>
+    </w:p>
+    <w:p>
+      <w:pPr>
+        <w:ind w:left="120" w:hanging="0"/>
+        <w:spacing w:before="50" w:after="110" w:line="230" w:lineRule="auto"/>
+        <w:pBdr>
+          <w:left w:val="single" w:sz="12" w:space="4" w:color="2E5E1F"/>
+        </w:pBdr>
+      </w:pPr>
+      <w:r>
+        <w:rPr>
+          <w:b/>
+          <w:color w:val="2E5E1F"/>
+          <w:sz w:val="18"/>
+          <w:szCs w:val="18"/>
+        </w:rPr>
+        <w:t xml:space="preserve">Interview answer:  </w:t>
+      </w:r>
+      <w:r>
+        <w:rPr>
+          <w:i/>
+          <w:sz w:val="18"/>
+          <w:szCs w:val="18"/>
+        </w:rPr>
+        <w:t xml:space="preserve">Django runs async def views on ASGI, interleaving them at await points - a real win for views fanning out to external APIs with httpx, and Channels adds websockets. The caveats: the ORM's async support is still partial so sync_to_async bridges it, blocking calls stall the loop, and ORM/CPU-heavy views gain nothing - there Celery or worker scaling is the honest answer.</w:t>
       </w:r>
     </w:p>
     <w:sectPr>

</xml_diff>